<commit_message>
Reorder eTOM/SID/FF sections, restore per-resource API tables, reformat 2.2/2.4 headers
- Move "eTOM L2 - SID ABEs links" to 2.1 (was 2.3); eTOM business activities and SID ABEs
  shift to 2.2/2.3. Functional Framework Functions stays 2.4.
- 3.2/3.3 API tables: back to one row per resource (comma-joined operations), not one row
  per API-version with <br>-joined resources. Events (3.4) keep the one-row-per-API <br> format.
- 2.4: Aggregate Function Level 1/2 columns moved before Function Description.
- 2.2 (now 2.3) SID ABEs: "SID ABE L1 Definition" moved immediately after "SID ABE L1";
  headers shortened from "Level n" to "L n".

Co-Authored-By: Claude Sonnet 5 <noreply@anthropic.com>
</commit_message>
<xml_diff>
--- a/specifications/TMFC005-ProductInventory/Diagrams/TMFC005_Product_Inventory.docx
+++ b/specifications/TMFC005-ProductInventory/Diagrams/TMFC005_Product_Inventory.docx
@@ -210,566 +210,6 @@
         <w:t>eTOM Processes, SID Data Entities and Functional Framework Functions</w:t>
       </w:r>
     </w:p>
-    <w:p>
-      <w:pPr>
-        <w:pStyle w:val="Heading2"/>
-      </w:pPr>
-      <w:r>
-        <w:t>eTOM business activities</w:t>
-      </w:r>
-    </w:p>
-    <w:p>
-      <w:r>
-        <w:t>eTOM business activities this ODA Component is responsible for:</w:t>
-      </w:r>
-    </w:p>
-    <w:tbl>
-      <w:tblPr>
-        <w:tblStyle w:val="ScrollTableNormal"/>
-        <w:tblW w:type="auto" w:w="0"/>
-        <w:tblLayout w:type="autofit"/>
-        <w:tblLook w:val="04A0" w:firstRow="1" w:lastRow="0" w:firstColumn="0" w:lastColumn="0" w:noHBand="0" w:noVBand="1"/>
-        <w:tblBorders>
-          <w:top w:val="single" w:sz="4" w:space="0" w:color="999999"/>
-          <w:left w:val="single" w:sz="4" w:space="0" w:color="999999"/>
-          <w:bottom w:val="single" w:sz="4" w:space="0" w:color="999999"/>
-          <w:right w:val="single" w:sz="4" w:space="0" w:color="999999"/>
-          <w:insideH w:val="single" w:sz="4" w:space="0" w:color="999999"/>
-          <w:insideV w:val="single" w:sz="4" w:space="0" w:color="999999"/>
-        </w:tblBorders>
-      </w:tblPr>
-      <w:tblGrid>
-        <w:gridCol w:w="2124"/>
-        <w:gridCol w:w="2124"/>
-        <w:gridCol w:w="2124"/>
-        <w:gridCol w:w="2124"/>
-      </w:tblGrid>
-      <w:tr>
-        <w:trPr>
-          <w:tblHeader/>
-        </w:trPr>
-        <w:tc>
-          <w:tcPr>
-            <w:tcW w:type="dxa" w:w="1404"/>
-          </w:tcPr>
-          <w:p>
-            <w:r/>
-            <w:r>
-              <w:rPr>
-                <w:b/>
-              </w:rPr>
-              <w:t>Identifier</w:t>
-            </w:r>
-          </w:p>
-        </w:tc>
-        <w:tc>
-          <w:tcPr>
-            <w:tcW w:type="dxa" w:w="1123"/>
-          </w:tcPr>
-          <w:p>
-            <w:r/>
-            <w:r>
-              <w:rPr>
-                <w:b/>
-              </w:rPr>
-              <w:t>Level</w:t>
-            </w:r>
-          </w:p>
-        </w:tc>
-        <w:tc>
-          <w:tcPr>
-            <w:tcW w:type="dxa" w:w="3463"/>
-          </w:tcPr>
-          <w:p>
-            <w:r/>
-            <w:r>
-              <w:rPr>
-                <w:b/>
-              </w:rPr>
-              <w:t>Business Activity Name</w:t>
-            </w:r>
-          </w:p>
-        </w:tc>
-        <w:tc>
-          <w:tcPr>
-            <w:tcW w:type="dxa" w:w="3370"/>
-          </w:tcPr>
-          <w:p>
-            <w:r/>
-            <w:r>
-              <w:rPr>
-                <w:b/>
-              </w:rPr>
-              <w:t>Description</w:t>
-            </w:r>
-          </w:p>
-        </w:tc>
-      </w:tr>
-      <w:tr>
-        <w:tc>
-          <w:tcPr>
-            <w:tcW w:type="dxa" w:w="1404"/>
-          </w:tcPr>
-          <w:p>
-            <w:r/>
-            <w:r>
-              <w:t>1.2.11</w:t>
-            </w:r>
-          </w:p>
-        </w:tc>
-        <w:tc>
-          <w:tcPr>
-            <w:tcW w:type="dxa" w:w="1123"/>
-          </w:tcPr>
-          <w:p>
-            <w:r/>
-            <w:r>
-              <w:t>L2</w:t>
-            </w:r>
-          </w:p>
-        </w:tc>
-        <w:tc>
-          <w:tcPr>
-            <w:tcW w:type="dxa" w:w="3463"/>
-          </w:tcPr>
-          <w:p>
-            <w:r/>
-            <w:r>
-              <w:t>Product Inventory Management</w:t>
-            </w:r>
-          </w:p>
-        </w:tc>
-        <w:tc>
-          <w:tcPr>
-            <w:tcW w:type="dxa" w:w="3370"/>
-          </w:tcPr>
-          <w:p>
-            <w:r/>
-            <w:r>
-              <w:t>Product Inventory Management is responsible to establish, manage and administer the enterprise's product inventory, as embodied in the Product Inventory repository, and monitor and report on the usage and access to the product inventory.</w:t>
-            </w:r>
-          </w:p>
-        </w:tc>
-      </w:tr>
-      <w:tr>
-        <w:tc>
-          <w:tcPr>
-            <w:tcW w:type="dxa" w:w="1404"/>
-          </w:tcPr>
-          <w:p>
-            <w:r/>
-            <w:r>
-              <w:t>1.1.19</w:t>
-            </w:r>
-          </w:p>
-        </w:tc>
-        <w:tc>
-          <w:tcPr>
-            <w:tcW w:type="dxa" w:w="1123"/>
-          </w:tcPr>
-          <w:p>
-            <w:r/>
-            <w:r>
-              <w:t>L2</w:t>
-            </w:r>
-          </w:p>
-        </w:tc>
-        <w:tc>
-          <w:tcPr>
-            <w:tcW w:type="dxa" w:w="3463"/>
-          </w:tcPr>
-          <w:p>
-            <w:r/>
-            <w:r>
-              <w:t>Loyalty Program Management</w:t>
-            </w:r>
-          </w:p>
-        </w:tc>
-        <w:tc>
-          <w:tcPr>
-            <w:tcW w:type="dxa" w:w="3370"/>
-          </w:tcPr>
-          <w:p>
-            <w:r/>
-            <w:r>
-              <w:t>Define all aspects of a loyalty program, such as requirements and objectives of a loyalty program, determine the benefits to participants. Develop a program, prototype it, test it, rollout/launch it, amend and evaluate it, and terminate it when it is no longer viable for an enterprise.</w:t>
-            </w:r>
-          </w:p>
-        </w:tc>
-      </w:tr>
-      <w:tr>
-        <w:tc>
-          <w:tcPr>
-            <w:tcW w:type="dxa" w:w="1404"/>
-          </w:tcPr>
-          <w:p>
-            <w:r/>
-            <w:r>
-              <w:t>1.1.19.2</w:t>
-            </w:r>
-          </w:p>
-        </w:tc>
-        <w:tc>
-          <w:tcPr>
-            <w:tcW w:type="dxa" w:w="1123"/>
-          </w:tcPr>
-          <w:p>
-            <w:r/>
-            <w:r>
-              <w:t>L3</w:t>
-            </w:r>
-          </w:p>
-        </w:tc>
-        <w:tc>
-          <w:tcPr>
-            <w:tcW w:type="dxa" w:w="3463"/>
-          </w:tcPr>
-          <w:p>
-            <w:r/>
-            <w:r>
-              <w:t>Loyalty Program Operation</w:t>
-            </w:r>
-          </w:p>
-        </w:tc>
-        <w:tc>
-          <w:tcPr>
-            <w:tcW w:type="dxa" w:w="3370"/>
-          </w:tcPr>
-          <w:p>
-            <w:r/>
-            <w:r>
-              <w:t>Manage all operational aspects of running a loyalty program. Enable parties to become a members of a program, earn currency and rewards, and redeem currency. Manage a loyalty program account, leave a program, and provide operational reports.</w:t>
-            </w:r>
-          </w:p>
-        </w:tc>
-      </w:tr>
-      <w:tr>
-        <w:tc>
-          <w:tcPr>
-            <w:tcW w:type="dxa" w:w="1404"/>
-          </w:tcPr>
-          <w:p>
-            <w:r/>
-            <w:r>
-              <w:t>1.1.19.2.5</w:t>
-            </w:r>
-          </w:p>
-        </w:tc>
-        <w:tc>
-          <w:tcPr>
-            <w:tcW w:type="dxa" w:w="1123"/>
-          </w:tcPr>
-          <w:p>
-            <w:r/>
-            <w:r>
-              <w:t>L4</w:t>
-            </w:r>
-          </w:p>
-        </w:tc>
-        <w:tc>
-          <w:tcPr>
-            <w:tcW w:type="dxa" w:w="3463"/>
-          </w:tcPr>
-          <w:p>
-            <w:r/>
-            <w:r>
-              <w:t>Manage Loyalty Program Account</w:t>
-            </w:r>
-          </w:p>
-        </w:tc>
-        <w:tc>
-          <w:tcPr>
-            <w:tcW w:type="dxa" w:w="3370"/>
-          </w:tcPr>
-          <w:p>
-            <w:r/>
-            <w:r>
-              <w:t>Update a loyalty program account and make changes to loyalty program participant information. Expire, reinstate, transfer in/out, adjust, a loyalty participant's account currency. Prepare and send a loyalty program communication to a participant or for internal use by an enterprise.</w:t>
-            </w:r>
-          </w:p>
-        </w:tc>
-      </w:tr>
-      <w:tr>
-        <w:tc>
-          <w:tcPr>
-            <w:tcW w:type="dxa" w:w="1404"/>
-          </w:tcPr>
-          <w:p>
-            <w:r/>
-            <w:r>
-              <w:t>1.1.19.2.7</w:t>
-            </w:r>
-          </w:p>
-        </w:tc>
-        <w:tc>
-          <w:tcPr>
-            <w:tcW w:type="dxa" w:w="1123"/>
-          </w:tcPr>
-          <w:p>
-            <w:r/>
-            <w:r>
-              <w:t>L4</w:t>
-            </w:r>
-          </w:p>
-        </w:tc>
-        <w:tc>
-          <w:tcPr>
-            <w:tcW w:type="dxa" w:w="3463"/>
-          </w:tcPr>
-          <w:p>
-            <w:r/>
-            <w:r>
-              <w:t>Provide Loyalty Program Operation Report</w:t>
-            </w:r>
-          </w:p>
-        </w:tc>
-        <w:tc>
-          <w:tcPr>
-            <w:tcW w:type="dxa" w:w="3370"/>
-          </w:tcPr>
-          <w:p>
-            <w:r/>
-            <w:r>
-              <w:t>Generate a loyalty program operation report, such as various loyalty program status reports, trend analysis, and reports that identify suspected abuse of a loyalty program.</w:t>
-            </w:r>
-          </w:p>
-        </w:tc>
-      </w:tr>
-    </w:tbl>
-    <w:p/>
-    <w:p>
-      <w:pPr>
-        <w:pStyle w:val="Heading2"/>
-      </w:pPr>
-      <w:r>
-        <w:t>SID ABEs</w:t>
-      </w:r>
-    </w:p>
-    <w:p>
-      <w:r>
-        <w:t>SID ABEs this ODA Component is responsible for:</w:t>
-      </w:r>
-    </w:p>
-    <w:tbl>
-      <w:tblPr>
-        <w:tblStyle w:val="ScrollTableNormal"/>
-        <w:tblW w:type="auto" w:w="0"/>
-        <w:tblLayout w:type="autofit"/>
-        <w:tblLook w:val="04A0" w:firstRow="1" w:lastRow="0" w:firstColumn="0" w:lastColumn="0" w:noHBand="0" w:noVBand="1"/>
-        <w:tblBorders>
-          <w:top w:val="single" w:sz="4" w:space="0" w:color="999999"/>
-          <w:left w:val="single" w:sz="4" w:space="0" w:color="999999"/>
-          <w:bottom w:val="single" w:sz="4" w:space="0" w:color="999999"/>
-          <w:right w:val="single" w:sz="4" w:space="0" w:color="999999"/>
-          <w:insideH w:val="single" w:sz="4" w:space="0" w:color="999999"/>
-          <w:insideV w:val="single" w:sz="4" w:space="0" w:color="999999"/>
-        </w:tblBorders>
-      </w:tblPr>
-      <w:tblGrid>
-        <w:gridCol w:w="2124"/>
-        <w:gridCol w:w="2124"/>
-        <w:gridCol w:w="2124"/>
-        <w:gridCol w:w="2124"/>
-      </w:tblGrid>
-      <w:tr>
-        <w:trPr>
-          <w:tblHeader/>
-        </w:trPr>
-        <w:tc>
-          <w:tcPr>
-            <w:tcW w:type="dxa" w:w="2059"/>
-          </w:tcPr>
-          <w:p>
-            <w:r/>
-            <w:r>
-              <w:rPr>
-                <w:b/>
-              </w:rPr>
-              <w:t>SID ABE Level 1</w:t>
-            </w:r>
-          </w:p>
-        </w:tc>
-        <w:tc>
-          <w:tcPr>
-            <w:tcW w:type="dxa" w:w="2153"/>
-          </w:tcPr>
-          <w:p>
-            <w:r/>
-            <w:r>
-              <w:rPr>
-                <w:b/>
-              </w:rPr>
-              <w:t>SID ABE Level 2 (or set of BEs)</w:t>
-            </w:r>
-          </w:p>
-        </w:tc>
-        <w:tc>
-          <w:tcPr>
-            <w:tcW w:type="dxa" w:w="2527"/>
-          </w:tcPr>
-          <w:p>
-            <w:r/>
-            <w:r>
-              <w:rPr>
-                <w:b/>
-              </w:rPr>
-              <w:t>SID ABE L1 Definition</w:t>
-            </w:r>
-          </w:p>
-        </w:tc>
-        <w:tc>
-          <w:tcPr>
-            <w:tcW w:type="dxa" w:w="2621"/>
-          </w:tcPr>
-          <w:p>
-            <w:r/>
-            <w:r>
-              <w:rPr>
-                <w:b/>
-              </w:rPr>
-              <w:t>SID ABE L2 Definition</w:t>
-            </w:r>
-          </w:p>
-        </w:tc>
-      </w:tr>
-      <w:tr>
-        <w:tc>
-          <w:tcPr>
-            <w:tcW w:type="dxa" w:w="2059"/>
-          </w:tcPr>
-          <w:p>
-            <w:r/>
-            <w:r>
-              <w:t>Product and Offering Instance</w:t>
-            </w:r>
-          </w:p>
-        </w:tc>
-        <w:tc>
-          <w:tcPr>
-            <w:tcW w:type="dxa" w:w="2153"/>
-          </w:tcPr>
-          <w:p>
-            <w:r/>
-            <w:r>
-              <w:t>Product</w:t>
-            </w:r>
-          </w:p>
-        </w:tc>
-        <w:tc>
-          <w:tcPr>
-            <w:tcW w:type="dxa" w:w="2527"/>
-          </w:tcPr>
-          <w:p>
-            <w:r/>
-            <w:r>
-              <w:t>Product and ProductOfferingInstance represent, in the product inventory, respectively an instance of a ProductSpecification and ProductOfferindSpecification subscribed or not yet subscribed to by a Customer from the CSP or by the CSP from a BusinessPartner. The Product carries the place where the product is in use, as well as configuration characteristics, such as assigned telephone numbers and internet addresses. The Product and Offering Instance ABE also tracks the links to services and/or resources through which the Product is realized as well as the applied tariff and commitment duration related to the ProductOfferingInstance.</w:t>
-            </w:r>
-          </w:p>
-        </w:tc>
-        <w:tc>
-          <w:tcPr>
-            <w:tcW w:type="dxa" w:w="2621"/>
-          </w:tcPr>
-          <w:p>
-            <w:r/>
-            <w:r>
-              <w:t>Represents an instance in the product inventory of a ProductSpecification subscribed or not yet subscribed by a Customer to the CSP or by the CSP to a BusinessParnter, the place where the product is in use, as well as configuration characteristics, such as assigned telephone numbers and internet addresses. It may come from a CustomerProductOrderItem or a BusinessPartnerOrderItem. At one time, it might be contained in a unique ProductOfferingInstance. The Product ABE also tracks the links to services and/or resources through which the product is realized. The Product ABE also contains detailed concerning Network Products and Usage Volume Products as well as other examples of Products.</w:t>
-            </w:r>
-          </w:p>
-        </w:tc>
-      </w:tr>
-      <w:tr>
-        <w:tc>
-          <w:tcPr>
-            <w:tcW w:type="dxa" w:w="2059"/>
-          </w:tcPr>
-          <w:p>
-            <w:r/>
-            <w:r>
-              <w:t>Product and Offering Instance</w:t>
-            </w:r>
-          </w:p>
-        </w:tc>
-        <w:tc>
-          <w:tcPr>
-            <w:tcW w:type="dxa" w:w="2153"/>
-          </w:tcPr>
-          <w:p>
-            <w:r/>
-            <w:r/>
-          </w:p>
-        </w:tc>
-        <w:tc>
-          <w:tcPr>
-            <w:tcW w:type="dxa" w:w="2527"/>
-          </w:tcPr>
-          <w:p>
-            <w:r/>
-            <w:r>
-              <w:t>Product and ProductOfferingInstance represent, in the product inventory, respectively an instance of a ProductSpecification and ProductOfferindSpecification subscribed or not yet subscribed to by a Customer from the CSP or by the CSP from a BusinessPartner. The Product carries the place where the product is in use, as well as configuration characteristics, such as assigned telephone numbers and internet addresses. The Product and Offering Instance ABE also tracks the links to services and/or resources through which the Product is realized as well as the applied tariff and commitment duration related to the ProductOfferingInstance.</w:t>
-            </w:r>
-          </w:p>
-        </w:tc>
-        <w:tc>
-          <w:tcPr>
-            <w:tcW w:type="dxa" w:w="2621"/>
-          </w:tcPr>
-          <w:p>
-            <w:r/>
-            <w:r>
-              <w:t>*(no description available)*</w:t>
-            </w:r>
-          </w:p>
-        </w:tc>
-      </w:tr>
-      <w:tr>
-        <w:tc>
-          <w:tcPr>
-            <w:tcW w:type="dxa" w:w="2059"/>
-          </w:tcPr>
-          <w:p>
-            <w:r/>
-            <w:r>
-              <w:t>Loyalty</w:t>
-            </w:r>
-          </w:p>
-        </w:tc>
-        <w:tc>
-          <w:tcPr>
-            <w:tcW w:type="dxa" w:w="2153"/>
-          </w:tcPr>
-          <w:p>
-            <w:r/>
-            <w:r>
-              <w:t>Loyalty Program</w:t>
-            </w:r>
-          </w:p>
-        </w:tc>
-        <w:tc>
-          <w:tcPr>
-            <w:tcW w:type="dxa" w:w="2527"/>
-          </w:tcPr>
-          <w:p>
-            <w:r/>
-            <w:r>
-              <w:t>A loyalty program is one of the tools used by the loyalty process to retain customers. The Loyalty ABE contains all entities useful to specify and instantiate loyalty programs. A LoyaltyProgramProdSpec defines the LoyaltyRules that have to be checked in order to identify the actions to apply. Depending on the type of LoyaltyRules a LoyaltyAccount might be needed to collect gains or not. A LoyaltyProgramProduct is a type of ProductComponent and described by a LoyaltyProgramProdSpec.</w:t>
-            </w:r>
-          </w:p>
-        </w:tc>
-        <w:tc>
-          <w:tcPr>
-            <w:tcW w:type="dxa" w:w="2621"/>
-          </w:tcPr>
-          <w:p>
-            <w:r/>
-            <w:r>
-              <w:t>The Loyalty Program ABE contains all entities needed to instantiate a loyalty program for a specific customer such as LoyaltyProgram and LoyaltyAccount.</w:t>
-            </w:r>
-          </w:p>
-        </w:tc>
-      </w:tr>
-    </w:tbl>
-    <w:p/>
     <w:p>
       <w:pPr>
         <w:pStyle w:val="Heading2"/>
@@ -827,6 +267,566 @@
         <w:pStyle w:val="Heading2"/>
       </w:pPr>
       <w:r>
+        <w:t>eTOM business activities</w:t>
+      </w:r>
+    </w:p>
+    <w:p>
+      <w:r>
+        <w:t>eTOM business activities this ODA Component is responsible for:</w:t>
+      </w:r>
+    </w:p>
+    <w:tbl>
+      <w:tblPr>
+        <w:tblStyle w:val="ScrollTableNormal"/>
+        <w:tblW w:type="auto" w:w="0"/>
+        <w:tblLayout w:type="autofit"/>
+        <w:tblLook w:val="04A0" w:firstRow="1" w:lastRow="0" w:firstColumn="0" w:lastColumn="0" w:noHBand="0" w:noVBand="1"/>
+        <w:tblBorders>
+          <w:top w:val="single" w:sz="4" w:space="0" w:color="999999"/>
+          <w:left w:val="single" w:sz="4" w:space="0" w:color="999999"/>
+          <w:bottom w:val="single" w:sz="4" w:space="0" w:color="999999"/>
+          <w:right w:val="single" w:sz="4" w:space="0" w:color="999999"/>
+          <w:insideH w:val="single" w:sz="4" w:space="0" w:color="999999"/>
+          <w:insideV w:val="single" w:sz="4" w:space="0" w:color="999999"/>
+        </w:tblBorders>
+      </w:tblPr>
+      <w:tblGrid>
+        <w:gridCol w:w="2124"/>
+        <w:gridCol w:w="2124"/>
+        <w:gridCol w:w="2124"/>
+        <w:gridCol w:w="2124"/>
+      </w:tblGrid>
+      <w:tr>
+        <w:trPr>
+          <w:tblHeader/>
+        </w:trPr>
+        <w:tc>
+          <w:tcPr>
+            <w:tcW w:type="dxa" w:w="1404"/>
+          </w:tcPr>
+          <w:p>
+            <w:r/>
+            <w:r>
+              <w:rPr>
+                <w:b/>
+              </w:rPr>
+              <w:t>Identifier</w:t>
+            </w:r>
+          </w:p>
+        </w:tc>
+        <w:tc>
+          <w:tcPr>
+            <w:tcW w:type="dxa" w:w="1123"/>
+          </w:tcPr>
+          <w:p>
+            <w:r/>
+            <w:r>
+              <w:rPr>
+                <w:b/>
+              </w:rPr>
+              <w:t>Level</w:t>
+            </w:r>
+          </w:p>
+        </w:tc>
+        <w:tc>
+          <w:tcPr>
+            <w:tcW w:type="dxa" w:w="3463"/>
+          </w:tcPr>
+          <w:p>
+            <w:r/>
+            <w:r>
+              <w:rPr>
+                <w:b/>
+              </w:rPr>
+              <w:t>Business Activity Name</w:t>
+            </w:r>
+          </w:p>
+        </w:tc>
+        <w:tc>
+          <w:tcPr>
+            <w:tcW w:type="dxa" w:w="3370"/>
+          </w:tcPr>
+          <w:p>
+            <w:r/>
+            <w:r>
+              <w:rPr>
+                <w:b/>
+              </w:rPr>
+              <w:t>Description</w:t>
+            </w:r>
+          </w:p>
+        </w:tc>
+      </w:tr>
+      <w:tr>
+        <w:tc>
+          <w:tcPr>
+            <w:tcW w:type="dxa" w:w="1404"/>
+          </w:tcPr>
+          <w:p>
+            <w:r/>
+            <w:r>
+              <w:t>1.2.11</w:t>
+            </w:r>
+          </w:p>
+        </w:tc>
+        <w:tc>
+          <w:tcPr>
+            <w:tcW w:type="dxa" w:w="1123"/>
+          </w:tcPr>
+          <w:p>
+            <w:r/>
+            <w:r>
+              <w:t>L2</w:t>
+            </w:r>
+          </w:p>
+        </w:tc>
+        <w:tc>
+          <w:tcPr>
+            <w:tcW w:type="dxa" w:w="3463"/>
+          </w:tcPr>
+          <w:p>
+            <w:r/>
+            <w:r>
+              <w:t>Product Inventory Management</w:t>
+            </w:r>
+          </w:p>
+        </w:tc>
+        <w:tc>
+          <w:tcPr>
+            <w:tcW w:type="dxa" w:w="3370"/>
+          </w:tcPr>
+          <w:p>
+            <w:r/>
+            <w:r>
+              <w:t>Product Inventory Management is responsible to establish, manage and administer the enterprise's product inventory, as embodied in the Product Inventory repository, and monitor and report on the usage and access to the product inventory.</w:t>
+            </w:r>
+          </w:p>
+        </w:tc>
+      </w:tr>
+      <w:tr>
+        <w:tc>
+          <w:tcPr>
+            <w:tcW w:type="dxa" w:w="1404"/>
+          </w:tcPr>
+          <w:p>
+            <w:r/>
+            <w:r>
+              <w:t>1.1.19</w:t>
+            </w:r>
+          </w:p>
+        </w:tc>
+        <w:tc>
+          <w:tcPr>
+            <w:tcW w:type="dxa" w:w="1123"/>
+          </w:tcPr>
+          <w:p>
+            <w:r/>
+            <w:r>
+              <w:t>L2</w:t>
+            </w:r>
+          </w:p>
+        </w:tc>
+        <w:tc>
+          <w:tcPr>
+            <w:tcW w:type="dxa" w:w="3463"/>
+          </w:tcPr>
+          <w:p>
+            <w:r/>
+            <w:r>
+              <w:t>Loyalty Program Management</w:t>
+            </w:r>
+          </w:p>
+        </w:tc>
+        <w:tc>
+          <w:tcPr>
+            <w:tcW w:type="dxa" w:w="3370"/>
+          </w:tcPr>
+          <w:p>
+            <w:r/>
+            <w:r>
+              <w:t>Define all aspects of a loyalty program, such as requirements and objectives of a loyalty program, determine the benefits to participants. Develop a program, prototype it, test it, rollout/launch it, amend and evaluate it, and terminate it when it is no longer viable for an enterprise.</w:t>
+            </w:r>
+          </w:p>
+        </w:tc>
+      </w:tr>
+      <w:tr>
+        <w:tc>
+          <w:tcPr>
+            <w:tcW w:type="dxa" w:w="1404"/>
+          </w:tcPr>
+          <w:p>
+            <w:r/>
+            <w:r>
+              <w:t>1.1.19.2</w:t>
+            </w:r>
+          </w:p>
+        </w:tc>
+        <w:tc>
+          <w:tcPr>
+            <w:tcW w:type="dxa" w:w="1123"/>
+          </w:tcPr>
+          <w:p>
+            <w:r/>
+            <w:r>
+              <w:t>L3</w:t>
+            </w:r>
+          </w:p>
+        </w:tc>
+        <w:tc>
+          <w:tcPr>
+            <w:tcW w:type="dxa" w:w="3463"/>
+          </w:tcPr>
+          <w:p>
+            <w:r/>
+            <w:r>
+              <w:t>Loyalty Program Operation</w:t>
+            </w:r>
+          </w:p>
+        </w:tc>
+        <w:tc>
+          <w:tcPr>
+            <w:tcW w:type="dxa" w:w="3370"/>
+          </w:tcPr>
+          <w:p>
+            <w:r/>
+            <w:r>
+              <w:t>Manage all operational aspects of running a loyalty program. Enable parties to become a members of a program, earn currency and rewards, and redeem currency. Manage a loyalty program account, leave a program, and provide operational reports.</w:t>
+            </w:r>
+          </w:p>
+        </w:tc>
+      </w:tr>
+      <w:tr>
+        <w:tc>
+          <w:tcPr>
+            <w:tcW w:type="dxa" w:w="1404"/>
+          </w:tcPr>
+          <w:p>
+            <w:r/>
+            <w:r>
+              <w:t>1.1.19.2.5</w:t>
+            </w:r>
+          </w:p>
+        </w:tc>
+        <w:tc>
+          <w:tcPr>
+            <w:tcW w:type="dxa" w:w="1123"/>
+          </w:tcPr>
+          <w:p>
+            <w:r/>
+            <w:r>
+              <w:t>L4</w:t>
+            </w:r>
+          </w:p>
+        </w:tc>
+        <w:tc>
+          <w:tcPr>
+            <w:tcW w:type="dxa" w:w="3463"/>
+          </w:tcPr>
+          <w:p>
+            <w:r/>
+            <w:r>
+              <w:t>Manage Loyalty Program Account</w:t>
+            </w:r>
+          </w:p>
+        </w:tc>
+        <w:tc>
+          <w:tcPr>
+            <w:tcW w:type="dxa" w:w="3370"/>
+          </w:tcPr>
+          <w:p>
+            <w:r/>
+            <w:r>
+              <w:t>Update a loyalty program account and make changes to loyalty program participant information. Expire, reinstate, transfer in/out, adjust, a loyalty participant's account currency. Prepare and send a loyalty program communication to a participant or for internal use by an enterprise.</w:t>
+            </w:r>
+          </w:p>
+        </w:tc>
+      </w:tr>
+      <w:tr>
+        <w:tc>
+          <w:tcPr>
+            <w:tcW w:type="dxa" w:w="1404"/>
+          </w:tcPr>
+          <w:p>
+            <w:r/>
+            <w:r>
+              <w:t>1.1.19.2.7</w:t>
+            </w:r>
+          </w:p>
+        </w:tc>
+        <w:tc>
+          <w:tcPr>
+            <w:tcW w:type="dxa" w:w="1123"/>
+          </w:tcPr>
+          <w:p>
+            <w:r/>
+            <w:r>
+              <w:t>L4</w:t>
+            </w:r>
+          </w:p>
+        </w:tc>
+        <w:tc>
+          <w:tcPr>
+            <w:tcW w:type="dxa" w:w="3463"/>
+          </w:tcPr>
+          <w:p>
+            <w:r/>
+            <w:r>
+              <w:t>Provide Loyalty Program Operation Report</w:t>
+            </w:r>
+          </w:p>
+        </w:tc>
+        <w:tc>
+          <w:tcPr>
+            <w:tcW w:type="dxa" w:w="3370"/>
+          </w:tcPr>
+          <w:p>
+            <w:r/>
+            <w:r>
+              <w:t>Generate a loyalty program operation report, such as various loyalty program status reports, trend analysis, and reports that identify suspected abuse of a loyalty program.</w:t>
+            </w:r>
+          </w:p>
+        </w:tc>
+      </w:tr>
+    </w:tbl>
+    <w:p/>
+    <w:p>
+      <w:pPr>
+        <w:pStyle w:val="Heading2"/>
+      </w:pPr>
+      <w:r>
+        <w:t>SID ABEs</w:t>
+      </w:r>
+    </w:p>
+    <w:p>
+      <w:r>
+        <w:t>SID ABEs this ODA Component is responsible for:</w:t>
+      </w:r>
+    </w:p>
+    <w:tbl>
+      <w:tblPr>
+        <w:tblStyle w:val="ScrollTableNormal"/>
+        <w:tblW w:type="auto" w:w="0"/>
+        <w:tblLayout w:type="autofit"/>
+        <w:tblLook w:val="04A0" w:firstRow="1" w:lastRow="0" w:firstColumn="0" w:lastColumn="0" w:noHBand="0" w:noVBand="1"/>
+        <w:tblBorders>
+          <w:top w:val="single" w:sz="4" w:space="0" w:color="999999"/>
+          <w:left w:val="single" w:sz="4" w:space="0" w:color="999999"/>
+          <w:bottom w:val="single" w:sz="4" w:space="0" w:color="999999"/>
+          <w:right w:val="single" w:sz="4" w:space="0" w:color="999999"/>
+          <w:insideH w:val="single" w:sz="4" w:space="0" w:color="999999"/>
+          <w:insideV w:val="single" w:sz="4" w:space="0" w:color="999999"/>
+        </w:tblBorders>
+      </w:tblPr>
+      <w:tblGrid>
+        <w:gridCol w:w="2124"/>
+        <w:gridCol w:w="2124"/>
+        <w:gridCol w:w="2124"/>
+        <w:gridCol w:w="2124"/>
+      </w:tblGrid>
+      <w:tr>
+        <w:trPr>
+          <w:tblHeader/>
+        </w:trPr>
+        <w:tc>
+          <w:tcPr>
+            <w:tcW w:type="dxa" w:w="2153"/>
+          </w:tcPr>
+          <w:p>
+            <w:r/>
+            <w:r>
+              <w:rPr>
+                <w:b/>
+              </w:rPr>
+              <w:t>SID ABE L1</w:t>
+            </w:r>
+          </w:p>
+        </w:tc>
+        <w:tc>
+          <w:tcPr>
+            <w:tcW w:type="dxa" w:w="2621"/>
+          </w:tcPr>
+          <w:p>
+            <w:r/>
+            <w:r>
+              <w:rPr>
+                <w:b/>
+              </w:rPr>
+              <w:t>SID ABE L1 Definition</w:t>
+            </w:r>
+          </w:p>
+        </w:tc>
+        <w:tc>
+          <w:tcPr>
+            <w:tcW w:type="dxa" w:w="1966"/>
+          </w:tcPr>
+          <w:p>
+            <w:r/>
+            <w:r>
+              <w:rPr>
+                <w:b/>
+              </w:rPr>
+              <w:t>SID ABE L2 (or set of BEs)</w:t>
+            </w:r>
+          </w:p>
+        </w:tc>
+        <w:tc>
+          <w:tcPr>
+            <w:tcW w:type="dxa" w:w="2621"/>
+          </w:tcPr>
+          <w:p>
+            <w:r/>
+            <w:r>
+              <w:rPr>
+                <w:b/>
+              </w:rPr>
+              <w:t>SID ABE L2 Definition</w:t>
+            </w:r>
+          </w:p>
+        </w:tc>
+      </w:tr>
+      <w:tr>
+        <w:tc>
+          <w:tcPr>
+            <w:tcW w:type="dxa" w:w="2153"/>
+          </w:tcPr>
+          <w:p>
+            <w:r/>
+            <w:r>
+              <w:t>Product and Offering Instance</w:t>
+            </w:r>
+          </w:p>
+        </w:tc>
+        <w:tc>
+          <w:tcPr>
+            <w:tcW w:type="dxa" w:w="2621"/>
+          </w:tcPr>
+          <w:p>
+            <w:r/>
+            <w:r>
+              <w:t>Product and ProductOfferingInstance represent, in the product inventory, respectively an instance of a ProductSpecification and ProductOfferindSpecification subscribed or not yet subscribed to by a Customer from the CSP or by the CSP from a BusinessPartner. The Product carries the place where the product is in use, as well as configuration characteristics, such as assigned telephone numbers and internet addresses. The Product and Offering Instance ABE also tracks the links to services and/or resources through which the Product is realized as well as the applied tariff and commitment duration related to the ProductOfferingInstance.</w:t>
+            </w:r>
+          </w:p>
+        </w:tc>
+        <w:tc>
+          <w:tcPr>
+            <w:tcW w:type="dxa" w:w="1966"/>
+          </w:tcPr>
+          <w:p>
+            <w:r/>
+            <w:r>
+              <w:t>Product</w:t>
+            </w:r>
+          </w:p>
+        </w:tc>
+        <w:tc>
+          <w:tcPr>
+            <w:tcW w:type="dxa" w:w="2621"/>
+          </w:tcPr>
+          <w:p>
+            <w:r/>
+            <w:r>
+              <w:t>Represents an instance in the product inventory of a ProductSpecification subscribed or not yet subscribed by a Customer to the CSP or by the CSP to a BusinessParnter, the place where the product is in use, as well as configuration characteristics, such as assigned telephone numbers and internet addresses. It may come from a CustomerProductOrderItem or a BusinessPartnerOrderItem. At one time, it might be contained in a unique ProductOfferingInstance. The Product ABE also tracks the links to services and/or resources through which the product is realized. The Product ABE also contains detailed concerning Network Products and Usage Volume Products as well as other examples of Products.</w:t>
+            </w:r>
+          </w:p>
+        </w:tc>
+      </w:tr>
+      <w:tr>
+        <w:tc>
+          <w:tcPr>
+            <w:tcW w:type="dxa" w:w="2153"/>
+          </w:tcPr>
+          <w:p>
+            <w:r/>
+            <w:r>
+              <w:t>Product and Offering Instance</w:t>
+            </w:r>
+          </w:p>
+        </w:tc>
+        <w:tc>
+          <w:tcPr>
+            <w:tcW w:type="dxa" w:w="2621"/>
+          </w:tcPr>
+          <w:p>
+            <w:r/>
+            <w:r>
+              <w:t>Product and ProductOfferingInstance represent, in the product inventory, respectively an instance of a ProductSpecification and ProductOfferindSpecification subscribed or not yet subscribed to by a Customer from the CSP or by the CSP from a BusinessPartner. The Product carries the place where the product is in use, as well as configuration characteristics, such as assigned telephone numbers and internet addresses. The Product and Offering Instance ABE also tracks the links to services and/or resources through which the Product is realized as well as the applied tariff and commitment duration related to the ProductOfferingInstance.</w:t>
+            </w:r>
+          </w:p>
+        </w:tc>
+        <w:tc>
+          <w:tcPr>
+            <w:tcW w:type="dxa" w:w="1966"/>
+          </w:tcPr>
+          <w:p>
+            <w:r/>
+            <w:r/>
+          </w:p>
+        </w:tc>
+        <w:tc>
+          <w:tcPr>
+            <w:tcW w:type="dxa" w:w="2621"/>
+          </w:tcPr>
+          <w:p>
+            <w:r/>
+            <w:r>
+              <w:t>*(no description available)*</w:t>
+            </w:r>
+          </w:p>
+        </w:tc>
+      </w:tr>
+      <w:tr>
+        <w:tc>
+          <w:tcPr>
+            <w:tcW w:type="dxa" w:w="2153"/>
+          </w:tcPr>
+          <w:p>
+            <w:r/>
+            <w:r>
+              <w:t>Loyalty</w:t>
+            </w:r>
+          </w:p>
+        </w:tc>
+        <w:tc>
+          <w:tcPr>
+            <w:tcW w:type="dxa" w:w="2621"/>
+          </w:tcPr>
+          <w:p>
+            <w:r/>
+            <w:r>
+              <w:t>A loyalty program is one of the tools used by the loyalty process to retain customers. The Loyalty ABE contains all entities useful to specify and instantiate loyalty programs. A LoyaltyProgramProdSpec defines the LoyaltyRules that have to be checked in order to identify the actions to apply. Depending on the type of LoyaltyRules a LoyaltyAccount might be needed to collect gains or not. A LoyaltyProgramProduct is a type of ProductComponent and described by a LoyaltyProgramProdSpec.</w:t>
+            </w:r>
+          </w:p>
+        </w:tc>
+        <w:tc>
+          <w:tcPr>
+            <w:tcW w:type="dxa" w:w="1966"/>
+          </w:tcPr>
+          <w:p>
+            <w:r/>
+            <w:r>
+              <w:t>Loyalty Program</w:t>
+            </w:r>
+          </w:p>
+        </w:tc>
+        <w:tc>
+          <w:tcPr>
+            <w:tcW w:type="dxa" w:w="2621"/>
+          </w:tcPr>
+          <w:p>
+            <w:r/>
+            <w:r>
+              <w:t>The Loyalty Program ABE contains all entities needed to instantiate a loyalty program for a specific customer such as LoyaltyProgram and LoyaltyAccount.</w:t>
+            </w:r>
+          </w:p>
+        </w:tc>
+      </w:tr>
+    </w:tbl>
+    <w:p/>
+    <w:p>
+      <w:pPr>
+        <w:pStyle w:val="Heading2"/>
+      </w:pPr>
+      <w:r>
         <w:t>Functional Framework Functions</w:t>
       </w:r>
     </w:p>
@@ -886,7 +886,35 @@
         </w:tc>
         <w:tc>
           <w:tcPr>
-            <w:tcW w:type="dxa" w:w="2246"/>
+            <w:tcW w:type="dxa" w:w="1778"/>
+          </w:tcPr>
+          <w:p>
+            <w:r/>
+            <w:r>
+              <w:rPr>
+                <w:b/>
+              </w:rPr>
+              <w:t>Aggregate Function Level 1</w:t>
+            </w:r>
+          </w:p>
+        </w:tc>
+        <w:tc>
+          <w:tcPr>
+            <w:tcW w:type="dxa" w:w="1872"/>
+          </w:tcPr>
+          <w:p>
+            <w:r/>
+            <w:r>
+              <w:rPr>
+                <w:b/>
+              </w:rPr>
+              <w:t>Aggregate Function Level 2</w:t>
+            </w:r>
+          </w:p>
+        </w:tc>
+        <w:tc>
+          <w:tcPr>
+            <w:tcW w:type="dxa" w:w="2340"/>
           </w:tcPr>
           <w:p>
             <w:r/>
@@ -898,34 +926,6 @@
             </w:r>
           </w:p>
         </w:tc>
-        <w:tc>
-          <w:tcPr>
-            <w:tcW w:type="dxa" w:w="1778"/>
-          </w:tcPr>
-          <w:p>
-            <w:r/>
-            <w:r>
-              <w:rPr>
-                <w:b/>
-              </w:rPr>
-              <w:t>Aggregate Function Level 1</w:t>
-            </w:r>
-          </w:p>
-        </w:tc>
-        <w:tc>
-          <w:tcPr>
-            <w:tcW w:type="dxa" w:w="1966"/>
-          </w:tcPr>
-          <w:p>
-            <w:r/>
-            <w:r>
-              <w:rPr>
-                <w:b/>
-              </w:rPr>
-              <w:t>Aggregate Function Level 2</w:t>
-            </w:r>
-          </w:p>
-        </w:tc>
       </w:tr>
       <w:tr>
         <w:tc>
@@ -952,34 +952,34 @@
         </w:tc>
         <w:tc>
           <w:tcPr>
-            <w:tcW w:type="dxa" w:w="2246"/>
+            <w:tcW w:type="dxa" w:w="1778"/>
+          </w:tcPr>
+          <w:p>
+            <w:r/>
+            <w:r>
+              <w:t>Product Management</w:t>
+            </w:r>
+          </w:p>
+        </w:tc>
+        <w:tc>
+          <w:tcPr>
+            <w:tcW w:type="dxa" w:w="1872"/>
+          </w:tcPr>
+          <w:p>
+            <w:r/>
+            <w:r>
+              <w:t>Product Repository Management</w:t>
+            </w:r>
+          </w:p>
+        </w:tc>
+        <w:tc>
+          <w:tcPr>
+            <w:tcW w:type="dxa" w:w="2340"/>
           </w:tcPr>
           <w:p>
             <w:r/>
             <w:r>
               <w:t>Assigned Products Maintenance permits defining and update: / - product characteristics / - links with the related service or resource (handsets, SIM cards, ...) needed to deliver the product, ...</w:t>
-            </w:r>
-          </w:p>
-        </w:tc>
-        <w:tc>
-          <w:tcPr>
-            <w:tcW w:type="dxa" w:w="1778"/>
-          </w:tcPr>
-          <w:p>
-            <w:r/>
-            <w:r>
-              <w:t>Product Management</w:t>
-            </w:r>
-          </w:p>
-        </w:tc>
-        <w:tc>
-          <w:tcPr>
-            <w:tcW w:type="dxa" w:w="1966"/>
-          </w:tcPr>
-          <w:p>
-            <w:r/>
-            <w:r>
-              <w:t>Product Repository Management</w:t>
             </w:r>
           </w:p>
         </w:tc>
@@ -1009,34 +1009,34 @@
         </w:tc>
         <w:tc>
           <w:tcPr>
-            <w:tcW w:type="dxa" w:w="2246"/>
+            <w:tcW w:type="dxa" w:w="1778"/>
+          </w:tcPr>
+          <w:p>
+            <w:r/>
+            <w:r>
+              <w:t>Product Management</w:t>
+            </w:r>
+          </w:p>
+        </w:tc>
+        <w:tc>
+          <w:tcPr>
+            <w:tcW w:type="dxa" w:w="1872"/>
+          </w:tcPr>
+          <w:p>
+            <w:r/>
+            <w:r>
+              <w:t>Product Repository Management</w:t>
+            </w:r>
+          </w:p>
+        </w:tc>
+        <w:tc>
+          <w:tcPr>
+            <w:tcW w:type="dxa" w:w="2340"/>
           </w:tcPr>
           <w:p>
             <w:r/>
             <w:r>
               <w:t>Product Storage provides the functionality necessary to store and make available the Products. / This function allows: / • to instantiate or update offers and products ordered by the customer, whatever their type (network product, bundle, device, …) or their marketing mode (rented, sold, …), with their configuration, their tariffs and discounts, and their status (initialized with a creation order) / • to update Products status / • to search and read Offer and Product installed base (subscribed offers, configuration of installed products, installed tariffs and discount, statuses, …).</w:t>
-            </w:r>
-          </w:p>
-        </w:tc>
-        <w:tc>
-          <w:tcPr>
-            <w:tcW w:type="dxa" w:w="1778"/>
-          </w:tcPr>
-          <w:p>
-            <w:r/>
-            <w:r>
-              <w:t>Product Management</w:t>
-            </w:r>
-          </w:p>
-        </w:tc>
-        <w:tc>
-          <w:tcPr>
-            <w:tcW w:type="dxa" w:w="1966"/>
-          </w:tcPr>
-          <w:p>
-            <w:r/>
-            <w:r>
-              <w:t>Product Repository Management</w:t>
             </w:r>
           </w:p>
         </w:tc>
@@ -1066,34 +1066,34 @@
         </w:tc>
         <w:tc>
           <w:tcPr>
-            <w:tcW w:type="dxa" w:w="2246"/>
+            <w:tcW w:type="dxa" w:w="1778"/>
+          </w:tcPr>
+          <w:p>
+            <w:r/>
+            <w:r>
+              <w:t>Product Management</w:t>
+            </w:r>
+          </w:p>
+        </w:tc>
+        <w:tc>
+          <w:tcPr>
+            <w:tcW w:type="dxa" w:w="1872"/>
+          </w:tcPr>
+          <w:p>
+            <w:r/>
+            <w:r>
+              <w:t>Loyalty Account Management</w:t>
+            </w:r>
+          </w:p>
+        </w:tc>
+        <w:tc>
+          <w:tcPr>
+            <w:tcW w:type="dxa" w:w="2340"/>
           </w:tcPr>
           <w:p>
             <w:r/>
             <w:r>
               <w:t>Customer Loyalty Score Balance Management function calculates the score according to accumulation/decrease rules. When a customer subscribes to the loyalty program with more than one SIM or other ‘traffic objects’, the Score Management accumulates the points into a single balance. The loyalty score could decrease for one of the following events: prize purchase, points expiry or points deletion by Call Centre. The functionality may also include the visualization of Score details (date, description event type, points, final score) via different contact Channels (e.g. via Web, IVR, Call Centre).</w:t>
-            </w:r>
-          </w:p>
-        </w:tc>
-        <w:tc>
-          <w:tcPr>
-            <w:tcW w:type="dxa" w:w="1778"/>
-          </w:tcPr>
-          <w:p>
-            <w:r/>
-            <w:r>
-              <w:t>Product Management</w:t>
-            </w:r>
-          </w:p>
-        </w:tc>
-        <w:tc>
-          <w:tcPr>
-            <w:tcW w:type="dxa" w:w="1966"/>
-          </w:tcPr>
-          <w:p>
-            <w:r/>
-            <w:r>
-              <w:t>Loyalty Account Management</w:t>
             </w:r>
           </w:p>
         </w:tc>
@@ -1123,34 +1123,34 @@
         </w:tc>
         <w:tc>
           <w:tcPr>
-            <w:tcW w:type="dxa" w:w="2246"/>
+            <w:tcW w:type="dxa" w:w="1778"/>
+          </w:tcPr>
+          <w:p>
+            <w:r/>
+            <w:r>
+              <w:t>Product Management</w:t>
+            </w:r>
+          </w:p>
+        </w:tc>
+        <w:tc>
+          <w:tcPr>
+            <w:tcW w:type="dxa" w:w="1872"/>
+          </w:tcPr>
+          <w:p>
+            <w:r/>
+            <w:r>
+              <w:t>Loyalty Account Management</w:t>
+            </w:r>
+          </w:p>
+        </w:tc>
+        <w:tc>
+          <w:tcPr>
+            <w:tcW w:type="dxa" w:w="2340"/>
           </w:tcPr>
           <w:p>
             <w:r/>
             <w:r>
               <w:t>Customer Loyalty Communication function sends information related to Loyalty Programs (Point Balance, Prize Request status, renewed Loyalty Code) to external components in push and pull modes.</w:t>
-            </w:r>
-          </w:p>
-        </w:tc>
-        <w:tc>
-          <w:tcPr>
-            <w:tcW w:type="dxa" w:w="1778"/>
-          </w:tcPr>
-          <w:p>
-            <w:r/>
-            <w:r>
-              <w:t>Product Management</w:t>
-            </w:r>
-          </w:p>
-        </w:tc>
-        <w:tc>
-          <w:tcPr>
-            <w:tcW w:type="dxa" w:w="1966"/>
-          </w:tcPr>
-          <w:p>
-            <w:r/>
-            <w:r>
-              <w:t>Loyalty Account Management</w:t>
             </w:r>
           </w:p>
         </w:tc>
@@ -1180,34 +1180,34 @@
         </w:tc>
         <w:tc>
           <w:tcPr>
-            <w:tcW w:type="dxa" w:w="2246"/>
+            <w:tcW w:type="dxa" w:w="1778"/>
+          </w:tcPr>
+          <w:p>
+            <w:r/>
+            <w:r>
+              <w:t>Product Management</w:t>
+            </w:r>
+          </w:p>
+        </w:tc>
+        <w:tc>
+          <w:tcPr>
+            <w:tcW w:type="dxa" w:w="1872"/>
+          </w:tcPr>
+          <w:p>
+            <w:r/>
+            <w:r>
+              <w:t>Product Agreement Management</w:t>
+            </w:r>
+          </w:p>
+        </w:tc>
+        <w:tc>
+          <w:tcPr>
+            <w:tcW w:type="dxa" w:w="2340"/>
           </w:tcPr>
           <w:p>
             <w:r/>
             <w:r>
               <w:t>Product Agreement Implementation function provides functionality pertaining to the implementation of the Product Agreement (a.k.a. contract) across fulfillment, assurance, and billing according to Product Agreement Specification. / A Product Agreement represents the approval by the Customer and the Vendor of all term or conditions of a ProductOffering.</w:t>
-            </w:r>
-          </w:p>
-        </w:tc>
-        <w:tc>
-          <w:tcPr>
-            <w:tcW w:type="dxa" w:w="1778"/>
-          </w:tcPr>
-          <w:p>
-            <w:r/>
-            <w:r>
-              <w:t>Product Management</w:t>
-            </w:r>
-          </w:p>
-        </w:tc>
-        <w:tc>
-          <w:tcPr>
-            <w:tcW w:type="dxa" w:w="1966"/>
-          </w:tcPr>
-          <w:p>
-            <w:r/>
-            <w:r>
-              <w:t>Product Agreement Management</w:t>
             </w:r>
           </w:p>
         </w:tc>
@@ -1237,34 +1237,34 @@
         </w:tc>
         <w:tc>
           <w:tcPr>
-            <w:tcW w:type="dxa" w:w="2246"/>
+            <w:tcW w:type="dxa" w:w="1778"/>
+          </w:tcPr>
+          <w:p>
+            <w:r/>
+            <w:r>
+              <w:t>*(no description available)*</w:t>
+            </w:r>
+          </w:p>
+        </w:tc>
+        <w:tc>
+          <w:tcPr>
+            <w:tcW w:type="dxa" w:w="1872"/>
+          </w:tcPr>
+          <w:p>
+            <w:r/>
+            <w:r>
+              <w:t>*(no description available)*</w:t>
+            </w:r>
+          </w:p>
+        </w:tc>
+        <w:tc>
+          <w:tcPr>
+            <w:tcW w:type="dxa" w:w="2340"/>
           </w:tcPr>
           <w:p>
             <w:r/>
             <w:r>
               <w:t>*(no description available in the source document or the Functional Framework spreadsheets)*</w:t>
-            </w:r>
-          </w:p>
-        </w:tc>
-        <w:tc>
-          <w:tcPr>
-            <w:tcW w:type="dxa" w:w="1778"/>
-          </w:tcPr>
-          <w:p>
-            <w:r/>
-            <w:r>
-              <w:t>*(no description available)*</w:t>
-            </w:r>
-          </w:p>
-        </w:tc>
-        <w:tc>
-          <w:tcPr>
-            <w:tcW w:type="dxa" w:w="1966"/>
-          </w:tcPr>
-          <w:p>
-            <w:r/>
-            <w:r>
-              <w:t>*(no description available)*</w:t>
             </w:r>
           </w:p>
         </w:tc>
@@ -1294,34 +1294,34 @@
         </w:tc>
         <w:tc>
           <w:tcPr>
-            <w:tcW w:type="dxa" w:w="2246"/>
+            <w:tcW w:type="dxa" w:w="1778"/>
+          </w:tcPr>
+          <w:p>
+            <w:r/>
+            <w:r>
+              <w:t>Product Management</w:t>
+            </w:r>
+          </w:p>
+        </w:tc>
+        <w:tc>
+          <w:tcPr>
+            <w:tcW w:type="dxa" w:w="1872"/>
+          </w:tcPr>
+          <w:p>
+            <w:r/>
+            <w:r>
+              <w:t>Product Agreement Management</w:t>
+            </w:r>
+          </w:p>
+        </w:tc>
+        <w:tc>
+          <w:tcPr>
+            <w:tcW w:type="dxa" w:w="2340"/>
           </w:tcPr>
           <w:p>
             <w:r/>
             <w:r>
               <w:t>Contract Storage provides the central repository for contract storage as well as the associated contract meta-data. This data can be mined for Campaigns and Lead Generation. / Product Agreement Storage provides functionality necessary to store and make available the Product Agreements. / This function allows: / • to instantiate or update Product Agreement approved by the customer with their party involved, their configuration, their approvals and their status, / • to update Product Agreements status, / • to search and read Product Agreements.</w:t>
-            </w:r>
-          </w:p>
-        </w:tc>
-        <w:tc>
-          <w:tcPr>
-            <w:tcW w:type="dxa" w:w="1778"/>
-          </w:tcPr>
-          <w:p>
-            <w:r/>
-            <w:r>
-              <w:t>Product Management</w:t>
-            </w:r>
-          </w:p>
-        </w:tc>
-        <w:tc>
-          <w:tcPr>
-            <w:tcW w:type="dxa" w:w="1966"/>
-          </w:tcPr>
-          <w:p>
-            <w:r/>
-            <w:r>
-              <w:t>Product Agreement Management</w:t>
             </w:r>
           </w:p>
         </w:tc>
@@ -1351,34 +1351,34 @@
         </w:tc>
         <w:tc>
           <w:tcPr>
-            <w:tcW w:type="dxa" w:w="2246"/>
+            <w:tcW w:type="dxa" w:w="1778"/>
+          </w:tcPr>
+          <w:p>
+            <w:r/>
+            <w:r>
+              <w:t>Product Management</w:t>
+            </w:r>
+          </w:p>
+        </w:tc>
+        <w:tc>
+          <w:tcPr>
+            <w:tcW w:type="dxa" w:w="1872"/>
+          </w:tcPr>
+          <w:p>
+            <w:r/>
+            <w:r>
+              <w:t>Product Repository Management</w:t>
+            </w:r>
+          </w:p>
+        </w:tc>
+        <w:tc>
+          <w:tcPr>
+            <w:tcW w:type="dxa" w:w="2340"/>
           </w:tcPr>
           <w:p>
             <w:r/>
             <w:r>
               <w:t>Product Configuration Check Function Checks for each Product submitted if all Product configuration rules have been respected such as prerequisite, incompatibility rules between ProductSpecifications or mandatory characteristics.</w:t>
-            </w:r>
-          </w:p>
-        </w:tc>
-        <w:tc>
-          <w:tcPr>
-            <w:tcW w:type="dxa" w:w="1778"/>
-          </w:tcPr>
-          <w:p>
-            <w:r/>
-            <w:r>
-              <w:t>Product Management</w:t>
-            </w:r>
-          </w:p>
-        </w:tc>
-        <w:tc>
-          <w:tcPr>
-            <w:tcW w:type="dxa" w:w="1966"/>
-          </w:tcPr>
-          <w:p>
-            <w:r/>
-            <w:r>
-              <w:t>Product Repository Management</w:t>
             </w:r>
           </w:p>
         </w:tc>
@@ -1519,7 +1519,7 @@
         </w:tc>
         <w:tc>
           <w:tcPr>
-            <w:tcW w:type="dxa" w:w="2434"/>
+            <w:tcW w:type="dxa" w:w="2153"/>
           </w:tcPr>
           <w:p>
             <w:r/>
@@ -1533,7 +1533,7 @@
         </w:tc>
         <w:tc>
           <w:tcPr>
-            <w:tcW w:type="dxa" w:w="1872"/>
+            <w:tcW w:type="dxa" w:w="1591"/>
           </w:tcPr>
           <w:p>
             <w:r/>
@@ -1547,7 +1547,7 @@
         </w:tc>
         <w:tc>
           <w:tcPr>
-            <w:tcW w:type="dxa" w:w="1310"/>
+            <w:tcW w:type="dxa" w:w="1217"/>
           </w:tcPr>
           <w:p>
             <w:r/>
@@ -1561,7 +1561,7 @@
         </w:tc>
         <w:tc>
           <w:tcPr>
-            <w:tcW w:type="dxa" w:w="1310"/>
+            <w:tcW w:type="dxa" w:w="1217"/>
           </w:tcPr>
           <w:p>
             <w:r/>
@@ -1575,7 +1575,7 @@
         </w:tc>
         <w:tc>
           <w:tcPr>
-            <w:tcW w:type="dxa" w:w="1404"/>
+            <w:tcW w:type="dxa" w:w="2153"/>
           </w:tcPr>
           <w:p>
             <w:r/>
@@ -1602,7 +1602,7 @@
         </w:tc>
         <w:tc>
           <w:tcPr>
-            <w:tcW w:type="dxa" w:w="2434"/>
+            <w:tcW w:type="dxa" w:w="2153"/>
           </w:tcPr>
           <w:p>
             <w:r/>
@@ -1613,7 +1613,7 @@
         </w:tc>
         <w:tc>
           <w:tcPr>
-            <w:tcW w:type="dxa" w:w="1872"/>
+            <w:tcW w:type="dxa" w:w="1591"/>
           </w:tcPr>
           <w:p>
             <w:r/>
@@ -1624,7 +1624,7 @@
         </w:tc>
         <w:tc>
           <w:tcPr>
-            <w:tcW w:type="dxa" w:w="1310"/>
+            <w:tcW w:type="dxa" w:w="1217"/>
           </w:tcPr>
           <w:p>
             <w:r/>
@@ -1635,7 +1635,7 @@
         </w:tc>
         <w:tc>
           <w:tcPr>
-            <w:tcW w:type="dxa" w:w="1310"/>
+            <w:tcW w:type="dxa" w:w="1217"/>
           </w:tcPr>
           <w:p>
             <w:r/>
@@ -1646,36 +1646,12 @@
         </w:tc>
         <w:tc>
           <w:tcPr>
-            <w:tcW w:type="dxa" w:w="1404"/>
-          </w:tcPr>
-          <w:p>
-            <w:r/>
-            <w:r>
-              <w:t>GET</w:t>
-            </w:r>
-            <w:r>
-              <w:br/>
-            </w:r>
-            <w:r>
-              <w:t>GET /id</w:t>
-            </w:r>
-            <w:r>
-              <w:br/>
-            </w:r>
-            <w:r>
-              <w:t>POST</w:t>
-            </w:r>
-            <w:r>
-              <w:br/>
-            </w:r>
-            <w:r>
-              <w:t>PATCH</w:t>
-            </w:r>
-            <w:r>
-              <w:br/>
-            </w:r>
-            <w:r>
-              <w:t>DELETE</w:t>
+            <w:tcW w:type="dxa" w:w="2153"/>
+          </w:tcPr>
+          <w:p>
+            <w:r/>
+            <w:r>
+              <w:t>GET, GET /id, POST, PATCH, DELETE</w:t>
             </w:r>
           </w:p>
         </w:tc>
@@ -1694,7 +1670,7 @@
         </w:tc>
         <w:tc>
           <w:tcPr>
-            <w:tcW w:type="dxa" w:w="2434"/>
+            <w:tcW w:type="dxa" w:w="2153"/>
           </w:tcPr>
           <w:p>
             <w:r/>
@@ -1705,7 +1681,7 @@
         </w:tc>
         <w:tc>
           <w:tcPr>
-            <w:tcW w:type="dxa" w:w="1872"/>
+            <w:tcW w:type="dxa" w:w="1591"/>
           </w:tcPr>
           <w:p>
             <w:r/>
@@ -1716,7 +1692,7 @@
         </w:tc>
         <w:tc>
           <w:tcPr>
-            <w:tcW w:type="dxa" w:w="1310"/>
+            <w:tcW w:type="dxa" w:w="1217"/>
           </w:tcPr>
           <w:p>
             <w:r/>
@@ -1727,7 +1703,7 @@
         </w:tc>
         <w:tc>
           <w:tcPr>
-            <w:tcW w:type="dxa" w:w="1310"/>
+            <w:tcW w:type="dxa" w:w="1217"/>
           </w:tcPr>
           <w:p>
             <w:r/>
@@ -1738,36 +1714,12 @@
         </w:tc>
         <w:tc>
           <w:tcPr>
-            <w:tcW w:type="dxa" w:w="1404"/>
-          </w:tcPr>
-          <w:p>
-            <w:r/>
-            <w:r>
-              <w:t>GET</w:t>
-            </w:r>
-            <w:r>
-              <w:br/>
-            </w:r>
-            <w:r>
-              <w:t>GET /id</w:t>
-            </w:r>
-            <w:r>
-              <w:br/>
-            </w:r>
-            <w:r>
-              <w:t>POST</w:t>
-            </w:r>
-            <w:r>
-              <w:br/>
-            </w:r>
-            <w:r>
-              <w:t>PATCH</w:t>
-            </w:r>
-            <w:r>
-              <w:br/>
-            </w:r>
-            <w:r>
-              <w:t>DELETE</w:t>
+            <w:tcW w:type="dxa" w:w="2153"/>
+          </w:tcPr>
+          <w:p>
+            <w:r/>
+            <w:r>
+              <w:t>GET, GET /id, POST, PATCH, DELETE</w:t>
             </w:r>
           </w:p>
         </w:tc>
@@ -1786,18 +1738,18 @@
         </w:tc>
         <w:tc>
           <w:tcPr>
-            <w:tcW w:type="dxa" w:w="2434"/>
-          </w:tcPr>
-          <w:p>
-            <w:r/>
-            <w:r>
-              <w:t>Process Flow Management API</w:t>
-            </w:r>
-          </w:p>
-        </w:tc>
-        <w:tc>
-          <w:tcPr>
-            <w:tcW w:type="dxa" w:w="1872"/>
+            <w:tcW w:type="dxa" w:w="2153"/>
+          </w:tcPr>
+          <w:p>
+            <w:r/>
+            <w:r>
+              <w:t>UNRESOLVED-TMF701</w:t>
+            </w:r>
+          </w:p>
+        </w:tc>
+        <w:tc>
+          <w:tcPr>
+            <w:tcW w:type="dxa" w:w="1591"/>
           </w:tcPr>
           <w:p>
             <w:r/>
@@ -1808,7 +1760,7 @@
         </w:tc>
         <w:tc>
           <w:tcPr>
-            <w:tcW w:type="dxa" w:w="1310"/>
+            <w:tcW w:type="dxa" w:w="1217"/>
           </w:tcPr>
           <w:p>
             <w:r/>
@@ -1819,16 +1771,78 @@
         </w:tc>
         <w:tc>
           <w:tcPr>
-            <w:tcW w:type="dxa" w:w="1310"/>
+            <w:tcW w:type="dxa" w:w="1217"/>
           </w:tcPr>
           <w:p>
             <w:r/>
             <w:r>
               <w:t>processFlow</w:t>
             </w:r>
-            <w:r>
-              <w:br/>
-            </w:r>
+          </w:p>
+        </w:tc>
+        <w:tc>
+          <w:tcPr>
+            <w:tcW w:type="dxa" w:w="2153"/>
+          </w:tcPr>
+          <w:p>
+            <w:r/>
+            <w:r>
+              <w:t>POST, GET, GET /id, DELETE</w:t>
+            </w:r>
+          </w:p>
+        </w:tc>
+      </w:tr>
+      <w:tr>
+        <w:tc>
+          <w:tcPr>
+            <w:tcW w:type="dxa" w:w="1030"/>
+          </w:tcPr>
+          <w:p>
+            <w:r/>
+            <w:r>
+              <w:t>TMF701</w:t>
+            </w:r>
+          </w:p>
+        </w:tc>
+        <w:tc>
+          <w:tcPr>
+            <w:tcW w:type="dxa" w:w="2153"/>
+          </w:tcPr>
+          <w:p>
+            <w:r/>
+            <w:r>
+              <w:t>UNRESOLVED-TMF701</w:t>
+            </w:r>
+          </w:p>
+        </w:tc>
+        <w:tc>
+          <w:tcPr>
+            <w:tcW w:type="dxa" w:w="1591"/>
+          </w:tcPr>
+          <w:p>
+            <w:r/>
+            <w:r>
+              <w:t>Optional</w:t>
+            </w:r>
+          </w:p>
+        </w:tc>
+        <w:tc>
+          <w:tcPr>
+            <w:tcW w:type="dxa" w:w="1217"/>
+          </w:tcPr>
+          <w:p>
+            <w:r/>
+            <w:r>
+              <w:t>4</w:t>
+            </w:r>
+          </w:p>
+        </w:tc>
+        <w:tc>
+          <w:tcPr>
+            <w:tcW w:type="dxa" w:w="1217"/>
+          </w:tcPr>
+          <w:p>
+            <w:r/>
             <w:r>
               <w:t>taskFlow</w:t>
             </w:r>
@@ -1836,36 +1850,12 @@
         </w:tc>
         <w:tc>
           <w:tcPr>
-            <w:tcW w:type="dxa" w:w="1404"/>
-          </w:tcPr>
-          <w:p>
-            <w:r/>
-            <w:r>
-              <w:t>POST</w:t>
-            </w:r>
-            <w:r>
-              <w:br/>
-            </w:r>
-            <w:r>
-              <w:t>GET</w:t>
-            </w:r>
-            <w:r>
-              <w:br/>
-            </w:r>
-            <w:r>
-              <w:t>GET /id</w:t>
-            </w:r>
-            <w:r>
-              <w:br/>
-            </w:r>
-            <w:r>
-              <w:t>DELETE</w:t>
-            </w:r>
-            <w:r>
-              <w:br/>
-            </w:r>
-            <w:r>
-              <w:t>PATCH</w:t>
+            <w:tcW w:type="dxa" w:w="2153"/>
+          </w:tcPr>
+          <w:p>
+            <w:r/>
+            <w:r>
+              <w:t>PATCH, GET, GET /id</w:t>
             </w:r>
           </w:p>
         </w:tc>
@@ -1967,7 +1957,7 @@
         </w:tc>
         <w:tc>
           <w:tcPr>
-            <w:tcW w:type="dxa" w:w="2434"/>
+            <w:tcW w:type="dxa" w:w="2059"/>
           </w:tcPr>
           <w:p>
             <w:r/>
@@ -1981,7 +1971,7 @@
         </w:tc>
         <w:tc>
           <w:tcPr>
-            <w:tcW w:type="dxa" w:w="1310"/>
+            <w:tcW w:type="dxa" w:w="1217"/>
           </w:tcPr>
           <w:p>
             <w:r/>
@@ -1995,7 +1985,7 @@
         </w:tc>
         <w:tc>
           <w:tcPr>
-            <w:tcW w:type="dxa" w:w="1685"/>
+            <w:tcW w:type="dxa" w:w="1498"/>
           </w:tcPr>
           <w:p>
             <w:r/>
@@ -2009,7 +1999,7 @@
         </w:tc>
         <w:tc>
           <w:tcPr>
-            <w:tcW w:type="dxa" w:w="1685"/>
+            <w:tcW w:type="dxa" w:w="1498"/>
           </w:tcPr>
           <w:p>
             <w:r/>
@@ -2023,7 +2013,7 @@
         </w:tc>
         <w:tc>
           <w:tcPr>
-            <w:tcW w:type="dxa" w:w="1217"/>
+            <w:tcW w:type="dxa" w:w="2059"/>
           </w:tcPr>
           <w:p>
             <w:r/>
@@ -2050,7 +2040,7 @@
         </w:tc>
         <w:tc>
           <w:tcPr>
-            <w:tcW w:type="dxa" w:w="2434"/>
+            <w:tcW w:type="dxa" w:w="2059"/>
           </w:tcPr>
           <w:p>
             <w:r/>
@@ -2061,7 +2051,7 @@
         </w:tc>
         <w:tc>
           <w:tcPr>
-            <w:tcW w:type="dxa" w:w="1310"/>
+            <w:tcW w:type="dxa" w:w="1217"/>
           </w:tcPr>
           <w:p>
             <w:r/>
@@ -2072,7 +2062,7 @@
         </w:tc>
         <w:tc>
           <w:tcPr>
-            <w:tcW w:type="dxa" w:w="1685"/>
+            <w:tcW w:type="dxa" w:w="1498"/>
           </w:tcPr>
           <w:p>
             <w:r/>
@@ -2083,41 +2073,23 @@
         </w:tc>
         <w:tc>
           <w:tcPr>
-            <w:tcW w:type="dxa" w:w="1685"/>
+            <w:tcW w:type="dxa" w:w="1498"/>
           </w:tcPr>
           <w:p>
             <w:r/>
             <w:r>
               <w:t>productOffering</w:t>
             </w:r>
-            <w:r>
-              <w:br/>
-            </w:r>
-            <w:r>
-              <w:t>productOfferingPrice</w:t>
-            </w:r>
-            <w:r>
-              <w:br/>
-            </w:r>
-            <w:r>
-              <w:t>productSpecification</w:t>
-            </w:r>
-          </w:p>
-        </w:tc>
-        <w:tc>
-          <w:tcPr>
-            <w:tcW w:type="dxa" w:w="1217"/>
-          </w:tcPr>
-          <w:p>
-            <w:r/>
-            <w:r>
-              <w:t>GET</w:t>
-            </w:r>
-            <w:r>
-              <w:br/>
-            </w:r>
-            <w:r>
-              <w:t>GET /id</w:t>
+          </w:p>
+        </w:tc>
+        <w:tc>
+          <w:tcPr>
+            <w:tcW w:type="dxa" w:w="2059"/>
+          </w:tcPr>
+          <w:p>
+            <w:r/>
+            <w:r>
+              <w:t>GET, GET /id</w:t>
             </w:r>
           </w:p>
         </w:tc>
@@ -2136,7 +2108,7 @@
         </w:tc>
         <w:tc>
           <w:tcPr>
-            <w:tcW w:type="dxa" w:w="2434"/>
+            <w:tcW w:type="dxa" w:w="2059"/>
           </w:tcPr>
           <w:p>
             <w:r/>
@@ -2147,18 +2119,18 @@
         </w:tc>
         <w:tc>
           <w:tcPr>
-            <w:tcW w:type="dxa" w:w="1310"/>
-          </w:tcPr>
-          <w:p>
-            <w:r/>
-            <w:r>
-              <w:t>4</w:t>
-            </w:r>
-          </w:p>
-        </w:tc>
-        <w:tc>
-          <w:tcPr>
-            <w:tcW w:type="dxa" w:w="1685"/>
+            <w:tcW w:type="dxa" w:w="1217"/>
+          </w:tcPr>
+          <w:p>
+            <w:r/>
+            <w:r>
+              <w:t>5</w:t>
+            </w:r>
+          </w:p>
+        </w:tc>
+        <w:tc>
+          <w:tcPr>
+            <w:tcW w:type="dxa" w:w="1498"/>
           </w:tcPr>
           <w:p>
             <w:r/>
@@ -2169,22 +2141,10 @@
         </w:tc>
         <w:tc>
           <w:tcPr>
-            <w:tcW w:type="dxa" w:w="1685"/>
-          </w:tcPr>
-          <w:p>
-            <w:r/>
-            <w:r>
-              <w:t>productSpecification</w:t>
-            </w:r>
-            <w:r>
-              <w:br/>
-            </w:r>
-            <w:r>
-              <w:t>productOffering</w:t>
-            </w:r>
-            <w:r>
-              <w:br/>
-            </w:r>
+            <w:tcW w:type="dxa" w:w="1498"/>
+          </w:tcPr>
+          <w:p>
+            <w:r/>
             <w:r>
               <w:t>productOfferingPrice</w:t>
             </w:r>
@@ -2192,18 +2152,12 @@
         </w:tc>
         <w:tc>
           <w:tcPr>
-            <w:tcW w:type="dxa" w:w="1217"/>
-          </w:tcPr>
-          <w:p>
-            <w:r/>
-            <w:r>
-              <w:t>GET</w:t>
-            </w:r>
-            <w:r>
-              <w:br/>
-            </w:r>
-            <w:r>
-              <w:t>GET /id</w:t>
+            <w:tcW w:type="dxa" w:w="2059"/>
+          </w:tcPr>
+          <w:p>
+            <w:r/>
+            <w:r>
+              <w:t>GET, GET /id</w:t>
             </w:r>
           </w:p>
         </w:tc>
@@ -2216,24 +2170,24 @@
           <w:p>
             <w:r/>
             <w:r>
-              <w:t>TMF669</w:t>
-            </w:r>
-          </w:p>
-        </w:tc>
-        <w:tc>
-          <w:tcPr>
-            <w:tcW w:type="dxa" w:w="2434"/>
-          </w:tcPr>
-          <w:p>
-            <w:r/>
-            <w:r>
-              <w:t>Party Role Management API</w:t>
-            </w:r>
-          </w:p>
-        </w:tc>
-        <w:tc>
-          <w:tcPr>
-            <w:tcW w:type="dxa" w:w="1310"/>
+              <w:t>TMF620</w:t>
+            </w:r>
+          </w:p>
+        </w:tc>
+        <w:tc>
+          <w:tcPr>
+            <w:tcW w:type="dxa" w:w="2059"/>
+          </w:tcPr>
+          <w:p>
+            <w:r/>
+            <w:r>
+              <w:t>Product Catalog Management API</w:t>
+            </w:r>
+          </w:p>
+        </w:tc>
+        <w:tc>
+          <w:tcPr>
+            <w:tcW w:type="dxa" w:w="1217"/>
           </w:tcPr>
           <w:p>
             <w:r/>
@@ -2244,40 +2198,34 @@
         </w:tc>
         <w:tc>
           <w:tcPr>
-            <w:tcW w:type="dxa" w:w="1685"/>
-          </w:tcPr>
-          <w:p>
-            <w:r/>
-            <w:r>
-              <w:t>Optional</w:t>
-            </w:r>
-          </w:p>
-        </w:tc>
-        <w:tc>
-          <w:tcPr>
-            <w:tcW w:type="dxa" w:w="1685"/>
-          </w:tcPr>
-          <w:p>
-            <w:r/>
-            <w:r>
-              <w:t>partyRoleManagement</w:t>
-            </w:r>
-          </w:p>
-        </w:tc>
-        <w:tc>
-          <w:tcPr>
-            <w:tcW w:type="dxa" w:w="1217"/>
-          </w:tcPr>
-          <w:p>
-            <w:r/>
-            <w:r>
-              <w:t>GET</w:t>
-            </w:r>
-            <w:r>
-              <w:br/>
-            </w:r>
-            <w:r>
-              <w:t>GET /id</w:t>
+            <w:tcW w:type="dxa" w:w="1498"/>
+          </w:tcPr>
+          <w:p>
+            <w:r/>
+            <w:r>
+              <w:t>Mandatory</w:t>
+            </w:r>
+          </w:p>
+        </w:tc>
+        <w:tc>
+          <w:tcPr>
+            <w:tcW w:type="dxa" w:w="1498"/>
+          </w:tcPr>
+          <w:p>
+            <w:r/>
+            <w:r>
+              <w:t>productSpecification</w:t>
+            </w:r>
+          </w:p>
+        </w:tc>
+        <w:tc>
+          <w:tcPr>
+            <w:tcW w:type="dxa" w:w="2059"/>
+          </w:tcPr>
+          <w:p>
+            <w:r/>
+            <w:r>
+              <w:t>GET, GET /id</w:t>
             </w:r>
           </w:p>
         </w:tc>
@@ -2290,24 +2238,24 @@
           <w:p>
             <w:r/>
             <w:r>
-              <w:t>TMF669</w:t>
-            </w:r>
-          </w:p>
-        </w:tc>
-        <w:tc>
-          <w:tcPr>
-            <w:tcW w:type="dxa" w:w="2434"/>
-          </w:tcPr>
-          <w:p>
-            <w:r/>
-            <w:r>
-              <w:t>Party Role Management API</w:t>
-            </w:r>
-          </w:p>
-        </w:tc>
-        <w:tc>
-          <w:tcPr>
-            <w:tcW w:type="dxa" w:w="1310"/>
+              <w:t>TMF620</w:t>
+            </w:r>
+          </w:p>
+        </w:tc>
+        <w:tc>
+          <w:tcPr>
+            <w:tcW w:type="dxa" w:w="2059"/>
+          </w:tcPr>
+          <w:p>
+            <w:r/>
+            <w:r>
+              <w:t>Product Catalog Management API</w:t>
+            </w:r>
+          </w:p>
+        </w:tc>
+        <w:tc>
+          <w:tcPr>
+            <w:tcW w:type="dxa" w:w="1217"/>
           </w:tcPr>
           <w:p>
             <w:r/>
@@ -2318,40 +2266,34 @@
         </w:tc>
         <w:tc>
           <w:tcPr>
-            <w:tcW w:type="dxa" w:w="1685"/>
-          </w:tcPr>
-          <w:p>
-            <w:r/>
-            <w:r>
-              <w:t>Optional</w:t>
-            </w:r>
-          </w:p>
-        </w:tc>
-        <w:tc>
-          <w:tcPr>
-            <w:tcW w:type="dxa" w:w="1685"/>
-          </w:tcPr>
-          <w:p>
-            <w:r/>
-            <w:r>
-              <w:t>PartyRoleManagement</w:t>
-            </w:r>
-          </w:p>
-        </w:tc>
-        <w:tc>
-          <w:tcPr>
-            <w:tcW w:type="dxa" w:w="1217"/>
-          </w:tcPr>
-          <w:p>
-            <w:r/>
-            <w:r>
-              <w:t>GET</w:t>
-            </w:r>
-            <w:r>
-              <w:br/>
-            </w:r>
-            <w:r>
-              <w:t>GET /id</w:t>
+            <w:tcW w:type="dxa" w:w="1498"/>
+          </w:tcPr>
+          <w:p>
+            <w:r/>
+            <w:r>
+              <w:t>Mandatory</w:t>
+            </w:r>
+          </w:p>
+        </w:tc>
+        <w:tc>
+          <w:tcPr>
+            <w:tcW w:type="dxa" w:w="1498"/>
+          </w:tcPr>
+          <w:p>
+            <w:r/>
+            <w:r>
+              <w:t>productSpecification</w:t>
+            </w:r>
+          </w:p>
+        </w:tc>
+        <w:tc>
+          <w:tcPr>
+            <w:tcW w:type="dxa" w:w="2059"/>
+          </w:tcPr>
+          <w:p>
+            <w:r/>
+            <w:r>
+              <w:t>GET, GET /id</w:t>
             </w:r>
           </w:p>
         </w:tc>
@@ -2364,24 +2306,24 @@
           <w:p>
             <w:r/>
             <w:r>
-              <w:t>TMF639</w:t>
-            </w:r>
-          </w:p>
-        </w:tc>
-        <w:tc>
-          <w:tcPr>
-            <w:tcW w:type="dxa" w:w="2434"/>
-          </w:tcPr>
-          <w:p>
-            <w:r/>
-            <w:r>
-              <w:t>Resource Inventory Management API</w:t>
-            </w:r>
-          </w:p>
-        </w:tc>
-        <w:tc>
-          <w:tcPr>
-            <w:tcW w:type="dxa" w:w="1310"/>
+              <w:t>TMF620</w:t>
+            </w:r>
+          </w:p>
+        </w:tc>
+        <w:tc>
+          <w:tcPr>
+            <w:tcW w:type="dxa" w:w="2059"/>
+          </w:tcPr>
+          <w:p>
+            <w:r/>
+            <w:r>
+              <w:t>Product Catalog Management API</w:t>
+            </w:r>
+          </w:p>
+        </w:tc>
+        <w:tc>
+          <w:tcPr>
+            <w:tcW w:type="dxa" w:w="1217"/>
           </w:tcPr>
           <w:p>
             <w:r/>
@@ -2392,40 +2334,34 @@
         </w:tc>
         <w:tc>
           <w:tcPr>
-            <w:tcW w:type="dxa" w:w="1685"/>
-          </w:tcPr>
-          <w:p>
-            <w:r/>
-            <w:r>
-              <w:t>Optional</w:t>
-            </w:r>
-          </w:p>
-        </w:tc>
-        <w:tc>
-          <w:tcPr>
-            <w:tcW w:type="dxa" w:w="1685"/>
-          </w:tcPr>
-          <w:p>
-            <w:r/>
-            <w:r>
-              <w:t>resource</w:t>
-            </w:r>
-          </w:p>
-        </w:tc>
-        <w:tc>
-          <w:tcPr>
-            <w:tcW w:type="dxa" w:w="1217"/>
-          </w:tcPr>
-          <w:p>
-            <w:r/>
-            <w:r>
-              <w:t>GET</w:t>
-            </w:r>
-            <w:r>
-              <w:br/>
-            </w:r>
-            <w:r>
-              <w:t>GET /id</w:t>
+            <w:tcW w:type="dxa" w:w="1498"/>
+          </w:tcPr>
+          <w:p>
+            <w:r/>
+            <w:r>
+              <w:t>Mandatory</w:t>
+            </w:r>
+          </w:p>
+        </w:tc>
+        <w:tc>
+          <w:tcPr>
+            <w:tcW w:type="dxa" w:w="1498"/>
+          </w:tcPr>
+          <w:p>
+            <w:r/>
+            <w:r>
+              <w:t>productOffering</w:t>
+            </w:r>
+          </w:p>
+        </w:tc>
+        <w:tc>
+          <w:tcPr>
+            <w:tcW w:type="dxa" w:w="2059"/>
+          </w:tcPr>
+          <w:p>
+            <w:r/>
+            <w:r>
+              <w:t>GET, GET /id</w:t>
             </w:r>
           </w:p>
         </w:tc>
@@ -2438,24 +2374,24 @@
           <w:p>
             <w:r/>
             <w:r>
-              <w:t>TMF651</w:t>
-            </w:r>
-          </w:p>
-        </w:tc>
-        <w:tc>
-          <w:tcPr>
-            <w:tcW w:type="dxa" w:w="2434"/>
-          </w:tcPr>
-          <w:p>
-            <w:r/>
-            <w:r>
-              <w:t>Agreement Management API</w:t>
-            </w:r>
-          </w:p>
-        </w:tc>
-        <w:tc>
-          <w:tcPr>
-            <w:tcW w:type="dxa" w:w="1310"/>
+              <w:t>TMF620</w:t>
+            </w:r>
+          </w:p>
+        </w:tc>
+        <w:tc>
+          <w:tcPr>
+            <w:tcW w:type="dxa" w:w="2059"/>
+          </w:tcPr>
+          <w:p>
+            <w:r/>
+            <w:r>
+              <w:t>Product Catalog Management API</w:t>
+            </w:r>
+          </w:p>
+        </w:tc>
+        <w:tc>
+          <w:tcPr>
+            <w:tcW w:type="dxa" w:w="1217"/>
           </w:tcPr>
           <w:p>
             <w:r/>
@@ -2466,40 +2402,34 @@
         </w:tc>
         <w:tc>
           <w:tcPr>
-            <w:tcW w:type="dxa" w:w="1685"/>
-          </w:tcPr>
-          <w:p>
-            <w:r/>
-            <w:r>
-              <w:t>Optional</w:t>
-            </w:r>
-          </w:p>
-        </w:tc>
-        <w:tc>
-          <w:tcPr>
-            <w:tcW w:type="dxa" w:w="1685"/>
-          </w:tcPr>
-          <w:p>
-            <w:r/>
-            <w:r>
-              <w:t>agreement</w:t>
-            </w:r>
-          </w:p>
-        </w:tc>
-        <w:tc>
-          <w:tcPr>
-            <w:tcW w:type="dxa" w:w="1217"/>
-          </w:tcPr>
-          <w:p>
-            <w:r/>
-            <w:r>
-              <w:t>GET</w:t>
-            </w:r>
-            <w:r>
-              <w:br/>
-            </w:r>
-            <w:r>
-              <w:t>GET /id</w:t>
+            <w:tcW w:type="dxa" w:w="1498"/>
+          </w:tcPr>
+          <w:p>
+            <w:r/>
+            <w:r>
+              <w:t>Mandatory</w:t>
+            </w:r>
+          </w:p>
+        </w:tc>
+        <w:tc>
+          <w:tcPr>
+            <w:tcW w:type="dxa" w:w="1498"/>
+          </w:tcPr>
+          <w:p>
+            <w:r/>
+            <w:r>
+              <w:t>productOfferingPrice</w:t>
+            </w:r>
+          </w:p>
+        </w:tc>
+        <w:tc>
+          <w:tcPr>
+            <w:tcW w:type="dxa" w:w="2059"/>
+          </w:tcPr>
+          <w:p>
+            <w:r/>
+            <w:r>
+              <w:t>GET, GET /id</w:t>
             </w:r>
           </w:p>
         </w:tc>
@@ -2512,35 +2442,35 @@
           <w:p>
             <w:r/>
             <w:r>
-              <w:t>TMF673</w:t>
-            </w:r>
-          </w:p>
-        </w:tc>
-        <w:tc>
-          <w:tcPr>
-            <w:tcW w:type="dxa" w:w="2434"/>
-          </w:tcPr>
-          <w:p>
-            <w:r/>
-            <w:r>
-              <w:t>Geographic Address Management API</w:t>
-            </w:r>
-          </w:p>
-        </w:tc>
-        <w:tc>
-          <w:tcPr>
-            <w:tcW w:type="dxa" w:w="1310"/>
-          </w:tcPr>
-          <w:p>
-            <w:r/>
-            <w:r>
-              <w:t>4</w:t>
-            </w:r>
-          </w:p>
-        </w:tc>
-        <w:tc>
-          <w:tcPr>
-            <w:tcW w:type="dxa" w:w="1685"/>
+              <w:t>TMF669</w:t>
+            </w:r>
+          </w:p>
+        </w:tc>
+        <w:tc>
+          <w:tcPr>
+            <w:tcW w:type="dxa" w:w="2059"/>
+          </w:tcPr>
+          <w:p>
+            <w:r/>
+            <w:r>
+              <w:t>Party Role Management API</w:t>
+            </w:r>
+          </w:p>
+        </w:tc>
+        <w:tc>
+          <w:tcPr>
+            <w:tcW w:type="dxa" w:w="1217"/>
+          </w:tcPr>
+          <w:p>
+            <w:r/>
+            <w:r>
+              <w:t>5</w:t>
+            </w:r>
+          </w:p>
+        </w:tc>
+        <w:tc>
+          <w:tcPr>
+            <w:tcW w:type="dxa" w:w="1498"/>
           </w:tcPr>
           <w:p>
             <w:r/>
@@ -2551,35 +2481,23 @@
         </w:tc>
         <w:tc>
           <w:tcPr>
-            <w:tcW w:type="dxa" w:w="1685"/>
-          </w:tcPr>
-          <w:p>
-            <w:r/>
-            <w:r>
-              <w:t>geographicAddress</w:t>
-            </w:r>
-            <w:r>
-              <w:br/>
-            </w:r>
-            <w:r>
-              <w:t>geographicSubAddress</w:t>
-            </w:r>
-          </w:p>
-        </w:tc>
-        <w:tc>
-          <w:tcPr>
-            <w:tcW w:type="dxa" w:w="1217"/>
-          </w:tcPr>
-          <w:p>
-            <w:r/>
-            <w:r>
-              <w:t>GET</w:t>
-            </w:r>
-            <w:r>
-              <w:br/>
-            </w:r>
-            <w:r>
-              <w:t>GET /id</w:t>
+            <w:tcW w:type="dxa" w:w="1498"/>
+          </w:tcPr>
+          <w:p>
+            <w:r/>
+            <w:r>
+              <w:t>partyRoleManagement</w:t>
+            </w:r>
+          </w:p>
+        </w:tc>
+        <w:tc>
+          <w:tcPr>
+            <w:tcW w:type="dxa" w:w="2059"/>
+          </w:tcPr>
+          <w:p>
+            <w:r/>
+            <w:r>
+              <w:t>GET, GET /id</w:t>
             </w:r>
           </w:p>
         </w:tc>
@@ -2592,24 +2510,24 @@
           <w:p>
             <w:r/>
             <w:r>
-              <w:t>TMF674</w:t>
-            </w:r>
-          </w:p>
-        </w:tc>
-        <w:tc>
-          <w:tcPr>
-            <w:tcW w:type="dxa" w:w="2434"/>
-          </w:tcPr>
-          <w:p>
-            <w:r/>
-            <w:r>
-              <w:t>Geographic Site Management API</w:t>
-            </w:r>
-          </w:p>
-        </w:tc>
-        <w:tc>
-          <w:tcPr>
-            <w:tcW w:type="dxa" w:w="1310"/>
+              <w:t>TMF669</w:t>
+            </w:r>
+          </w:p>
+        </w:tc>
+        <w:tc>
+          <w:tcPr>
+            <w:tcW w:type="dxa" w:w="2059"/>
+          </w:tcPr>
+          <w:p>
+            <w:r/>
+            <w:r>
+              <w:t>Party Role Management API</w:t>
+            </w:r>
+          </w:p>
+        </w:tc>
+        <w:tc>
+          <w:tcPr>
+            <w:tcW w:type="dxa" w:w="1217"/>
           </w:tcPr>
           <w:p>
             <w:r/>
@@ -2620,7 +2538,7 @@
         </w:tc>
         <w:tc>
           <w:tcPr>
-            <w:tcW w:type="dxa" w:w="1685"/>
+            <w:tcW w:type="dxa" w:w="1498"/>
           </w:tcPr>
           <w:p>
             <w:r/>
@@ -2631,29 +2549,23 @@
         </w:tc>
         <w:tc>
           <w:tcPr>
-            <w:tcW w:type="dxa" w:w="1685"/>
-          </w:tcPr>
-          <w:p>
-            <w:r/>
-            <w:r>
-              <w:t>geographicSite</w:t>
-            </w:r>
-          </w:p>
-        </w:tc>
-        <w:tc>
-          <w:tcPr>
-            <w:tcW w:type="dxa" w:w="1217"/>
-          </w:tcPr>
-          <w:p>
-            <w:r/>
-            <w:r>
-              <w:t>GET</w:t>
-            </w:r>
-            <w:r>
-              <w:br/>
-            </w:r>
-            <w:r>
-              <w:t>GET /id</w:t>
+            <w:tcW w:type="dxa" w:w="1498"/>
+          </w:tcPr>
+          <w:p>
+            <w:r/>
+            <w:r>
+              <w:t>PartyRoleManagement</w:t>
+            </w:r>
+          </w:p>
+        </w:tc>
+        <w:tc>
+          <w:tcPr>
+            <w:tcW w:type="dxa" w:w="2059"/>
+          </w:tcPr>
+          <w:p>
+            <w:r/>
+            <w:r>
+              <w:t>GET, GET /id</w:t>
             </w:r>
           </w:p>
         </w:tc>
@@ -2666,24 +2578,24 @@
           <w:p>
             <w:r/>
             <w:r>
-              <w:t>TMF675</w:t>
-            </w:r>
-          </w:p>
-        </w:tc>
-        <w:tc>
-          <w:tcPr>
-            <w:tcW w:type="dxa" w:w="2434"/>
-          </w:tcPr>
-          <w:p>
-            <w:r/>
-            <w:r>
-              <w:t>Geographic Location Management API</w:t>
-            </w:r>
-          </w:p>
-        </w:tc>
-        <w:tc>
-          <w:tcPr>
-            <w:tcW w:type="dxa" w:w="1310"/>
+              <w:t>TMF639</w:t>
+            </w:r>
+          </w:p>
+        </w:tc>
+        <w:tc>
+          <w:tcPr>
+            <w:tcW w:type="dxa" w:w="2059"/>
+          </w:tcPr>
+          <w:p>
+            <w:r/>
+            <w:r>
+              <w:t>Resource Inventory Management API</w:t>
+            </w:r>
+          </w:p>
+        </w:tc>
+        <w:tc>
+          <w:tcPr>
+            <w:tcW w:type="dxa" w:w="1217"/>
           </w:tcPr>
           <w:p>
             <w:r/>
@@ -2694,7 +2606,7 @@
         </w:tc>
         <w:tc>
           <w:tcPr>
-            <w:tcW w:type="dxa" w:w="1685"/>
+            <w:tcW w:type="dxa" w:w="1498"/>
           </w:tcPr>
           <w:p>
             <w:r/>
@@ -2705,29 +2617,23 @@
         </w:tc>
         <w:tc>
           <w:tcPr>
-            <w:tcW w:type="dxa" w:w="1685"/>
-          </w:tcPr>
-          <w:p>
-            <w:r/>
-            <w:r>
-              <w:t>geographicLocation</w:t>
-            </w:r>
-          </w:p>
-        </w:tc>
-        <w:tc>
-          <w:tcPr>
-            <w:tcW w:type="dxa" w:w="1217"/>
-          </w:tcPr>
-          <w:p>
-            <w:r/>
-            <w:r>
-              <w:t>GET</w:t>
-            </w:r>
-            <w:r>
-              <w:br/>
-            </w:r>
-            <w:r>
-              <w:t>GET /id</w:t>
+            <w:tcW w:type="dxa" w:w="1498"/>
+          </w:tcPr>
+          <w:p>
+            <w:r/>
+            <w:r>
+              <w:t>resource</w:t>
+            </w:r>
+          </w:p>
+        </w:tc>
+        <w:tc>
+          <w:tcPr>
+            <w:tcW w:type="dxa" w:w="2059"/>
+          </w:tcPr>
+          <w:p>
+            <w:r/>
+            <w:r>
+              <w:t>GET, GET /id</w:t>
             </w:r>
           </w:p>
         </w:tc>
@@ -2740,35 +2646,35 @@
           <w:p>
             <w:r/>
             <w:r>
-              <w:t>TMF666</w:t>
-            </w:r>
-          </w:p>
-        </w:tc>
-        <w:tc>
-          <w:tcPr>
-            <w:tcW w:type="dxa" w:w="2434"/>
-          </w:tcPr>
-          <w:p>
-            <w:r/>
-            <w:r>
-              <w:t>Account Management API</w:t>
-            </w:r>
-          </w:p>
-        </w:tc>
-        <w:tc>
-          <w:tcPr>
-            <w:tcW w:type="dxa" w:w="1310"/>
-          </w:tcPr>
-          <w:p>
-            <w:r/>
-            <w:r>
-              <w:t>5</w:t>
-            </w:r>
-          </w:p>
-        </w:tc>
-        <w:tc>
-          <w:tcPr>
-            <w:tcW w:type="dxa" w:w="1685"/>
+              <w:t>TMF651</w:t>
+            </w:r>
+          </w:p>
+        </w:tc>
+        <w:tc>
+          <w:tcPr>
+            <w:tcW w:type="dxa" w:w="2059"/>
+          </w:tcPr>
+          <w:p>
+            <w:r/>
+            <w:r>
+              <w:t>Agreement Management API</w:t>
+            </w:r>
+          </w:p>
+        </w:tc>
+        <w:tc>
+          <w:tcPr>
+            <w:tcW w:type="dxa" w:w="1217"/>
+          </w:tcPr>
+          <w:p>
+            <w:r/>
+            <w:r>
+              <w:t>4</w:t>
+            </w:r>
+          </w:p>
+        </w:tc>
+        <w:tc>
+          <w:tcPr>
+            <w:tcW w:type="dxa" w:w="1498"/>
           </w:tcPr>
           <w:p>
             <w:r/>
@@ -2779,29 +2685,23 @@
         </w:tc>
         <w:tc>
           <w:tcPr>
-            <w:tcW w:type="dxa" w:w="1685"/>
-          </w:tcPr>
-          <w:p>
-            <w:r/>
-            <w:r>
-              <w:t>billingAccount</w:t>
-            </w:r>
-          </w:p>
-        </w:tc>
-        <w:tc>
-          <w:tcPr>
-            <w:tcW w:type="dxa" w:w="1217"/>
-          </w:tcPr>
-          <w:p>
-            <w:r/>
-            <w:r>
-              <w:t>GET</w:t>
-            </w:r>
-            <w:r>
-              <w:br/>
-            </w:r>
-            <w:r>
-              <w:t>GET /id</w:t>
+            <w:tcW w:type="dxa" w:w="1498"/>
+          </w:tcPr>
+          <w:p>
+            <w:r/>
+            <w:r>
+              <w:t>agreement</w:t>
+            </w:r>
+          </w:p>
+        </w:tc>
+        <w:tc>
+          <w:tcPr>
+            <w:tcW w:type="dxa" w:w="2059"/>
+          </w:tcPr>
+          <w:p>
+            <w:r/>
+            <w:r>
+              <w:t>GET, GET /id</w:t>
             </w:r>
           </w:p>
         </w:tc>
@@ -2814,24 +2714,24 @@
           <w:p>
             <w:r/>
             <w:r>
-              <w:t>TMF666</w:t>
-            </w:r>
-          </w:p>
-        </w:tc>
-        <w:tc>
-          <w:tcPr>
-            <w:tcW w:type="dxa" w:w="2434"/>
-          </w:tcPr>
-          <w:p>
-            <w:r/>
-            <w:r>
-              <w:t>Account Management API</w:t>
-            </w:r>
-          </w:p>
-        </w:tc>
-        <w:tc>
-          <w:tcPr>
-            <w:tcW w:type="dxa" w:w="1310"/>
+              <w:t>TMF673</w:t>
+            </w:r>
+          </w:p>
+        </w:tc>
+        <w:tc>
+          <w:tcPr>
+            <w:tcW w:type="dxa" w:w="2059"/>
+          </w:tcPr>
+          <w:p>
+            <w:r/>
+            <w:r>
+              <w:t>Geographic Address Management API</w:t>
+            </w:r>
+          </w:p>
+        </w:tc>
+        <w:tc>
+          <w:tcPr>
+            <w:tcW w:type="dxa" w:w="1217"/>
           </w:tcPr>
           <w:p>
             <w:r/>
@@ -2842,7 +2742,7 @@
         </w:tc>
         <w:tc>
           <w:tcPr>
-            <w:tcW w:type="dxa" w:w="1685"/>
+            <w:tcW w:type="dxa" w:w="1498"/>
           </w:tcPr>
           <w:p>
             <w:r/>
@@ -2853,29 +2753,23 @@
         </w:tc>
         <w:tc>
           <w:tcPr>
-            <w:tcW w:type="dxa" w:w="1685"/>
-          </w:tcPr>
-          <w:p>
-            <w:r/>
-            <w:r>
-              <w:t>billingAccount</w:t>
-            </w:r>
-          </w:p>
-        </w:tc>
-        <w:tc>
-          <w:tcPr>
-            <w:tcW w:type="dxa" w:w="1217"/>
-          </w:tcPr>
-          <w:p>
-            <w:r/>
-            <w:r>
-              <w:t>GET</w:t>
-            </w:r>
-            <w:r>
-              <w:br/>
-            </w:r>
-            <w:r>
-              <w:t>GET /id</w:t>
+            <w:tcW w:type="dxa" w:w="1498"/>
+          </w:tcPr>
+          <w:p>
+            <w:r/>
+            <w:r>
+              <w:t>geographicAddress</w:t>
+            </w:r>
+          </w:p>
+        </w:tc>
+        <w:tc>
+          <w:tcPr>
+            <w:tcW w:type="dxa" w:w="2059"/>
+          </w:tcPr>
+          <w:p>
+            <w:r/>
+            <w:r>
+              <w:t>GET, GET /id</w:t>
             </w:r>
           </w:p>
         </w:tc>
@@ -2888,35 +2782,35 @@
           <w:p>
             <w:r/>
             <w:r>
-              <w:t>TMF632</w:t>
-            </w:r>
-          </w:p>
-        </w:tc>
-        <w:tc>
-          <w:tcPr>
-            <w:tcW w:type="dxa" w:w="2434"/>
-          </w:tcPr>
-          <w:p>
-            <w:r/>
-            <w:r>
-              <w:t>Party Management API</w:t>
-            </w:r>
-          </w:p>
-        </w:tc>
-        <w:tc>
-          <w:tcPr>
-            <w:tcW w:type="dxa" w:w="1310"/>
-          </w:tcPr>
-          <w:p>
-            <w:r/>
-            <w:r>
-              <w:t>5</w:t>
-            </w:r>
-          </w:p>
-        </w:tc>
-        <w:tc>
-          <w:tcPr>
-            <w:tcW w:type="dxa" w:w="1685"/>
+              <w:t>TMF673</w:t>
+            </w:r>
+          </w:p>
+        </w:tc>
+        <w:tc>
+          <w:tcPr>
+            <w:tcW w:type="dxa" w:w="2059"/>
+          </w:tcPr>
+          <w:p>
+            <w:r/>
+            <w:r>
+              <w:t>Geographic Address Management API</w:t>
+            </w:r>
+          </w:p>
+        </w:tc>
+        <w:tc>
+          <w:tcPr>
+            <w:tcW w:type="dxa" w:w="1217"/>
+          </w:tcPr>
+          <w:p>
+            <w:r/>
+            <w:r>
+              <w:t>4</w:t>
+            </w:r>
+          </w:p>
+        </w:tc>
+        <w:tc>
+          <w:tcPr>
+            <w:tcW w:type="dxa" w:w="1498"/>
           </w:tcPr>
           <w:p>
             <w:r/>
@@ -2927,35 +2821,23 @@
         </w:tc>
         <w:tc>
           <w:tcPr>
-            <w:tcW w:type="dxa" w:w="1685"/>
-          </w:tcPr>
-          <w:p>
-            <w:r/>
-            <w:r>
-              <w:t>individual</w:t>
-            </w:r>
-            <w:r>
-              <w:br/>
-            </w:r>
-            <w:r>
-              <w:t>organization</w:t>
-            </w:r>
-          </w:p>
-        </w:tc>
-        <w:tc>
-          <w:tcPr>
-            <w:tcW w:type="dxa" w:w="1217"/>
-          </w:tcPr>
-          <w:p>
-            <w:r/>
-            <w:r>
-              <w:t>GET</w:t>
-            </w:r>
-            <w:r>
-              <w:br/>
-            </w:r>
-            <w:r>
-              <w:t>GET /id</w:t>
+            <w:tcW w:type="dxa" w:w="1498"/>
+          </w:tcPr>
+          <w:p>
+            <w:r/>
+            <w:r>
+              <w:t>geographicSubAddress</w:t>
+            </w:r>
+          </w:p>
+        </w:tc>
+        <w:tc>
+          <w:tcPr>
+            <w:tcW w:type="dxa" w:w="2059"/>
+          </w:tcPr>
+          <w:p>
+            <w:r/>
+            <w:r>
+              <w:t>GET, GET /id</w:t>
             </w:r>
           </w:p>
         </w:tc>
@@ -2968,24 +2850,24 @@
           <w:p>
             <w:r/>
             <w:r>
-              <w:t>TMF632</w:t>
-            </w:r>
-          </w:p>
-        </w:tc>
-        <w:tc>
-          <w:tcPr>
-            <w:tcW w:type="dxa" w:w="2434"/>
-          </w:tcPr>
-          <w:p>
-            <w:r/>
-            <w:r>
-              <w:t>Party Management API</w:t>
-            </w:r>
-          </w:p>
-        </w:tc>
-        <w:tc>
-          <w:tcPr>
-            <w:tcW w:type="dxa" w:w="1310"/>
+              <w:t>TMF674</w:t>
+            </w:r>
+          </w:p>
+        </w:tc>
+        <w:tc>
+          <w:tcPr>
+            <w:tcW w:type="dxa" w:w="2059"/>
+          </w:tcPr>
+          <w:p>
+            <w:r/>
+            <w:r>
+              <w:t>Geographic Site Management API</w:t>
+            </w:r>
+          </w:p>
+        </w:tc>
+        <w:tc>
+          <w:tcPr>
+            <w:tcW w:type="dxa" w:w="1217"/>
           </w:tcPr>
           <w:p>
             <w:r/>
@@ -2996,7 +2878,7 @@
         </w:tc>
         <w:tc>
           <w:tcPr>
-            <w:tcW w:type="dxa" w:w="1685"/>
+            <w:tcW w:type="dxa" w:w="1498"/>
           </w:tcPr>
           <w:p>
             <w:r/>
@@ -3007,35 +2889,23 @@
         </w:tc>
         <w:tc>
           <w:tcPr>
-            <w:tcW w:type="dxa" w:w="1685"/>
-          </w:tcPr>
-          <w:p>
-            <w:r/>
-            <w:r>
-              <w:t>individual</w:t>
-            </w:r>
-            <w:r>
-              <w:br/>
-            </w:r>
-            <w:r>
-              <w:t>organization</w:t>
-            </w:r>
-          </w:p>
-        </w:tc>
-        <w:tc>
-          <w:tcPr>
-            <w:tcW w:type="dxa" w:w="1217"/>
-          </w:tcPr>
-          <w:p>
-            <w:r/>
-            <w:r>
-              <w:t>GET</w:t>
-            </w:r>
-            <w:r>
-              <w:br/>
-            </w:r>
-            <w:r>
-              <w:t>GET /id</w:t>
+            <w:tcW w:type="dxa" w:w="1498"/>
+          </w:tcPr>
+          <w:p>
+            <w:r/>
+            <w:r>
+              <w:t>geographicSite</w:t>
+            </w:r>
+          </w:p>
+        </w:tc>
+        <w:tc>
+          <w:tcPr>
+            <w:tcW w:type="dxa" w:w="2059"/>
+          </w:tcPr>
+          <w:p>
+            <w:r/>
+            <w:r>
+              <w:t>GET, GET /id</w:t>
             </w:r>
           </w:p>
         </w:tc>
@@ -3048,35 +2918,35 @@
           <w:p>
             <w:r/>
             <w:r>
-              <w:t>TMF637</w:t>
-            </w:r>
-          </w:p>
-        </w:tc>
-        <w:tc>
-          <w:tcPr>
-            <w:tcW w:type="dxa" w:w="2434"/>
-          </w:tcPr>
-          <w:p>
-            <w:r/>
-            <w:r>
-              <w:t>Product Inventory Management API</w:t>
-            </w:r>
-          </w:p>
-        </w:tc>
-        <w:tc>
-          <w:tcPr>
-            <w:tcW w:type="dxa" w:w="1310"/>
-          </w:tcPr>
-          <w:p>
-            <w:r/>
-            <w:r>
-              <w:t>5</w:t>
-            </w:r>
-          </w:p>
-        </w:tc>
-        <w:tc>
-          <w:tcPr>
-            <w:tcW w:type="dxa" w:w="1685"/>
+              <w:t>TMF675</w:t>
+            </w:r>
+          </w:p>
+        </w:tc>
+        <w:tc>
+          <w:tcPr>
+            <w:tcW w:type="dxa" w:w="2059"/>
+          </w:tcPr>
+          <w:p>
+            <w:r/>
+            <w:r>
+              <w:t>UNRESOLVED-TMF675</w:t>
+            </w:r>
+          </w:p>
+        </w:tc>
+        <w:tc>
+          <w:tcPr>
+            <w:tcW w:type="dxa" w:w="1217"/>
+          </w:tcPr>
+          <w:p>
+            <w:r/>
+            <w:r>
+              <w:t>4</w:t>
+            </w:r>
+          </w:p>
+        </w:tc>
+        <w:tc>
+          <w:tcPr>
+            <w:tcW w:type="dxa" w:w="1498"/>
           </w:tcPr>
           <w:p>
             <w:r/>
@@ -3087,47 +2957,23 @@
         </w:tc>
         <w:tc>
           <w:tcPr>
-            <w:tcW w:type="dxa" w:w="1685"/>
-          </w:tcPr>
-          <w:p>
-            <w:r/>
-            <w:r>
-              <w:t>product</w:t>
-            </w:r>
-          </w:p>
-        </w:tc>
-        <w:tc>
-          <w:tcPr>
-            <w:tcW w:type="dxa" w:w="1217"/>
-          </w:tcPr>
-          <w:p>
-            <w:r/>
-            <w:r>
-              <w:t>GET</w:t>
-            </w:r>
-            <w:r>
-              <w:br/>
-            </w:r>
-            <w:r>
-              <w:t>GET /id</w:t>
-            </w:r>
-            <w:r>
-              <w:br/>
-            </w:r>
-            <w:r>
-              <w:t>POST</w:t>
-            </w:r>
-            <w:r>
-              <w:br/>
-            </w:r>
-            <w:r>
-              <w:t>PATCH</w:t>
-            </w:r>
-            <w:r>
-              <w:br/>
-            </w:r>
-            <w:r>
-              <w:t>DELETE</w:t>
+            <w:tcW w:type="dxa" w:w="1498"/>
+          </w:tcPr>
+          <w:p>
+            <w:r/>
+            <w:r>
+              <w:t>geographicLocation</w:t>
+            </w:r>
+          </w:p>
+        </w:tc>
+        <w:tc>
+          <w:tcPr>
+            <w:tcW w:type="dxa" w:w="2059"/>
+          </w:tcPr>
+          <w:p>
+            <w:r/>
+            <w:r>
+              <w:t>GET, GET /id</w:t>
             </w:r>
           </w:p>
         </w:tc>
@@ -3140,35 +2986,35 @@
           <w:p>
             <w:r/>
             <w:r>
-              <w:t>TMF637</w:t>
-            </w:r>
-          </w:p>
-        </w:tc>
-        <w:tc>
-          <w:tcPr>
-            <w:tcW w:type="dxa" w:w="2434"/>
-          </w:tcPr>
-          <w:p>
-            <w:r/>
-            <w:r>
-              <w:t>Product Inventory Management API</w:t>
-            </w:r>
-          </w:p>
-        </w:tc>
-        <w:tc>
-          <w:tcPr>
-            <w:tcW w:type="dxa" w:w="1310"/>
-          </w:tcPr>
-          <w:p>
-            <w:r/>
-            <w:r>
-              <w:t>4</w:t>
-            </w:r>
-          </w:p>
-        </w:tc>
-        <w:tc>
-          <w:tcPr>
-            <w:tcW w:type="dxa" w:w="1685"/>
+              <w:t>TMF666</w:t>
+            </w:r>
+          </w:p>
+        </w:tc>
+        <w:tc>
+          <w:tcPr>
+            <w:tcW w:type="dxa" w:w="2059"/>
+          </w:tcPr>
+          <w:p>
+            <w:r/>
+            <w:r>
+              <w:t>Account Management API</w:t>
+            </w:r>
+          </w:p>
+        </w:tc>
+        <w:tc>
+          <w:tcPr>
+            <w:tcW w:type="dxa" w:w="1217"/>
+          </w:tcPr>
+          <w:p>
+            <w:r/>
+            <w:r>
+              <w:t>5</w:t>
+            </w:r>
+          </w:p>
+        </w:tc>
+        <w:tc>
+          <w:tcPr>
+            <w:tcW w:type="dxa" w:w="1498"/>
           </w:tcPr>
           <w:p>
             <w:r/>
@@ -3179,47 +3025,23 @@
         </w:tc>
         <w:tc>
           <w:tcPr>
-            <w:tcW w:type="dxa" w:w="1685"/>
-          </w:tcPr>
-          <w:p>
-            <w:r/>
-            <w:r>
-              <w:t>product</w:t>
-            </w:r>
-          </w:p>
-        </w:tc>
-        <w:tc>
-          <w:tcPr>
-            <w:tcW w:type="dxa" w:w="1217"/>
-          </w:tcPr>
-          <w:p>
-            <w:r/>
-            <w:r>
-              <w:t>GET</w:t>
-            </w:r>
-            <w:r>
-              <w:br/>
-            </w:r>
-            <w:r>
-              <w:t>GET /id</w:t>
-            </w:r>
-            <w:r>
-              <w:br/>
-            </w:r>
-            <w:r>
-              <w:t>POST</w:t>
-            </w:r>
-            <w:r>
-              <w:br/>
-            </w:r>
-            <w:r>
-              <w:t>PATCH</w:t>
-            </w:r>
-            <w:r>
-              <w:br/>
-            </w:r>
-            <w:r>
-              <w:t>DELETE</w:t>
+            <w:tcW w:type="dxa" w:w="1498"/>
+          </w:tcPr>
+          <w:p>
+            <w:r/>
+            <w:r>
+              <w:t>billingAccount</w:t>
+            </w:r>
+          </w:p>
+        </w:tc>
+        <w:tc>
+          <w:tcPr>
+            <w:tcW w:type="dxa" w:w="2059"/>
+          </w:tcPr>
+          <w:p>
+            <w:r/>
+            <w:r>
+              <w:t>GET, GET /id</w:t>
             </w:r>
           </w:p>
         </w:tc>
@@ -3232,35 +3054,35 @@
           <w:p>
             <w:r/>
             <w:r>
-              <w:t>TMF638</w:t>
-            </w:r>
-          </w:p>
-        </w:tc>
-        <w:tc>
-          <w:tcPr>
-            <w:tcW w:type="dxa" w:w="2434"/>
-          </w:tcPr>
-          <w:p>
-            <w:r/>
-            <w:r>
-              <w:t>Service Inventory Management API</w:t>
-            </w:r>
-          </w:p>
-        </w:tc>
-        <w:tc>
-          <w:tcPr>
-            <w:tcW w:type="dxa" w:w="1310"/>
-          </w:tcPr>
-          <w:p>
-            <w:r/>
-            <w:r>
-              <w:t>5</w:t>
-            </w:r>
-          </w:p>
-        </w:tc>
-        <w:tc>
-          <w:tcPr>
-            <w:tcW w:type="dxa" w:w="1685"/>
+              <w:t>TMF666</w:t>
+            </w:r>
+          </w:p>
+        </w:tc>
+        <w:tc>
+          <w:tcPr>
+            <w:tcW w:type="dxa" w:w="2059"/>
+          </w:tcPr>
+          <w:p>
+            <w:r/>
+            <w:r>
+              <w:t>Account Management API</w:t>
+            </w:r>
+          </w:p>
+        </w:tc>
+        <w:tc>
+          <w:tcPr>
+            <w:tcW w:type="dxa" w:w="1217"/>
+          </w:tcPr>
+          <w:p>
+            <w:r/>
+            <w:r>
+              <w:t>4</w:t>
+            </w:r>
+          </w:p>
+        </w:tc>
+        <w:tc>
+          <w:tcPr>
+            <w:tcW w:type="dxa" w:w="1498"/>
           </w:tcPr>
           <w:p>
             <w:r/>
@@ -3271,29 +3093,23 @@
         </w:tc>
         <w:tc>
           <w:tcPr>
-            <w:tcW w:type="dxa" w:w="1685"/>
-          </w:tcPr>
-          <w:p>
-            <w:r/>
-            <w:r>
-              <w:t>service</w:t>
-            </w:r>
-          </w:p>
-        </w:tc>
-        <w:tc>
-          <w:tcPr>
-            <w:tcW w:type="dxa" w:w="1217"/>
-          </w:tcPr>
-          <w:p>
-            <w:r/>
-            <w:r>
-              <w:t>GET</w:t>
-            </w:r>
-            <w:r>
-              <w:br/>
-            </w:r>
-            <w:r>
-              <w:t>GET /id</w:t>
+            <w:tcW w:type="dxa" w:w="1498"/>
+          </w:tcPr>
+          <w:p>
+            <w:r/>
+            <w:r>
+              <w:t>billingAccount</w:t>
+            </w:r>
+          </w:p>
+        </w:tc>
+        <w:tc>
+          <w:tcPr>
+            <w:tcW w:type="dxa" w:w="2059"/>
+          </w:tcPr>
+          <w:p>
+            <w:r/>
+            <w:r>
+              <w:t>GET, GET /id</w:t>
             </w:r>
           </w:p>
         </w:tc>
@@ -3306,35 +3122,35 @@
           <w:p>
             <w:r/>
             <w:r>
-              <w:t>TMF638</w:t>
-            </w:r>
-          </w:p>
-        </w:tc>
-        <w:tc>
-          <w:tcPr>
-            <w:tcW w:type="dxa" w:w="2434"/>
-          </w:tcPr>
-          <w:p>
-            <w:r/>
-            <w:r>
-              <w:t>Service Inventory Management API</w:t>
-            </w:r>
-          </w:p>
-        </w:tc>
-        <w:tc>
-          <w:tcPr>
-            <w:tcW w:type="dxa" w:w="1310"/>
-          </w:tcPr>
-          <w:p>
-            <w:r/>
-            <w:r>
-              <w:t>4</w:t>
-            </w:r>
-          </w:p>
-        </w:tc>
-        <w:tc>
-          <w:tcPr>
-            <w:tcW w:type="dxa" w:w="1685"/>
+              <w:t>TMF632</w:t>
+            </w:r>
+          </w:p>
+        </w:tc>
+        <w:tc>
+          <w:tcPr>
+            <w:tcW w:type="dxa" w:w="2059"/>
+          </w:tcPr>
+          <w:p>
+            <w:r/>
+            <w:r>
+              <w:t>Party Management API</w:t>
+            </w:r>
+          </w:p>
+        </w:tc>
+        <w:tc>
+          <w:tcPr>
+            <w:tcW w:type="dxa" w:w="1217"/>
+          </w:tcPr>
+          <w:p>
+            <w:r/>
+            <w:r>
+              <w:t>5</w:t>
+            </w:r>
+          </w:p>
+        </w:tc>
+        <w:tc>
+          <w:tcPr>
+            <w:tcW w:type="dxa" w:w="1498"/>
           </w:tcPr>
           <w:p>
             <w:r/>
@@ -3345,29 +3161,23 @@
         </w:tc>
         <w:tc>
           <w:tcPr>
-            <w:tcW w:type="dxa" w:w="1685"/>
-          </w:tcPr>
-          <w:p>
-            <w:r/>
-            <w:r>
-              <w:t>service</w:t>
-            </w:r>
-          </w:p>
-        </w:tc>
-        <w:tc>
-          <w:tcPr>
-            <w:tcW w:type="dxa" w:w="1217"/>
-          </w:tcPr>
-          <w:p>
-            <w:r/>
-            <w:r>
-              <w:t>GET</w:t>
-            </w:r>
-            <w:r>
-              <w:br/>
-            </w:r>
-            <w:r>
-              <w:t>GET /id</w:t>
+            <w:tcW w:type="dxa" w:w="1498"/>
+          </w:tcPr>
+          <w:p>
+            <w:r/>
+            <w:r>
+              <w:t>individual</w:t>
+            </w:r>
+          </w:p>
+        </w:tc>
+        <w:tc>
+          <w:tcPr>
+            <w:tcW w:type="dxa" w:w="2059"/>
+          </w:tcPr>
+          <w:p>
+            <w:r/>
+            <w:r>
+              <w:t>GET, GET /id</w:t>
             </w:r>
           </w:p>
         </w:tc>
@@ -3380,24 +3190,24 @@
           <w:p>
             <w:r/>
             <w:r>
-              <w:t>TMF622</w:t>
-            </w:r>
-          </w:p>
-        </w:tc>
-        <w:tc>
-          <w:tcPr>
-            <w:tcW w:type="dxa" w:w="2434"/>
-          </w:tcPr>
-          <w:p>
-            <w:r/>
-            <w:r>
-              <w:t>Product Ordering Management API</w:t>
-            </w:r>
-          </w:p>
-        </w:tc>
-        <w:tc>
-          <w:tcPr>
-            <w:tcW w:type="dxa" w:w="1310"/>
+              <w:t>TMF632</w:t>
+            </w:r>
+          </w:p>
+        </w:tc>
+        <w:tc>
+          <w:tcPr>
+            <w:tcW w:type="dxa" w:w="2059"/>
+          </w:tcPr>
+          <w:p>
+            <w:r/>
+            <w:r>
+              <w:t>Party Management API</w:t>
+            </w:r>
+          </w:p>
+        </w:tc>
+        <w:tc>
+          <w:tcPr>
+            <w:tcW w:type="dxa" w:w="1217"/>
           </w:tcPr>
           <w:p>
             <w:r/>
@@ -3408,7 +3218,7 @@
         </w:tc>
         <w:tc>
           <w:tcPr>
-            <w:tcW w:type="dxa" w:w="1685"/>
+            <w:tcW w:type="dxa" w:w="1498"/>
           </w:tcPr>
           <w:p>
             <w:r/>
@@ -3419,29 +3229,23 @@
         </w:tc>
         <w:tc>
           <w:tcPr>
-            <w:tcW w:type="dxa" w:w="1685"/>
-          </w:tcPr>
-          <w:p>
-            <w:r/>
-            <w:r>
-              <w:t>productOrder</w:t>
-            </w:r>
-          </w:p>
-        </w:tc>
-        <w:tc>
-          <w:tcPr>
-            <w:tcW w:type="dxa" w:w="1217"/>
-          </w:tcPr>
-          <w:p>
-            <w:r/>
-            <w:r>
-              <w:t>GET</w:t>
-            </w:r>
-            <w:r>
-              <w:br/>
-            </w:r>
-            <w:r>
-              <w:t>GET /id</w:t>
+            <w:tcW w:type="dxa" w:w="1498"/>
+          </w:tcPr>
+          <w:p>
+            <w:r/>
+            <w:r>
+              <w:t>organization</w:t>
+            </w:r>
+          </w:p>
+        </w:tc>
+        <w:tc>
+          <w:tcPr>
+            <w:tcW w:type="dxa" w:w="2059"/>
+          </w:tcPr>
+          <w:p>
+            <w:r/>
+            <w:r>
+              <w:t>GET, GET /id</w:t>
             </w:r>
           </w:p>
         </w:tc>
@@ -3454,13 +3258,421 @@
           <w:p>
             <w:r/>
             <w:r>
+              <w:t>TMF632</w:t>
+            </w:r>
+          </w:p>
+        </w:tc>
+        <w:tc>
+          <w:tcPr>
+            <w:tcW w:type="dxa" w:w="2059"/>
+          </w:tcPr>
+          <w:p>
+            <w:r/>
+            <w:r>
+              <w:t>Party Management API</w:t>
+            </w:r>
+          </w:p>
+        </w:tc>
+        <w:tc>
+          <w:tcPr>
+            <w:tcW w:type="dxa" w:w="1217"/>
+          </w:tcPr>
+          <w:p>
+            <w:r/>
+            <w:r>
+              <w:t>4</w:t>
+            </w:r>
+          </w:p>
+        </w:tc>
+        <w:tc>
+          <w:tcPr>
+            <w:tcW w:type="dxa" w:w="1498"/>
+          </w:tcPr>
+          <w:p>
+            <w:r/>
+            <w:r>
+              <w:t>Optional</w:t>
+            </w:r>
+          </w:p>
+        </w:tc>
+        <w:tc>
+          <w:tcPr>
+            <w:tcW w:type="dxa" w:w="1498"/>
+          </w:tcPr>
+          <w:p>
+            <w:r/>
+            <w:r>
+              <w:t>individual</w:t>
+            </w:r>
+          </w:p>
+        </w:tc>
+        <w:tc>
+          <w:tcPr>
+            <w:tcW w:type="dxa" w:w="2059"/>
+          </w:tcPr>
+          <w:p>
+            <w:r/>
+            <w:r>
+              <w:t>GET, GET /id</w:t>
+            </w:r>
+          </w:p>
+        </w:tc>
+      </w:tr>
+      <w:tr>
+        <w:tc>
+          <w:tcPr>
+            <w:tcW w:type="dxa" w:w="1030"/>
+          </w:tcPr>
+          <w:p>
+            <w:r/>
+            <w:r>
+              <w:t>TMF632</w:t>
+            </w:r>
+          </w:p>
+        </w:tc>
+        <w:tc>
+          <w:tcPr>
+            <w:tcW w:type="dxa" w:w="2059"/>
+          </w:tcPr>
+          <w:p>
+            <w:r/>
+            <w:r>
+              <w:t>Party Management API</w:t>
+            </w:r>
+          </w:p>
+        </w:tc>
+        <w:tc>
+          <w:tcPr>
+            <w:tcW w:type="dxa" w:w="1217"/>
+          </w:tcPr>
+          <w:p>
+            <w:r/>
+            <w:r>
+              <w:t>4</w:t>
+            </w:r>
+          </w:p>
+        </w:tc>
+        <w:tc>
+          <w:tcPr>
+            <w:tcW w:type="dxa" w:w="1498"/>
+          </w:tcPr>
+          <w:p>
+            <w:r/>
+            <w:r>
+              <w:t>Optional</w:t>
+            </w:r>
+          </w:p>
+        </w:tc>
+        <w:tc>
+          <w:tcPr>
+            <w:tcW w:type="dxa" w:w="1498"/>
+          </w:tcPr>
+          <w:p>
+            <w:r/>
+            <w:r>
+              <w:t>organization</w:t>
+            </w:r>
+          </w:p>
+        </w:tc>
+        <w:tc>
+          <w:tcPr>
+            <w:tcW w:type="dxa" w:w="2059"/>
+          </w:tcPr>
+          <w:p>
+            <w:r/>
+            <w:r>
+              <w:t>GET, GET /id</w:t>
+            </w:r>
+          </w:p>
+        </w:tc>
+      </w:tr>
+      <w:tr>
+        <w:tc>
+          <w:tcPr>
+            <w:tcW w:type="dxa" w:w="1030"/>
+          </w:tcPr>
+          <w:p>
+            <w:r/>
+            <w:r>
+              <w:t>TMF637</w:t>
+            </w:r>
+          </w:p>
+        </w:tc>
+        <w:tc>
+          <w:tcPr>
+            <w:tcW w:type="dxa" w:w="2059"/>
+          </w:tcPr>
+          <w:p>
+            <w:r/>
+            <w:r>
+              <w:t>Product Inventory Management API</w:t>
+            </w:r>
+          </w:p>
+        </w:tc>
+        <w:tc>
+          <w:tcPr>
+            <w:tcW w:type="dxa" w:w="1217"/>
+          </w:tcPr>
+          <w:p>
+            <w:r/>
+            <w:r>
+              <w:t>5</w:t>
+            </w:r>
+          </w:p>
+        </w:tc>
+        <w:tc>
+          <w:tcPr>
+            <w:tcW w:type="dxa" w:w="1498"/>
+          </w:tcPr>
+          <w:p>
+            <w:r/>
+            <w:r>
+              <w:t>Optional</w:t>
+            </w:r>
+          </w:p>
+        </w:tc>
+        <w:tc>
+          <w:tcPr>
+            <w:tcW w:type="dxa" w:w="1498"/>
+          </w:tcPr>
+          <w:p>
+            <w:r/>
+            <w:r>
+              <w:t>product</w:t>
+            </w:r>
+          </w:p>
+        </w:tc>
+        <w:tc>
+          <w:tcPr>
+            <w:tcW w:type="dxa" w:w="2059"/>
+          </w:tcPr>
+          <w:p>
+            <w:r/>
+            <w:r>
+              <w:t>GET, GET /id, POST, PATCH, DELETE</w:t>
+            </w:r>
+          </w:p>
+        </w:tc>
+      </w:tr>
+      <w:tr>
+        <w:tc>
+          <w:tcPr>
+            <w:tcW w:type="dxa" w:w="1030"/>
+          </w:tcPr>
+          <w:p>
+            <w:r/>
+            <w:r>
+              <w:t>TMF637</w:t>
+            </w:r>
+          </w:p>
+        </w:tc>
+        <w:tc>
+          <w:tcPr>
+            <w:tcW w:type="dxa" w:w="2059"/>
+          </w:tcPr>
+          <w:p>
+            <w:r/>
+            <w:r>
+              <w:t>Product Inventory Management API</w:t>
+            </w:r>
+          </w:p>
+        </w:tc>
+        <w:tc>
+          <w:tcPr>
+            <w:tcW w:type="dxa" w:w="1217"/>
+          </w:tcPr>
+          <w:p>
+            <w:r/>
+            <w:r>
+              <w:t>4</w:t>
+            </w:r>
+          </w:p>
+        </w:tc>
+        <w:tc>
+          <w:tcPr>
+            <w:tcW w:type="dxa" w:w="1498"/>
+          </w:tcPr>
+          <w:p>
+            <w:r/>
+            <w:r>
+              <w:t>Optional</w:t>
+            </w:r>
+          </w:p>
+        </w:tc>
+        <w:tc>
+          <w:tcPr>
+            <w:tcW w:type="dxa" w:w="1498"/>
+          </w:tcPr>
+          <w:p>
+            <w:r/>
+            <w:r>
+              <w:t>product</w:t>
+            </w:r>
+          </w:p>
+        </w:tc>
+        <w:tc>
+          <w:tcPr>
+            <w:tcW w:type="dxa" w:w="2059"/>
+          </w:tcPr>
+          <w:p>
+            <w:r/>
+            <w:r>
+              <w:t>GET, GET /id, POST, PATCH, DELETE</w:t>
+            </w:r>
+          </w:p>
+        </w:tc>
+      </w:tr>
+      <w:tr>
+        <w:tc>
+          <w:tcPr>
+            <w:tcW w:type="dxa" w:w="1030"/>
+          </w:tcPr>
+          <w:p>
+            <w:r/>
+            <w:r>
+              <w:t>TMF638</w:t>
+            </w:r>
+          </w:p>
+        </w:tc>
+        <w:tc>
+          <w:tcPr>
+            <w:tcW w:type="dxa" w:w="2059"/>
+          </w:tcPr>
+          <w:p>
+            <w:r/>
+            <w:r>
+              <w:t>Service Inventory Management API</w:t>
+            </w:r>
+          </w:p>
+        </w:tc>
+        <w:tc>
+          <w:tcPr>
+            <w:tcW w:type="dxa" w:w="1217"/>
+          </w:tcPr>
+          <w:p>
+            <w:r/>
+            <w:r>
+              <w:t>5</w:t>
+            </w:r>
+          </w:p>
+        </w:tc>
+        <w:tc>
+          <w:tcPr>
+            <w:tcW w:type="dxa" w:w="1498"/>
+          </w:tcPr>
+          <w:p>
+            <w:r/>
+            <w:r>
+              <w:t>Optional</w:t>
+            </w:r>
+          </w:p>
+        </w:tc>
+        <w:tc>
+          <w:tcPr>
+            <w:tcW w:type="dxa" w:w="1498"/>
+          </w:tcPr>
+          <w:p>
+            <w:r/>
+            <w:r>
+              <w:t>service</w:t>
+            </w:r>
+          </w:p>
+        </w:tc>
+        <w:tc>
+          <w:tcPr>
+            <w:tcW w:type="dxa" w:w="2059"/>
+          </w:tcPr>
+          <w:p>
+            <w:r/>
+            <w:r>
+              <w:t>GET, GET /id</w:t>
+            </w:r>
+          </w:p>
+        </w:tc>
+      </w:tr>
+      <w:tr>
+        <w:tc>
+          <w:tcPr>
+            <w:tcW w:type="dxa" w:w="1030"/>
+          </w:tcPr>
+          <w:p>
+            <w:r/>
+            <w:r>
+              <w:t>TMF638</w:t>
+            </w:r>
+          </w:p>
+        </w:tc>
+        <w:tc>
+          <w:tcPr>
+            <w:tcW w:type="dxa" w:w="2059"/>
+          </w:tcPr>
+          <w:p>
+            <w:r/>
+            <w:r>
+              <w:t>Service Inventory Management API</w:t>
+            </w:r>
+          </w:p>
+        </w:tc>
+        <w:tc>
+          <w:tcPr>
+            <w:tcW w:type="dxa" w:w="1217"/>
+          </w:tcPr>
+          <w:p>
+            <w:r/>
+            <w:r>
+              <w:t>4</w:t>
+            </w:r>
+          </w:p>
+        </w:tc>
+        <w:tc>
+          <w:tcPr>
+            <w:tcW w:type="dxa" w:w="1498"/>
+          </w:tcPr>
+          <w:p>
+            <w:r/>
+            <w:r>
+              <w:t>Optional</w:t>
+            </w:r>
+          </w:p>
+        </w:tc>
+        <w:tc>
+          <w:tcPr>
+            <w:tcW w:type="dxa" w:w="1498"/>
+          </w:tcPr>
+          <w:p>
+            <w:r/>
+            <w:r>
+              <w:t>service</w:t>
+            </w:r>
+          </w:p>
+        </w:tc>
+        <w:tc>
+          <w:tcPr>
+            <w:tcW w:type="dxa" w:w="2059"/>
+          </w:tcPr>
+          <w:p>
+            <w:r/>
+            <w:r>
+              <w:t>GET, GET /id</w:t>
+            </w:r>
+          </w:p>
+        </w:tc>
+      </w:tr>
+      <w:tr>
+        <w:tc>
+          <w:tcPr>
+            <w:tcW w:type="dxa" w:w="1030"/>
+          </w:tcPr>
+          <w:p>
+            <w:r/>
+            <w:r>
               <w:t>TMF622</w:t>
             </w:r>
           </w:p>
         </w:tc>
         <w:tc>
           <w:tcPr>
-            <w:tcW w:type="dxa" w:w="2434"/>
+            <w:tcW w:type="dxa" w:w="2059"/>
           </w:tcPr>
           <w:p>
             <w:r/>
@@ -3471,7 +3683,75 @@
         </w:tc>
         <w:tc>
           <w:tcPr>
-            <w:tcW w:type="dxa" w:w="1310"/>
+            <w:tcW w:type="dxa" w:w="1217"/>
+          </w:tcPr>
+          <w:p>
+            <w:r/>
+            <w:r>
+              <w:t>5</w:t>
+            </w:r>
+          </w:p>
+        </w:tc>
+        <w:tc>
+          <w:tcPr>
+            <w:tcW w:type="dxa" w:w="1498"/>
+          </w:tcPr>
+          <w:p>
+            <w:r/>
+            <w:r>
+              <w:t>Optional</w:t>
+            </w:r>
+          </w:p>
+        </w:tc>
+        <w:tc>
+          <w:tcPr>
+            <w:tcW w:type="dxa" w:w="1498"/>
+          </w:tcPr>
+          <w:p>
+            <w:r/>
+            <w:r>
+              <w:t>productOrder</w:t>
+            </w:r>
+          </w:p>
+        </w:tc>
+        <w:tc>
+          <w:tcPr>
+            <w:tcW w:type="dxa" w:w="2059"/>
+          </w:tcPr>
+          <w:p>
+            <w:r/>
+            <w:r>
+              <w:t>GET, GET /id</w:t>
+            </w:r>
+          </w:p>
+        </w:tc>
+      </w:tr>
+      <w:tr>
+        <w:tc>
+          <w:tcPr>
+            <w:tcW w:type="dxa" w:w="1030"/>
+          </w:tcPr>
+          <w:p>
+            <w:r/>
+            <w:r>
+              <w:t>TMF622</w:t>
+            </w:r>
+          </w:p>
+        </w:tc>
+        <w:tc>
+          <w:tcPr>
+            <w:tcW w:type="dxa" w:w="2059"/>
+          </w:tcPr>
+          <w:p>
+            <w:r/>
+            <w:r>
+              <w:t>Product Ordering Management API</w:t>
+            </w:r>
+          </w:p>
+        </w:tc>
+        <w:tc>
+          <w:tcPr>
+            <w:tcW w:type="dxa" w:w="1217"/>
           </w:tcPr>
           <w:p>
             <w:r/>
@@ -3482,7 +3762,7 @@
         </w:tc>
         <w:tc>
           <w:tcPr>
-            <w:tcW w:type="dxa" w:w="1685"/>
+            <w:tcW w:type="dxa" w:w="1498"/>
           </w:tcPr>
           <w:p>
             <w:r/>
@@ -3493,7 +3773,7 @@
         </w:tc>
         <w:tc>
           <w:tcPr>
-            <w:tcW w:type="dxa" w:w="1685"/>
+            <w:tcW w:type="dxa" w:w="1498"/>
           </w:tcPr>
           <w:p>
             <w:r/>
@@ -3504,18 +3784,12 @@
         </w:tc>
         <w:tc>
           <w:tcPr>
-            <w:tcW w:type="dxa" w:w="1217"/>
-          </w:tcPr>
-          <w:p>
-            <w:r/>
-            <w:r>
-              <w:t>GET</w:t>
-            </w:r>
-            <w:r>
-              <w:br/>
-            </w:r>
-            <w:r>
-              <w:t>GET /id</w:t>
+            <w:tcW w:type="dxa" w:w="2059"/>
+          </w:tcPr>
+          <w:p>
+            <w:r/>
+            <w:r>
+              <w:t>GET, GET /id</w:t>
             </w:r>
           </w:p>
         </w:tc>
@@ -3526,7 +3800,7 @@
       <w:r>
         <w:drawing>
           <wp:inline xmlns:a="http://schemas.openxmlformats.org/drawingml/2006/main" xmlns:pic="http://schemas.openxmlformats.org/drawingml/2006/picture">
-            <wp:extent cx="5394960" cy="7510796"/>
+            <wp:extent cx="5394960" cy="7528441"/>
             <wp:docPr id="4" name="Picture 4"/>
             <wp:cNvGraphicFramePr>
               <a:graphicFrameLocks noChangeAspect="1"/>
@@ -3547,7 +3821,7 @@
                   <pic:spPr>
                     <a:xfrm>
                       <a:off x="0" y="0"/>
-                      <a:ext cx="5394960" cy="7510796"/>
+                      <a:ext cx="5394960" cy="7528441"/>
                     </a:xfrm>
                     <a:prstGeom prst="rect"/>
                   </pic:spPr>
@@ -3732,7 +4006,7 @@
           <w:p>
             <w:r/>
             <w:r>
-              <w:t>Process Flow Management API</w:t>
+              <w:t>UNRESOLVED-TMF701</w:t>
             </w:r>
           </w:p>
         </w:tc>
@@ -4228,7 +4502,7 @@
           <w:p>
             <w:r/>
             <w:r>
-              <w:t>Geographic Location Management API</w:t>
+              <w:t>UNRESOLVED-TMF675</w:t>
             </w:r>
           </w:p>
         </w:tc>

</xml_diff>

<commit_message>
Reorder eTOM/SID/FF sections, restore per-resource API tables, reformat 2.2/2.4 headers (#37)
- Move "eTOM L2 - SID ABEs links" to 2.1 (was 2.3); eTOM business activities and SID ABEs
  shift to 2.2/2.3. Functional Framework Functions stays 2.4.
- 3.2/3.3 API tables: back to one row per resource (comma-joined operations), not one row
  per API-version with <br>-joined resources. Events (3.4) keep the one-row-per-API <br> format.
- 2.4: Aggregate Function Level 1/2 columns moved before Function Description.
- 2.2 (now 2.3) SID ABEs: "SID ABE L1 Definition" moved immediately after "SID ABE L1";
  headers shortened from "Level n" to "L n".

Co-authored-by: Claude Sonnet 5 <noreply@anthropic.com>
</commit_message>
<xml_diff>
--- a/specifications/TMFC005-ProductInventory/Diagrams/TMFC005_Product_Inventory.docx
+++ b/specifications/TMFC005-ProductInventory/Diagrams/TMFC005_Product_Inventory.docx
@@ -210,566 +210,6 @@
         <w:t>eTOM Processes, SID Data Entities and Functional Framework Functions</w:t>
       </w:r>
     </w:p>
-    <w:p>
-      <w:pPr>
-        <w:pStyle w:val="Heading2"/>
-      </w:pPr>
-      <w:r>
-        <w:t>eTOM business activities</w:t>
-      </w:r>
-    </w:p>
-    <w:p>
-      <w:r>
-        <w:t>eTOM business activities this ODA Component is responsible for:</w:t>
-      </w:r>
-    </w:p>
-    <w:tbl>
-      <w:tblPr>
-        <w:tblStyle w:val="ScrollTableNormal"/>
-        <w:tblW w:type="auto" w:w="0"/>
-        <w:tblLayout w:type="autofit"/>
-        <w:tblLook w:val="04A0" w:firstRow="1" w:lastRow="0" w:firstColumn="0" w:lastColumn="0" w:noHBand="0" w:noVBand="1"/>
-        <w:tblBorders>
-          <w:top w:val="single" w:sz="4" w:space="0" w:color="999999"/>
-          <w:left w:val="single" w:sz="4" w:space="0" w:color="999999"/>
-          <w:bottom w:val="single" w:sz="4" w:space="0" w:color="999999"/>
-          <w:right w:val="single" w:sz="4" w:space="0" w:color="999999"/>
-          <w:insideH w:val="single" w:sz="4" w:space="0" w:color="999999"/>
-          <w:insideV w:val="single" w:sz="4" w:space="0" w:color="999999"/>
-        </w:tblBorders>
-      </w:tblPr>
-      <w:tblGrid>
-        <w:gridCol w:w="2124"/>
-        <w:gridCol w:w="2124"/>
-        <w:gridCol w:w="2124"/>
-        <w:gridCol w:w="2124"/>
-      </w:tblGrid>
-      <w:tr>
-        <w:trPr>
-          <w:tblHeader/>
-        </w:trPr>
-        <w:tc>
-          <w:tcPr>
-            <w:tcW w:type="dxa" w:w="1404"/>
-          </w:tcPr>
-          <w:p>
-            <w:r/>
-            <w:r>
-              <w:rPr>
-                <w:b/>
-              </w:rPr>
-              <w:t>Identifier</w:t>
-            </w:r>
-          </w:p>
-        </w:tc>
-        <w:tc>
-          <w:tcPr>
-            <w:tcW w:type="dxa" w:w="1123"/>
-          </w:tcPr>
-          <w:p>
-            <w:r/>
-            <w:r>
-              <w:rPr>
-                <w:b/>
-              </w:rPr>
-              <w:t>Level</w:t>
-            </w:r>
-          </w:p>
-        </w:tc>
-        <w:tc>
-          <w:tcPr>
-            <w:tcW w:type="dxa" w:w="3463"/>
-          </w:tcPr>
-          <w:p>
-            <w:r/>
-            <w:r>
-              <w:rPr>
-                <w:b/>
-              </w:rPr>
-              <w:t>Business Activity Name</w:t>
-            </w:r>
-          </w:p>
-        </w:tc>
-        <w:tc>
-          <w:tcPr>
-            <w:tcW w:type="dxa" w:w="3370"/>
-          </w:tcPr>
-          <w:p>
-            <w:r/>
-            <w:r>
-              <w:rPr>
-                <w:b/>
-              </w:rPr>
-              <w:t>Description</w:t>
-            </w:r>
-          </w:p>
-        </w:tc>
-      </w:tr>
-      <w:tr>
-        <w:tc>
-          <w:tcPr>
-            <w:tcW w:type="dxa" w:w="1404"/>
-          </w:tcPr>
-          <w:p>
-            <w:r/>
-            <w:r>
-              <w:t>1.2.11</w:t>
-            </w:r>
-          </w:p>
-        </w:tc>
-        <w:tc>
-          <w:tcPr>
-            <w:tcW w:type="dxa" w:w="1123"/>
-          </w:tcPr>
-          <w:p>
-            <w:r/>
-            <w:r>
-              <w:t>L2</w:t>
-            </w:r>
-          </w:p>
-        </w:tc>
-        <w:tc>
-          <w:tcPr>
-            <w:tcW w:type="dxa" w:w="3463"/>
-          </w:tcPr>
-          <w:p>
-            <w:r/>
-            <w:r>
-              <w:t>Product Inventory Management</w:t>
-            </w:r>
-          </w:p>
-        </w:tc>
-        <w:tc>
-          <w:tcPr>
-            <w:tcW w:type="dxa" w:w="3370"/>
-          </w:tcPr>
-          <w:p>
-            <w:r/>
-            <w:r>
-              <w:t>Product Inventory Management is responsible to establish, manage and administer the enterprise's product inventory, as embodied in the Product Inventory repository, and monitor and report on the usage and access to the product inventory.</w:t>
-            </w:r>
-          </w:p>
-        </w:tc>
-      </w:tr>
-      <w:tr>
-        <w:tc>
-          <w:tcPr>
-            <w:tcW w:type="dxa" w:w="1404"/>
-          </w:tcPr>
-          <w:p>
-            <w:r/>
-            <w:r>
-              <w:t>1.1.19</w:t>
-            </w:r>
-          </w:p>
-        </w:tc>
-        <w:tc>
-          <w:tcPr>
-            <w:tcW w:type="dxa" w:w="1123"/>
-          </w:tcPr>
-          <w:p>
-            <w:r/>
-            <w:r>
-              <w:t>L2</w:t>
-            </w:r>
-          </w:p>
-        </w:tc>
-        <w:tc>
-          <w:tcPr>
-            <w:tcW w:type="dxa" w:w="3463"/>
-          </w:tcPr>
-          <w:p>
-            <w:r/>
-            <w:r>
-              <w:t>Loyalty Program Management</w:t>
-            </w:r>
-          </w:p>
-        </w:tc>
-        <w:tc>
-          <w:tcPr>
-            <w:tcW w:type="dxa" w:w="3370"/>
-          </w:tcPr>
-          <w:p>
-            <w:r/>
-            <w:r>
-              <w:t>Define all aspects of a loyalty program, such as requirements and objectives of a loyalty program, determine the benefits to participants. Develop a program, prototype it, test it, rollout/launch it, amend and evaluate it, and terminate it when it is no longer viable for an enterprise.</w:t>
-            </w:r>
-          </w:p>
-        </w:tc>
-      </w:tr>
-      <w:tr>
-        <w:tc>
-          <w:tcPr>
-            <w:tcW w:type="dxa" w:w="1404"/>
-          </w:tcPr>
-          <w:p>
-            <w:r/>
-            <w:r>
-              <w:t>1.1.19.2</w:t>
-            </w:r>
-          </w:p>
-        </w:tc>
-        <w:tc>
-          <w:tcPr>
-            <w:tcW w:type="dxa" w:w="1123"/>
-          </w:tcPr>
-          <w:p>
-            <w:r/>
-            <w:r>
-              <w:t>L3</w:t>
-            </w:r>
-          </w:p>
-        </w:tc>
-        <w:tc>
-          <w:tcPr>
-            <w:tcW w:type="dxa" w:w="3463"/>
-          </w:tcPr>
-          <w:p>
-            <w:r/>
-            <w:r>
-              <w:t>Loyalty Program Operation</w:t>
-            </w:r>
-          </w:p>
-        </w:tc>
-        <w:tc>
-          <w:tcPr>
-            <w:tcW w:type="dxa" w:w="3370"/>
-          </w:tcPr>
-          <w:p>
-            <w:r/>
-            <w:r>
-              <w:t>Manage all operational aspects of running a loyalty program. Enable parties to become a members of a program, earn currency and rewards, and redeem currency. Manage a loyalty program account, leave a program, and provide operational reports.</w:t>
-            </w:r>
-          </w:p>
-        </w:tc>
-      </w:tr>
-      <w:tr>
-        <w:tc>
-          <w:tcPr>
-            <w:tcW w:type="dxa" w:w="1404"/>
-          </w:tcPr>
-          <w:p>
-            <w:r/>
-            <w:r>
-              <w:t>1.1.19.2.5</w:t>
-            </w:r>
-          </w:p>
-        </w:tc>
-        <w:tc>
-          <w:tcPr>
-            <w:tcW w:type="dxa" w:w="1123"/>
-          </w:tcPr>
-          <w:p>
-            <w:r/>
-            <w:r>
-              <w:t>L4</w:t>
-            </w:r>
-          </w:p>
-        </w:tc>
-        <w:tc>
-          <w:tcPr>
-            <w:tcW w:type="dxa" w:w="3463"/>
-          </w:tcPr>
-          <w:p>
-            <w:r/>
-            <w:r>
-              <w:t>Manage Loyalty Program Account</w:t>
-            </w:r>
-          </w:p>
-        </w:tc>
-        <w:tc>
-          <w:tcPr>
-            <w:tcW w:type="dxa" w:w="3370"/>
-          </w:tcPr>
-          <w:p>
-            <w:r/>
-            <w:r>
-              <w:t>Update a loyalty program account and make changes to loyalty program participant information. Expire, reinstate, transfer in/out, adjust, a loyalty participant's account currency. Prepare and send a loyalty program communication to a participant or for internal use by an enterprise.</w:t>
-            </w:r>
-          </w:p>
-        </w:tc>
-      </w:tr>
-      <w:tr>
-        <w:tc>
-          <w:tcPr>
-            <w:tcW w:type="dxa" w:w="1404"/>
-          </w:tcPr>
-          <w:p>
-            <w:r/>
-            <w:r>
-              <w:t>1.1.19.2.7</w:t>
-            </w:r>
-          </w:p>
-        </w:tc>
-        <w:tc>
-          <w:tcPr>
-            <w:tcW w:type="dxa" w:w="1123"/>
-          </w:tcPr>
-          <w:p>
-            <w:r/>
-            <w:r>
-              <w:t>L4</w:t>
-            </w:r>
-          </w:p>
-        </w:tc>
-        <w:tc>
-          <w:tcPr>
-            <w:tcW w:type="dxa" w:w="3463"/>
-          </w:tcPr>
-          <w:p>
-            <w:r/>
-            <w:r>
-              <w:t>Provide Loyalty Program Operation Report</w:t>
-            </w:r>
-          </w:p>
-        </w:tc>
-        <w:tc>
-          <w:tcPr>
-            <w:tcW w:type="dxa" w:w="3370"/>
-          </w:tcPr>
-          <w:p>
-            <w:r/>
-            <w:r>
-              <w:t>Generate a loyalty program operation report, such as various loyalty program status reports, trend analysis, and reports that identify suspected abuse of a loyalty program.</w:t>
-            </w:r>
-          </w:p>
-        </w:tc>
-      </w:tr>
-    </w:tbl>
-    <w:p/>
-    <w:p>
-      <w:pPr>
-        <w:pStyle w:val="Heading2"/>
-      </w:pPr>
-      <w:r>
-        <w:t>SID ABEs</w:t>
-      </w:r>
-    </w:p>
-    <w:p>
-      <w:r>
-        <w:t>SID ABEs this ODA Component is responsible for:</w:t>
-      </w:r>
-    </w:p>
-    <w:tbl>
-      <w:tblPr>
-        <w:tblStyle w:val="ScrollTableNormal"/>
-        <w:tblW w:type="auto" w:w="0"/>
-        <w:tblLayout w:type="autofit"/>
-        <w:tblLook w:val="04A0" w:firstRow="1" w:lastRow="0" w:firstColumn="0" w:lastColumn="0" w:noHBand="0" w:noVBand="1"/>
-        <w:tblBorders>
-          <w:top w:val="single" w:sz="4" w:space="0" w:color="999999"/>
-          <w:left w:val="single" w:sz="4" w:space="0" w:color="999999"/>
-          <w:bottom w:val="single" w:sz="4" w:space="0" w:color="999999"/>
-          <w:right w:val="single" w:sz="4" w:space="0" w:color="999999"/>
-          <w:insideH w:val="single" w:sz="4" w:space="0" w:color="999999"/>
-          <w:insideV w:val="single" w:sz="4" w:space="0" w:color="999999"/>
-        </w:tblBorders>
-      </w:tblPr>
-      <w:tblGrid>
-        <w:gridCol w:w="2124"/>
-        <w:gridCol w:w="2124"/>
-        <w:gridCol w:w="2124"/>
-        <w:gridCol w:w="2124"/>
-      </w:tblGrid>
-      <w:tr>
-        <w:trPr>
-          <w:tblHeader/>
-        </w:trPr>
-        <w:tc>
-          <w:tcPr>
-            <w:tcW w:type="dxa" w:w="2059"/>
-          </w:tcPr>
-          <w:p>
-            <w:r/>
-            <w:r>
-              <w:rPr>
-                <w:b/>
-              </w:rPr>
-              <w:t>SID ABE Level 1</w:t>
-            </w:r>
-          </w:p>
-        </w:tc>
-        <w:tc>
-          <w:tcPr>
-            <w:tcW w:type="dxa" w:w="2153"/>
-          </w:tcPr>
-          <w:p>
-            <w:r/>
-            <w:r>
-              <w:rPr>
-                <w:b/>
-              </w:rPr>
-              <w:t>SID ABE Level 2 (or set of BEs)</w:t>
-            </w:r>
-          </w:p>
-        </w:tc>
-        <w:tc>
-          <w:tcPr>
-            <w:tcW w:type="dxa" w:w="2527"/>
-          </w:tcPr>
-          <w:p>
-            <w:r/>
-            <w:r>
-              <w:rPr>
-                <w:b/>
-              </w:rPr>
-              <w:t>SID ABE L1 Definition</w:t>
-            </w:r>
-          </w:p>
-        </w:tc>
-        <w:tc>
-          <w:tcPr>
-            <w:tcW w:type="dxa" w:w="2621"/>
-          </w:tcPr>
-          <w:p>
-            <w:r/>
-            <w:r>
-              <w:rPr>
-                <w:b/>
-              </w:rPr>
-              <w:t>SID ABE L2 Definition</w:t>
-            </w:r>
-          </w:p>
-        </w:tc>
-      </w:tr>
-      <w:tr>
-        <w:tc>
-          <w:tcPr>
-            <w:tcW w:type="dxa" w:w="2059"/>
-          </w:tcPr>
-          <w:p>
-            <w:r/>
-            <w:r>
-              <w:t>Product and Offering Instance</w:t>
-            </w:r>
-          </w:p>
-        </w:tc>
-        <w:tc>
-          <w:tcPr>
-            <w:tcW w:type="dxa" w:w="2153"/>
-          </w:tcPr>
-          <w:p>
-            <w:r/>
-            <w:r>
-              <w:t>Product</w:t>
-            </w:r>
-          </w:p>
-        </w:tc>
-        <w:tc>
-          <w:tcPr>
-            <w:tcW w:type="dxa" w:w="2527"/>
-          </w:tcPr>
-          <w:p>
-            <w:r/>
-            <w:r>
-              <w:t>Product and ProductOfferingInstance represent, in the product inventory, respectively an instance of a ProductSpecification and ProductOfferindSpecification subscribed or not yet subscribed to by a Customer from the CSP or by the CSP from a BusinessPartner. The Product carries the place where the product is in use, as well as configuration characteristics, such as assigned telephone numbers and internet addresses. The Product and Offering Instance ABE also tracks the links to services and/or resources through which the Product is realized as well as the applied tariff and commitment duration related to the ProductOfferingInstance.</w:t>
-            </w:r>
-          </w:p>
-        </w:tc>
-        <w:tc>
-          <w:tcPr>
-            <w:tcW w:type="dxa" w:w="2621"/>
-          </w:tcPr>
-          <w:p>
-            <w:r/>
-            <w:r>
-              <w:t>Represents an instance in the product inventory of a ProductSpecification subscribed or not yet subscribed by a Customer to the CSP or by the CSP to a BusinessParnter, the place where the product is in use, as well as configuration characteristics, such as assigned telephone numbers and internet addresses. It may come from a CustomerProductOrderItem or a BusinessPartnerOrderItem. At one time, it might be contained in a unique ProductOfferingInstance. The Product ABE also tracks the links to services and/or resources through which the product is realized. The Product ABE also contains detailed concerning Network Products and Usage Volume Products as well as other examples of Products.</w:t>
-            </w:r>
-          </w:p>
-        </w:tc>
-      </w:tr>
-      <w:tr>
-        <w:tc>
-          <w:tcPr>
-            <w:tcW w:type="dxa" w:w="2059"/>
-          </w:tcPr>
-          <w:p>
-            <w:r/>
-            <w:r>
-              <w:t>Product and Offering Instance</w:t>
-            </w:r>
-          </w:p>
-        </w:tc>
-        <w:tc>
-          <w:tcPr>
-            <w:tcW w:type="dxa" w:w="2153"/>
-          </w:tcPr>
-          <w:p>
-            <w:r/>
-            <w:r/>
-          </w:p>
-        </w:tc>
-        <w:tc>
-          <w:tcPr>
-            <w:tcW w:type="dxa" w:w="2527"/>
-          </w:tcPr>
-          <w:p>
-            <w:r/>
-            <w:r>
-              <w:t>Product and ProductOfferingInstance represent, in the product inventory, respectively an instance of a ProductSpecification and ProductOfferindSpecification subscribed or not yet subscribed to by a Customer from the CSP or by the CSP from a BusinessPartner. The Product carries the place where the product is in use, as well as configuration characteristics, such as assigned telephone numbers and internet addresses. The Product and Offering Instance ABE also tracks the links to services and/or resources through which the Product is realized as well as the applied tariff and commitment duration related to the ProductOfferingInstance.</w:t>
-            </w:r>
-          </w:p>
-        </w:tc>
-        <w:tc>
-          <w:tcPr>
-            <w:tcW w:type="dxa" w:w="2621"/>
-          </w:tcPr>
-          <w:p>
-            <w:r/>
-            <w:r>
-              <w:t>*(no description available)*</w:t>
-            </w:r>
-          </w:p>
-        </w:tc>
-      </w:tr>
-      <w:tr>
-        <w:tc>
-          <w:tcPr>
-            <w:tcW w:type="dxa" w:w="2059"/>
-          </w:tcPr>
-          <w:p>
-            <w:r/>
-            <w:r>
-              <w:t>Loyalty</w:t>
-            </w:r>
-          </w:p>
-        </w:tc>
-        <w:tc>
-          <w:tcPr>
-            <w:tcW w:type="dxa" w:w="2153"/>
-          </w:tcPr>
-          <w:p>
-            <w:r/>
-            <w:r>
-              <w:t>Loyalty Program</w:t>
-            </w:r>
-          </w:p>
-        </w:tc>
-        <w:tc>
-          <w:tcPr>
-            <w:tcW w:type="dxa" w:w="2527"/>
-          </w:tcPr>
-          <w:p>
-            <w:r/>
-            <w:r>
-              <w:t>A loyalty program is one of the tools used by the loyalty process to retain customers. The Loyalty ABE contains all entities useful to specify and instantiate loyalty programs. A LoyaltyProgramProdSpec defines the LoyaltyRules that have to be checked in order to identify the actions to apply. Depending on the type of LoyaltyRules a LoyaltyAccount might be needed to collect gains or not. A LoyaltyProgramProduct is a type of ProductComponent and described by a LoyaltyProgramProdSpec.</w:t>
-            </w:r>
-          </w:p>
-        </w:tc>
-        <w:tc>
-          <w:tcPr>
-            <w:tcW w:type="dxa" w:w="2621"/>
-          </w:tcPr>
-          <w:p>
-            <w:r/>
-            <w:r>
-              <w:t>The Loyalty Program ABE contains all entities needed to instantiate a loyalty program for a specific customer such as LoyaltyProgram and LoyaltyAccount.</w:t>
-            </w:r>
-          </w:p>
-        </w:tc>
-      </w:tr>
-    </w:tbl>
-    <w:p/>
     <w:p>
       <w:pPr>
         <w:pStyle w:val="Heading2"/>
@@ -827,6 +267,566 @@
         <w:pStyle w:val="Heading2"/>
       </w:pPr>
       <w:r>
+        <w:t>eTOM business activities</w:t>
+      </w:r>
+    </w:p>
+    <w:p>
+      <w:r>
+        <w:t>eTOM business activities this ODA Component is responsible for:</w:t>
+      </w:r>
+    </w:p>
+    <w:tbl>
+      <w:tblPr>
+        <w:tblStyle w:val="ScrollTableNormal"/>
+        <w:tblW w:type="auto" w:w="0"/>
+        <w:tblLayout w:type="autofit"/>
+        <w:tblLook w:val="04A0" w:firstRow="1" w:lastRow="0" w:firstColumn="0" w:lastColumn="0" w:noHBand="0" w:noVBand="1"/>
+        <w:tblBorders>
+          <w:top w:val="single" w:sz="4" w:space="0" w:color="999999"/>
+          <w:left w:val="single" w:sz="4" w:space="0" w:color="999999"/>
+          <w:bottom w:val="single" w:sz="4" w:space="0" w:color="999999"/>
+          <w:right w:val="single" w:sz="4" w:space="0" w:color="999999"/>
+          <w:insideH w:val="single" w:sz="4" w:space="0" w:color="999999"/>
+          <w:insideV w:val="single" w:sz="4" w:space="0" w:color="999999"/>
+        </w:tblBorders>
+      </w:tblPr>
+      <w:tblGrid>
+        <w:gridCol w:w="2124"/>
+        <w:gridCol w:w="2124"/>
+        <w:gridCol w:w="2124"/>
+        <w:gridCol w:w="2124"/>
+      </w:tblGrid>
+      <w:tr>
+        <w:trPr>
+          <w:tblHeader/>
+        </w:trPr>
+        <w:tc>
+          <w:tcPr>
+            <w:tcW w:type="dxa" w:w="1404"/>
+          </w:tcPr>
+          <w:p>
+            <w:r/>
+            <w:r>
+              <w:rPr>
+                <w:b/>
+              </w:rPr>
+              <w:t>Identifier</w:t>
+            </w:r>
+          </w:p>
+        </w:tc>
+        <w:tc>
+          <w:tcPr>
+            <w:tcW w:type="dxa" w:w="1123"/>
+          </w:tcPr>
+          <w:p>
+            <w:r/>
+            <w:r>
+              <w:rPr>
+                <w:b/>
+              </w:rPr>
+              <w:t>Level</w:t>
+            </w:r>
+          </w:p>
+        </w:tc>
+        <w:tc>
+          <w:tcPr>
+            <w:tcW w:type="dxa" w:w="3463"/>
+          </w:tcPr>
+          <w:p>
+            <w:r/>
+            <w:r>
+              <w:rPr>
+                <w:b/>
+              </w:rPr>
+              <w:t>Business Activity Name</w:t>
+            </w:r>
+          </w:p>
+        </w:tc>
+        <w:tc>
+          <w:tcPr>
+            <w:tcW w:type="dxa" w:w="3370"/>
+          </w:tcPr>
+          <w:p>
+            <w:r/>
+            <w:r>
+              <w:rPr>
+                <w:b/>
+              </w:rPr>
+              <w:t>Description</w:t>
+            </w:r>
+          </w:p>
+        </w:tc>
+      </w:tr>
+      <w:tr>
+        <w:tc>
+          <w:tcPr>
+            <w:tcW w:type="dxa" w:w="1404"/>
+          </w:tcPr>
+          <w:p>
+            <w:r/>
+            <w:r>
+              <w:t>1.2.11</w:t>
+            </w:r>
+          </w:p>
+        </w:tc>
+        <w:tc>
+          <w:tcPr>
+            <w:tcW w:type="dxa" w:w="1123"/>
+          </w:tcPr>
+          <w:p>
+            <w:r/>
+            <w:r>
+              <w:t>L2</w:t>
+            </w:r>
+          </w:p>
+        </w:tc>
+        <w:tc>
+          <w:tcPr>
+            <w:tcW w:type="dxa" w:w="3463"/>
+          </w:tcPr>
+          <w:p>
+            <w:r/>
+            <w:r>
+              <w:t>Product Inventory Management</w:t>
+            </w:r>
+          </w:p>
+        </w:tc>
+        <w:tc>
+          <w:tcPr>
+            <w:tcW w:type="dxa" w:w="3370"/>
+          </w:tcPr>
+          <w:p>
+            <w:r/>
+            <w:r>
+              <w:t>Product Inventory Management is responsible to establish, manage and administer the enterprise's product inventory, as embodied in the Product Inventory repository, and monitor and report on the usage and access to the product inventory.</w:t>
+            </w:r>
+          </w:p>
+        </w:tc>
+      </w:tr>
+      <w:tr>
+        <w:tc>
+          <w:tcPr>
+            <w:tcW w:type="dxa" w:w="1404"/>
+          </w:tcPr>
+          <w:p>
+            <w:r/>
+            <w:r>
+              <w:t>1.1.19</w:t>
+            </w:r>
+          </w:p>
+        </w:tc>
+        <w:tc>
+          <w:tcPr>
+            <w:tcW w:type="dxa" w:w="1123"/>
+          </w:tcPr>
+          <w:p>
+            <w:r/>
+            <w:r>
+              <w:t>L2</w:t>
+            </w:r>
+          </w:p>
+        </w:tc>
+        <w:tc>
+          <w:tcPr>
+            <w:tcW w:type="dxa" w:w="3463"/>
+          </w:tcPr>
+          <w:p>
+            <w:r/>
+            <w:r>
+              <w:t>Loyalty Program Management</w:t>
+            </w:r>
+          </w:p>
+        </w:tc>
+        <w:tc>
+          <w:tcPr>
+            <w:tcW w:type="dxa" w:w="3370"/>
+          </w:tcPr>
+          <w:p>
+            <w:r/>
+            <w:r>
+              <w:t>Define all aspects of a loyalty program, such as requirements and objectives of a loyalty program, determine the benefits to participants. Develop a program, prototype it, test it, rollout/launch it, amend and evaluate it, and terminate it when it is no longer viable for an enterprise.</w:t>
+            </w:r>
+          </w:p>
+        </w:tc>
+      </w:tr>
+      <w:tr>
+        <w:tc>
+          <w:tcPr>
+            <w:tcW w:type="dxa" w:w="1404"/>
+          </w:tcPr>
+          <w:p>
+            <w:r/>
+            <w:r>
+              <w:t>1.1.19.2</w:t>
+            </w:r>
+          </w:p>
+        </w:tc>
+        <w:tc>
+          <w:tcPr>
+            <w:tcW w:type="dxa" w:w="1123"/>
+          </w:tcPr>
+          <w:p>
+            <w:r/>
+            <w:r>
+              <w:t>L3</w:t>
+            </w:r>
+          </w:p>
+        </w:tc>
+        <w:tc>
+          <w:tcPr>
+            <w:tcW w:type="dxa" w:w="3463"/>
+          </w:tcPr>
+          <w:p>
+            <w:r/>
+            <w:r>
+              <w:t>Loyalty Program Operation</w:t>
+            </w:r>
+          </w:p>
+        </w:tc>
+        <w:tc>
+          <w:tcPr>
+            <w:tcW w:type="dxa" w:w="3370"/>
+          </w:tcPr>
+          <w:p>
+            <w:r/>
+            <w:r>
+              <w:t>Manage all operational aspects of running a loyalty program. Enable parties to become a members of a program, earn currency and rewards, and redeem currency. Manage a loyalty program account, leave a program, and provide operational reports.</w:t>
+            </w:r>
+          </w:p>
+        </w:tc>
+      </w:tr>
+      <w:tr>
+        <w:tc>
+          <w:tcPr>
+            <w:tcW w:type="dxa" w:w="1404"/>
+          </w:tcPr>
+          <w:p>
+            <w:r/>
+            <w:r>
+              <w:t>1.1.19.2.5</w:t>
+            </w:r>
+          </w:p>
+        </w:tc>
+        <w:tc>
+          <w:tcPr>
+            <w:tcW w:type="dxa" w:w="1123"/>
+          </w:tcPr>
+          <w:p>
+            <w:r/>
+            <w:r>
+              <w:t>L4</w:t>
+            </w:r>
+          </w:p>
+        </w:tc>
+        <w:tc>
+          <w:tcPr>
+            <w:tcW w:type="dxa" w:w="3463"/>
+          </w:tcPr>
+          <w:p>
+            <w:r/>
+            <w:r>
+              <w:t>Manage Loyalty Program Account</w:t>
+            </w:r>
+          </w:p>
+        </w:tc>
+        <w:tc>
+          <w:tcPr>
+            <w:tcW w:type="dxa" w:w="3370"/>
+          </w:tcPr>
+          <w:p>
+            <w:r/>
+            <w:r>
+              <w:t>Update a loyalty program account and make changes to loyalty program participant information. Expire, reinstate, transfer in/out, adjust, a loyalty participant's account currency. Prepare and send a loyalty program communication to a participant or for internal use by an enterprise.</w:t>
+            </w:r>
+          </w:p>
+        </w:tc>
+      </w:tr>
+      <w:tr>
+        <w:tc>
+          <w:tcPr>
+            <w:tcW w:type="dxa" w:w="1404"/>
+          </w:tcPr>
+          <w:p>
+            <w:r/>
+            <w:r>
+              <w:t>1.1.19.2.7</w:t>
+            </w:r>
+          </w:p>
+        </w:tc>
+        <w:tc>
+          <w:tcPr>
+            <w:tcW w:type="dxa" w:w="1123"/>
+          </w:tcPr>
+          <w:p>
+            <w:r/>
+            <w:r>
+              <w:t>L4</w:t>
+            </w:r>
+          </w:p>
+        </w:tc>
+        <w:tc>
+          <w:tcPr>
+            <w:tcW w:type="dxa" w:w="3463"/>
+          </w:tcPr>
+          <w:p>
+            <w:r/>
+            <w:r>
+              <w:t>Provide Loyalty Program Operation Report</w:t>
+            </w:r>
+          </w:p>
+        </w:tc>
+        <w:tc>
+          <w:tcPr>
+            <w:tcW w:type="dxa" w:w="3370"/>
+          </w:tcPr>
+          <w:p>
+            <w:r/>
+            <w:r>
+              <w:t>Generate a loyalty program operation report, such as various loyalty program status reports, trend analysis, and reports that identify suspected abuse of a loyalty program.</w:t>
+            </w:r>
+          </w:p>
+        </w:tc>
+      </w:tr>
+    </w:tbl>
+    <w:p/>
+    <w:p>
+      <w:pPr>
+        <w:pStyle w:val="Heading2"/>
+      </w:pPr>
+      <w:r>
+        <w:t>SID ABEs</w:t>
+      </w:r>
+    </w:p>
+    <w:p>
+      <w:r>
+        <w:t>SID ABEs this ODA Component is responsible for:</w:t>
+      </w:r>
+    </w:p>
+    <w:tbl>
+      <w:tblPr>
+        <w:tblStyle w:val="ScrollTableNormal"/>
+        <w:tblW w:type="auto" w:w="0"/>
+        <w:tblLayout w:type="autofit"/>
+        <w:tblLook w:val="04A0" w:firstRow="1" w:lastRow="0" w:firstColumn="0" w:lastColumn="0" w:noHBand="0" w:noVBand="1"/>
+        <w:tblBorders>
+          <w:top w:val="single" w:sz="4" w:space="0" w:color="999999"/>
+          <w:left w:val="single" w:sz="4" w:space="0" w:color="999999"/>
+          <w:bottom w:val="single" w:sz="4" w:space="0" w:color="999999"/>
+          <w:right w:val="single" w:sz="4" w:space="0" w:color="999999"/>
+          <w:insideH w:val="single" w:sz="4" w:space="0" w:color="999999"/>
+          <w:insideV w:val="single" w:sz="4" w:space="0" w:color="999999"/>
+        </w:tblBorders>
+      </w:tblPr>
+      <w:tblGrid>
+        <w:gridCol w:w="2124"/>
+        <w:gridCol w:w="2124"/>
+        <w:gridCol w:w="2124"/>
+        <w:gridCol w:w="2124"/>
+      </w:tblGrid>
+      <w:tr>
+        <w:trPr>
+          <w:tblHeader/>
+        </w:trPr>
+        <w:tc>
+          <w:tcPr>
+            <w:tcW w:type="dxa" w:w="2153"/>
+          </w:tcPr>
+          <w:p>
+            <w:r/>
+            <w:r>
+              <w:rPr>
+                <w:b/>
+              </w:rPr>
+              <w:t>SID ABE L1</w:t>
+            </w:r>
+          </w:p>
+        </w:tc>
+        <w:tc>
+          <w:tcPr>
+            <w:tcW w:type="dxa" w:w="2621"/>
+          </w:tcPr>
+          <w:p>
+            <w:r/>
+            <w:r>
+              <w:rPr>
+                <w:b/>
+              </w:rPr>
+              <w:t>SID ABE L1 Definition</w:t>
+            </w:r>
+          </w:p>
+        </w:tc>
+        <w:tc>
+          <w:tcPr>
+            <w:tcW w:type="dxa" w:w="1966"/>
+          </w:tcPr>
+          <w:p>
+            <w:r/>
+            <w:r>
+              <w:rPr>
+                <w:b/>
+              </w:rPr>
+              <w:t>SID ABE L2 (or set of BEs)</w:t>
+            </w:r>
+          </w:p>
+        </w:tc>
+        <w:tc>
+          <w:tcPr>
+            <w:tcW w:type="dxa" w:w="2621"/>
+          </w:tcPr>
+          <w:p>
+            <w:r/>
+            <w:r>
+              <w:rPr>
+                <w:b/>
+              </w:rPr>
+              <w:t>SID ABE L2 Definition</w:t>
+            </w:r>
+          </w:p>
+        </w:tc>
+      </w:tr>
+      <w:tr>
+        <w:tc>
+          <w:tcPr>
+            <w:tcW w:type="dxa" w:w="2153"/>
+          </w:tcPr>
+          <w:p>
+            <w:r/>
+            <w:r>
+              <w:t>Product and Offering Instance</w:t>
+            </w:r>
+          </w:p>
+        </w:tc>
+        <w:tc>
+          <w:tcPr>
+            <w:tcW w:type="dxa" w:w="2621"/>
+          </w:tcPr>
+          <w:p>
+            <w:r/>
+            <w:r>
+              <w:t>Product and ProductOfferingInstance represent, in the product inventory, respectively an instance of a ProductSpecification and ProductOfferindSpecification subscribed or not yet subscribed to by a Customer from the CSP or by the CSP from a BusinessPartner. The Product carries the place where the product is in use, as well as configuration characteristics, such as assigned telephone numbers and internet addresses. The Product and Offering Instance ABE also tracks the links to services and/or resources through which the Product is realized as well as the applied tariff and commitment duration related to the ProductOfferingInstance.</w:t>
+            </w:r>
+          </w:p>
+        </w:tc>
+        <w:tc>
+          <w:tcPr>
+            <w:tcW w:type="dxa" w:w="1966"/>
+          </w:tcPr>
+          <w:p>
+            <w:r/>
+            <w:r>
+              <w:t>Product</w:t>
+            </w:r>
+          </w:p>
+        </w:tc>
+        <w:tc>
+          <w:tcPr>
+            <w:tcW w:type="dxa" w:w="2621"/>
+          </w:tcPr>
+          <w:p>
+            <w:r/>
+            <w:r>
+              <w:t>Represents an instance in the product inventory of a ProductSpecification subscribed or not yet subscribed by a Customer to the CSP or by the CSP to a BusinessParnter, the place where the product is in use, as well as configuration characteristics, such as assigned telephone numbers and internet addresses. It may come from a CustomerProductOrderItem or a BusinessPartnerOrderItem. At one time, it might be contained in a unique ProductOfferingInstance. The Product ABE also tracks the links to services and/or resources through which the product is realized. The Product ABE also contains detailed concerning Network Products and Usage Volume Products as well as other examples of Products.</w:t>
+            </w:r>
+          </w:p>
+        </w:tc>
+      </w:tr>
+      <w:tr>
+        <w:tc>
+          <w:tcPr>
+            <w:tcW w:type="dxa" w:w="2153"/>
+          </w:tcPr>
+          <w:p>
+            <w:r/>
+            <w:r>
+              <w:t>Product and Offering Instance</w:t>
+            </w:r>
+          </w:p>
+        </w:tc>
+        <w:tc>
+          <w:tcPr>
+            <w:tcW w:type="dxa" w:w="2621"/>
+          </w:tcPr>
+          <w:p>
+            <w:r/>
+            <w:r>
+              <w:t>Product and ProductOfferingInstance represent, in the product inventory, respectively an instance of a ProductSpecification and ProductOfferindSpecification subscribed or not yet subscribed to by a Customer from the CSP or by the CSP from a BusinessPartner. The Product carries the place where the product is in use, as well as configuration characteristics, such as assigned telephone numbers and internet addresses. The Product and Offering Instance ABE also tracks the links to services and/or resources through which the Product is realized as well as the applied tariff and commitment duration related to the ProductOfferingInstance.</w:t>
+            </w:r>
+          </w:p>
+        </w:tc>
+        <w:tc>
+          <w:tcPr>
+            <w:tcW w:type="dxa" w:w="1966"/>
+          </w:tcPr>
+          <w:p>
+            <w:r/>
+            <w:r/>
+          </w:p>
+        </w:tc>
+        <w:tc>
+          <w:tcPr>
+            <w:tcW w:type="dxa" w:w="2621"/>
+          </w:tcPr>
+          <w:p>
+            <w:r/>
+            <w:r>
+              <w:t>*(no description available)*</w:t>
+            </w:r>
+          </w:p>
+        </w:tc>
+      </w:tr>
+      <w:tr>
+        <w:tc>
+          <w:tcPr>
+            <w:tcW w:type="dxa" w:w="2153"/>
+          </w:tcPr>
+          <w:p>
+            <w:r/>
+            <w:r>
+              <w:t>Loyalty</w:t>
+            </w:r>
+          </w:p>
+        </w:tc>
+        <w:tc>
+          <w:tcPr>
+            <w:tcW w:type="dxa" w:w="2621"/>
+          </w:tcPr>
+          <w:p>
+            <w:r/>
+            <w:r>
+              <w:t>A loyalty program is one of the tools used by the loyalty process to retain customers. The Loyalty ABE contains all entities useful to specify and instantiate loyalty programs. A LoyaltyProgramProdSpec defines the LoyaltyRules that have to be checked in order to identify the actions to apply. Depending on the type of LoyaltyRules a LoyaltyAccount might be needed to collect gains or not. A LoyaltyProgramProduct is a type of ProductComponent and described by a LoyaltyProgramProdSpec.</w:t>
+            </w:r>
+          </w:p>
+        </w:tc>
+        <w:tc>
+          <w:tcPr>
+            <w:tcW w:type="dxa" w:w="1966"/>
+          </w:tcPr>
+          <w:p>
+            <w:r/>
+            <w:r>
+              <w:t>Loyalty Program</w:t>
+            </w:r>
+          </w:p>
+        </w:tc>
+        <w:tc>
+          <w:tcPr>
+            <w:tcW w:type="dxa" w:w="2621"/>
+          </w:tcPr>
+          <w:p>
+            <w:r/>
+            <w:r>
+              <w:t>The Loyalty Program ABE contains all entities needed to instantiate a loyalty program for a specific customer such as LoyaltyProgram and LoyaltyAccount.</w:t>
+            </w:r>
+          </w:p>
+        </w:tc>
+      </w:tr>
+    </w:tbl>
+    <w:p/>
+    <w:p>
+      <w:pPr>
+        <w:pStyle w:val="Heading2"/>
+      </w:pPr>
+      <w:r>
         <w:t>Functional Framework Functions</w:t>
       </w:r>
     </w:p>
@@ -886,7 +886,35 @@
         </w:tc>
         <w:tc>
           <w:tcPr>
-            <w:tcW w:type="dxa" w:w="2246"/>
+            <w:tcW w:type="dxa" w:w="1778"/>
+          </w:tcPr>
+          <w:p>
+            <w:r/>
+            <w:r>
+              <w:rPr>
+                <w:b/>
+              </w:rPr>
+              <w:t>Aggregate Function Level 1</w:t>
+            </w:r>
+          </w:p>
+        </w:tc>
+        <w:tc>
+          <w:tcPr>
+            <w:tcW w:type="dxa" w:w="1872"/>
+          </w:tcPr>
+          <w:p>
+            <w:r/>
+            <w:r>
+              <w:rPr>
+                <w:b/>
+              </w:rPr>
+              <w:t>Aggregate Function Level 2</w:t>
+            </w:r>
+          </w:p>
+        </w:tc>
+        <w:tc>
+          <w:tcPr>
+            <w:tcW w:type="dxa" w:w="2340"/>
           </w:tcPr>
           <w:p>
             <w:r/>
@@ -898,34 +926,6 @@
             </w:r>
           </w:p>
         </w:tc>
-        <w:tc>
-          <w:tcPr>
-            <w:tcW w:type="dxa" w:w="1778"/>
-          </w:tcPr>
-          <w:p>
-            <w:r/>
-            <w:r>
-              <w:rPr>
-                <w:b/>
-              </w:rPr>
-              <w:t>Aggregate Function Level 1</w:t>
-            </w:r>
-          </w:p>
-        </w:tc>
-        <w:tc>
-          <w:tcPr>
-            <w:tcW w:type="dxa" w:w="1966"/>
-          </w:tcPr>
-          <w:p>
-            <w:r/>
-            <w:r>
-              <w:rPr>
-                <w:b/>
-              </w:rPr>
-              <w:t>Aggregate Function Level 2</w:t>
-            </w:r>
-          </w:p>
-        </w:tc>
       </w:tr>
       <w:tr>
         <w:tc>
@@ -952,34 +952,34 @@
         </w:tc>
         <w:tc>
           <w:tcPr>
-            <w:tcW w:type="dxa" w:w="2246"/>
+            <w:tcW w:type="dxa" w:w="1778"/>
+          </w:tcPr>
+          <w:p>
+            <w:r/>
+            <w:r>
+              <w:t>Product Management</w:t>
+            </w:r>
+          </w:p>
+        </w:tc>
+        <w:tc>
+          <w:tcPr>
+            <w:tcW w:type="dxa" w:w="1872"/>
+          </w:tcPr>
+          <w:p>
+            <w:r/>
+            <w:r>
+              <w:t>Product Repository Management</w:t>
+            </w:r>
+          </w:p>
+        </w:tc>
+        <w:tc>
+          <w:tcPr>
+            <w:tcW w:type="dxa" w:w="2340"/>
           </w:tcPr>
           <w:p>
             <w:r/>
             <w:r>
               <w:t>Assigned Products Maintenance permits defining and update: / - product characteristics / - links with the related service or resource (handsets, SIM cards, ...) needed to deliver the product, ...</w:t>
-            </w:r>
-          </w:p>
-        </w:tc>
-        <w:tc>
-          <w:tcPr>
-            <w:tcW w:type="dxa" w:w="1778"/>
-          </w:tcPr>
-          <w:p>
-            <w:r/>
-            <w:r>
-              <w:t>Product Management</w:t>
-            </w:r>
-          </w:p>
-        </w:tc>
-        <w:tc>
-          <w:tcPr>
-            <w:tcW w:type="dxa" w:w="1966"/>
-          </w:tcPr>
-          <w:p>
-            <w:r/>
-            <w:r>
-              <w:t>Product Repository Management</w:t>
             </w:r>
           </w:p>
         </w:tc>
@@ -1009,34 +1009,34 @@
         </w:tc>
         <w:tc>
           <w:tcPr>
-            <w:tcW w:type="dxa" w:w="2246"/>
+            <w:tcW w:type="dxa" w:w="1778"/>
+          </w:tcPr>
+          <w:p>
+            <w:r/>
+            <w:r>
+              <w:t>Product Management</w:t>
+            </w:r>
+          </w:p>
+        </w:tc>
+        <w:tc>
+          <w:tcPr>
+            <w:tcW w:type="dxa" w:w="1872"/>
+          </w:tcPr>
+          <w:p>
+            <w:r/>
+            <w:r>
+              <w:t>Product Repository Management</w:t>
+            </w:r>
+          </w:p>
+        </w:tc>
+        <w:tc>
+          <w:tcPr>
+            <w:tcW w:type="dxa" w:w="2340"/>
           </w:tcPr>
           <w:p>
             <w:r/>
             <w:r>
               <w:t>Product Storage provides the functionality necessary to store and make available the Products. / This function allows: / • to instantiate or update offers and products ordered by the customer, whatever their type (network product, bundle, device, …) or their marketing mode (rented, sold, …), with their configuration, their tariffs and discounts, and their status (initialized with a creation order) / • to update Products status / • to search and read Offer and Product installed base (subscribed offers, configuration of installed products, installed tariffs and discount, statuses, …).</w:t>
-            </w:r>
-          </w:p>
-        </w:tc>
-        <w:tc>
-          <w:tcPr>
-            <w:tcW w:type="dxa" w:w="1778"/>
-          </w:tcPr>
-          <w:p>
-            <w:r/>
-            <w:r>
-              <w:t>Product Management</w:t>
-            </w:r>
-          </w:p>
-        </w:tc>
-        <w:tc>
-          <w:tcPr>
-            <w:tcW w:type="dxa" w:w="1966"/>
-          </w:tcPr>
-          <w:p>
-            <w:r/>
-            <w:r>
-              <w:t>Product Repository Management</w:t>
             </w:r>
           </w:p>
         </w:tc>
@@ -1066,34 +1066,34 @@
         </w:tc>
         <w:tc>
           <w:tcPr>
-            <w:tcW w:type="dxa" w:w="2246"/>
+            <w:tcW w:type="dxa" w:w="1778"/>
+          </w:tcPr>
+          <w:p>
+            <w:r/>
+            <w:r>
+              <w:t>Product Management</w:t>
+            </w:r>
+          </w:p>
+        </w:tc>
+        <w:tc>
+          <w:tcPr>
+            <w:tcW w:type="dxa" w:w="1872"/>
+          </w:tcPr>
+          <w:p>
+            <w:r/>
+            <w:r>
+              <w:t>Loyalty Account Management</w:t>
+            </w:r>
+          </w:p>
+        </w:tc>
+        <w:tc>
+          <w:tcPr>
+            <w:tcW w:type="dxa" w:w="2340"/>
           </w:tcPr>
           <w:p>
             <w:r/>
             <w:r>
               <w:t>Customer Loyalty Score Balance Management function calculates the score according to accumulation/decrease rules. When a customer subscribes to the loyalty program with more than one SIM or other ‘traffic objects’, the Score Management accumulates the points into a single balance. The loyalty score could decrease for one of the following events: prize purchase, points expiry or points deletion by Call Centre. The functionality may also include the visualization of Score details (date, description event type, points, final score) via different contact Channels (e.g. via Web, IVR, Call Centre).</w:t>
-            </w:r>
-          </w:p>
-        </w:tc>
-        <w:tc>
-          <w:tcPr>
-            <w:tcW w:type="dxa" w:w="1778"/>
-          </w:tcPr>
-          <w:p>
-            <w:r/>
-            <w:r>
-              <w:t>Product Management</w:t>
-            </w:r>
-          </w:p>
-        </w:tc>
-        <w:tc>
-          <w:tcPr>
-            <w:tcW w:type="dxa" w:w="1966"/>
-          </w:tcPr>
-          <w:p>
-            <w:r/>
-            <w:r>
-              <w:t>Loyalty Account Management</w:t>
             </w:r>
           </w:p>
         </w:tc>
@@ -1123,34 +1123,34 @@
         </w:tc>
         <w:tc>
           <w:tcPr>
-            <w:tcW w:type="dxa" w:w="2246"/>
+            <w:tcW w:type="dxa" w:w="1778"/>
+          </w:tcPr>
+          <w:p>
+            <w:r/>
+            <w:r>
+              <w:t>Product Management</w:t>
+            </w:r>
+          </w:p>
+        </w:tc>
+        <w:tc>
+          <w:tcPr>
+            <w:tcW w:type="dxa" w:w="1872"/>
+          </w:tcPr>
+          <w:p>
+            <w:r/>
+            <w:r>
+              <w:t>Loyalty Account Management</w:t>
+            </w:r>
+          </w:p>
+        </w:tc>
+        <w:tc>
+          <w:tcPr>
+            <w:tcW w:type="dxa" w:w="2340"/>
           </w:tcPr>
           <w:p>
             <w:r/>
             <w:r>
               <w:t>Customer Loyalty Communication function sends information related to Loyalty Programs (Point Balance, Prize Request status, renewed Loyalty Code) to external components in push and pull modes.</w:t>
-            </w:r>
-          </w:p>
-        </w:tc>
-        <w:tc>
-          <w:tcPr>
-            <w:tcW w:type="dxa" w:w="1778"/>
-          </w:tcPr>
-          <w:p>
-            <w:r/>
-            <w:r>
-              <w:t>Product Management</w:t>
-            </w:r>
-          </w:p>
-        </w:tc>
-        <w:tc>
-          <w:tcPr>
-            <w:tcW w:type="dxa" w:w="1966"/>
-          </w:tcPr>
-          <w:p>
-            <w:r/>
-            <w:r>
-              <w:t>Loyalty Account Management</w:t>
             </w:r>
           </w:p>
         </w:tc>
@@ -1180,34 +1180,34 @@
         </w:tc>
         <w:tc>
           <w:tcPr>
-            <w:tcW w:type="dxa" w:w="2246"/>
+            <w:tcW w:type="dxa" w:w="1778"/>
+          </w:tcPr>
+          <w:p>
+            <w:r/>
+            <w:r>
+              <w:t>Product Management</w:t>
+            </w:r>
+          </w:p>
+        </w:tc>
+        <w:tc>
+          <w:tcPr>
+            <w:tcW w:type="dxa" w:w="1872"/>
+          </w:tcPr>
+          <w:p>
+            <w:r/>
+            <w:r>
+              <w:t>Product Agreement Management</w:t>
+            </w:r>
+          </w:p>
+        </w:tc>
+        <w:tc>
+          <w:tcPr>
+            <w:tcW w:type="dxa" w:w="2340"/>
           </w:tcPr>
           <w:p>
             <w:r/>
             <w:r>
               <w:t>Product Agreement Implementation function provides functionality pertaining to the implementation of the Product Agreement (a.k.a. contract) across fulfillment, assurance, and billing according to Product Agreement Specification. / A Product Agreement represents the approval by the Customer and the Vendor of all term or conditions of a ProductOffering.</w:t>
-            </w:r>
-          </w:p>
-        </w:tc>
-        <w:tc>
-          <w:tcPr>
-            <w:tcW w:type="dxa" w:w="1778"/>
-          </w:tcPr>
-          <w:p>
-            <w:r/>
-            <w:r>
-              <w:t>Product Management</w:t>
-            </w:r>
-          </w:p>
-        </w:tc>
-        <w:tc>
-          <w:tcPr>
-            <w:tcW w:type="dxa" w:w="1966"/>
-          </w:tcPr>
-          <w:p>
-            <w:r/>
-            <w:r>
-              <w:t>Product Agreement Management</w:t>
             </w:r>
           </w:p>
         </w:tc>
@@ -1237,34 +1237,34 @@
         </w:tc>
         <w:tc>
           <w:tcPr>
-            <w:tcW w:type="dxa" w:w="2246"/>
+            <w:tcW w:type="dxa" w:w="1778"/>
+          </w:tcPr>
+          <w:p>
+            <w:r/>
+            <w:r>
+              <w:t>*(no description available)*</w:t>
+            </w:r>
+          </w:p>
+        </w:tc>
+        <w:tc>
+          <w:tcPr>
+            <w:tcW w:type="dxa" w:w="1872"/>
+          </w:tcPr>
+          <w:p>
+            <w:r/>
+            <w:r>
+              <w:t>*(no description available)*</w:t>
+            </w:r>
+          </w:p>
+        </w:tc>
+        <w:tc>
+          <w:tcPr>
+            <w:tcW w:type="dxa" w:w="2340"/>
           </w:tcPr>
           <w:p>
             <w:r/>
             <w:r>
               <w:t>*(no description available in the source document or the Functional Framework spreadsheets)*</w:t>
-            </w:r>
-          </w:p>
-        </w:tc>
-        <w:tc>
-          <w:tcPr>
-            <w:tcW w:type="dxa" w:w="1778"/>
-          </w:tcPr>
-          <w:p>
-            <w:r/>
-            <w:r>
-              <w:t>*(no description available)*</w:t>
-            </w:r>
-          </w:p>
-        </w:tc>
-        <w:tc>
-          <w:tcPr>
-            <w:tcW w:type="dxa" w:w="1966"/>
-          </w:tcPr>
-          <w:p>
-            <w:r/>
-            <w:r>
-              <w:t>*(no description available)*</w:t>
             </w:r>
           </w:p>
         </w:tc>
@@ -1294,34 +1294,34 @@
         </w:tc>
         <w:tc>
           <w:tcPr>
-            <w:tcW w:type="dxa" w:w="2246"/>
+            <w:tcW w:type="dxa" w:w="1778"/>
+          </w:tcPr>
+          <w:p>
+            <w:r/>
+            <w:r>
+              <w:t>Product Management</w:t>
+            </w:r>
+          </w:p>
+        </w:tc>
+        <w:tc>
+          <w:tcPr>
+            <w:tcW w:type="dxa" w:w="1872"/>
+          </w:tcPr>
+          <w:p>
+            <w:r/>
+            <w:r>
+              <w:t>Product Agreement Management</w:t>
+            </w:r>
+          </w:p>
+        </w:tc>
+        <w:tc>
+          <w:tcPr>
+            <w:tcW w:type="dxa" w:w="2340"/>
           </w:tcPr>
           <w:p>
             <w:r/>
             <w:r>
               <w:t>Contract Storage provides the central repository for contract storage as well as the associated contract meta-data. This data can be mined for Campaigns and Lead Generation. / Product Agreement Storage provides functionality necessary to store and make available the Product Agreements. / This function allows: / • to instantiate or update Product Agreement approved by the customer with their party involved, their configuration, their approvals and their status, / • to update Product Agreements status, / • to search and read Product Agreements.</w:t>
-            </w:r>
-          </w:p>
-        </w:tc>
-        <w:tc>
-          <w:tcPr>
-            <w:tcW w:type="dxa" w:w="1778"/>
-          </w:tcPr>
-          <w:p>
-            <w:r/>
-            <w:r>
-              <w:t>Product Management</w:t>
-            </w:r>
-          </w:p>
-        </w:tc>
-        <w:tc>
-          <w:tcPr>
-            <w:tcW w:type="dxa" w:w="1966"/>
-          </w:tcPr>
-          <w:p>
-            <w:r/>
-            <w:r>
-              <w:t>Product Agreement Management</w:t>
             </w:r>
           </w:p>
         </w:tc>
@@ -1351,34 +1351,34 @@
         </w:tc>
         <w:tc>
           <w:tcPr>
-            <w:tcW w:type="dxa" w:w="2246"/>
+            <w:tcW w:type="dxa" w:w="1778"/>
+          </w:tcPr>
+          <w:p>
+            <w:r/>
+            <w:r>
+              <w:t>Product Management</w:t>
+            </w:r>
+          </w:p>
+        </w:tc>
+        <w:tc>
+          <w:tcPr>
+            <w:tcW w:type="dxa" w:w="1872"/>
+          </w:tcPr>
+          <w:p>
+            <w:r/>
+            <w:r>
+              <w:t>Product Repository Management</w:t>
+            </w:r>
+          </w:p>
+        </w:tc>
+        <w:tc>
+          <w:tcPr>
+            <w:tcW w:type="dxa" w:w="2340"/>
           </w:tcPr>
           <w:p>
             <w:r/>
             <w:r>
               <w:t>Product Configuration Check Function Checks for each Product submitted if all Product configuration rules have been respected such as prerequisite, incompatibility rules between ProductSpecifications or mandatory characteristics.</w:t>
-            </w:r>
-          </w:p>
-        </w:tc>
-        <w:tc>
-          <w:tcPr>
-            <w:tcW w:type="dxa" w:w="1778"/>
-          </w:tcPr>
-          <w:p>
-            <w:r/>
-            <w:r>
-              <w:t>Product Management</w:t>
-            </w:r>
-          </w:p>
-        </w:tc>
-        <w:tc>
-          <w:tcPr>
-            <w:tcW w:type="dxa" w:w="1966"/>
-          </w:tcPr>
-          <w:p>
-            <w:r/>
-            <w:r>
-              <w:t>Product Repository Management</w:t>
             </w:r>
           </w:p>
         </w:tc>
@@ -1519,7 +1519,7 @@
         </w:tc>
         <w:tc>
           <w:tcPr>
-            <w:tcW w:type="dxa" w:w="2434"/>
+            <w:tcW w:type="dxa" w:w="2153"/>
           </w:tcPr>
           <w:p>
             <w:r/>
@@ -1533,7 +1533,7 @@
         </w:tc>
         <w:tc>
           <w:tcPr>
-            <w:tcW w:type="dxa" w:w="1872"/>
+            <w:tcW w:type="dxa" w:w="1591"/>
           </w:tcPr>
           <w:p>
             <w:r/>
@@ -1547,7 +1547,7 @@
         </w:tc>
         <w:tc>
           <w:tcPr>
-            <w:tcW w:type="dxa" w:w="1310"/>
+            <w:tcW w:type="dxa" w:w="1217"/>
           </w:tcPr>
           <w:p>
             <w:r/>
@@ -1561,7 +1561,7 @@
         </w:tc>
         <w:tc>
           <w:tcPr>
-            <w:tcW w:type="dxa" w:w="1310"/>
+            <w:tcW w:type="dxa" w:w="1217"/>
           </w:tcPr>
           <w:p>
             <w:r/>
@@ -1575,7 +1575,7 @@
         </w:tc>
         <w:tc>
           <w:tcPr>
-            <w:tcW w:type="dxa" w:w="1404"/>
+            <w:tcW w:type="dxa" w:w="2153"/>
           </w:tcPr>
           <w:p>
             <w:r/>
@@ -1602,7 +1602,7 @@
         </w:tc>
         <w:tc>
           <w:tcPr>
-            <w:tcW w:type="dxa" w:w="2434"/>
+            <w:tcW w:type="dxa" w:w="2153"/>
           </w:tcPr>
           <w:p>
             <w:r/>
@@ -1613,7 +1613,7 @@
         </w:tc>
         <w:tc>
           <w:tcPr>
-            <w:tcW w:type="dxa" w:w="1872"/>
+            <w:tcW w:type="dxa" w:w="1591"/>
           </w:tcPr>
           <w:p>
             <w:r/>
@@ -1624,7 +1624,7 @@
         </w:tc>
         <w:tc>
           <w:tcPr>
-            <w:tcW w:type="dxa" w:w="1310"/>
+            <w:tcW w:type="dxa" w:w="1217"/>
           </w:tcPr>
           <w:p>
             <w:r/>
@@ -1635,7 +1635,7 @@
         </w:tc>
         <w:tc>
           <w:tcPr>
-            <w:tcW w:type="dxa" w:w="1310"/>
+            <w:tcW w:type="dxa" w:w="1217"/>
           </w:tcPr>
           <w:p>
             <w:r/>
@@ -1646,36 +1646,12 @@
         </w:tc>
         <w:tc>
           <w:tcPr>
-            <w:tcW w:type="dxa" w:w="1404"/>
-          </w:tcPr>
-          <w:p>
-            <w:r/>
-            <w:r>
-              <w:t>GET</w:t>
-            </w:r>
-            <w:r>
-              <w:br/>
-            </w:r>
-            <w:r>
-              <w:t>GET /id</w:t>
-            </w:r>
-            <w:r>
-              <w:br/>
-            </w:r>
-            <w:r>
-              <w:t>POST</w:t>
-            </w:r>
-            <w:r>
-              <w:br/>
-            </w:r>
-            <w:r>
-              <w:t>PATCH</w:t>
-            </w:r>
-            <w:r>
-              <w:br/>
-            </w:r>
-            <w:r>
-              <w:t>DELETE</w:t>
+            <w:tcW w:type="dxa" w:w="2153"/>
+          </w:tcPr>
+          <w:p>
+            <w:r/>
+            <w:r>
+              <w:t>GET, GET /id, POST, PATCH, DELETE</w:t>
             </w:r>
           </w:p>
         </w:tc>
@@ -1694,7 +1670,7 @@
         </w:tc>
         <w:tc>
           <w:tcPr>
-            <w:tcW w:type="dxa" w:w="2434"/>
+            <w:tcW w:type="dxa" w:w="2153"/>
           </w:tcPr>
           <w:p>
             <w:r/>
@@ -1705,7 +1681,7 @@
         </w:tc>
         <w:tc>
           <w:tcPr>
-            <w:tcW w:type="dxa" w:w="1872"/>
+            <w:tcW w:type="dxa" w:w="1591"/>
           </w:tcPr>
           <w:p>
             <w:r/>
@@ -1716,7 +1692,7 @@
         </w:tc>
         <w:tc>
           <w:tcPr>
-            <w:tcW w:type="dxa" w:w="1310"/>
+            <w:tcW w:type="dxa" w:w="1217"/>
           </w:tcPr>
           <w:p>
             <w:r/>
@@ -1727,7 +1703,7 @@
         </w:tc>
         <w:tc>
           <w:tcPr>
-            <w:tcW w:type="dxa" w:w="1310"/>
+            <w:tcW w:type="dxa" w:w="1217"/>
           </w:tcPr>
           <w:p>
             <w:r/>
@@ -1738,36 +1714,12 @@
         </w:tc>
         <w:tc>
           <w:tcPr>
-            <w:tcW w:type="dxa" w:w="1404"/>
-          </w:tcPr>
-          <w:p>
-            <w:r/>
-            <w:r>
-              <w:t>GET</w:t>
-            </w:r>
-            <w:r>
-              <w:br/>
-            </w:r>
-            <w:r>
-              <w:t>GET /id</w:t>
-            </w:r>
-            <w:r>
-              <w:br/>
-            </w:r>
-            <w:r>
-              <w:t>POST</w:t>
-            </w:r>
-            <w:r>
-              <w:br/>
-            </w:r>
-            <w:r>
-              <w:t>PATCH</w:t>
-            </w:r>
-            <w:r>
-              <w:br/>
-            </w:r>
-            <w:r>
-              <w:t>DELETE</w:t>
+            <w:tcW w:type="dxa" w:w="2153"/>
+          </w:tcPr>
+          <w:p>
+            <w:r/>
+            <w:r>
+              <w:t>GET, GET /id, POST, PATCH, DELETE</w:t>
             </w:r>
           </w:p>
         </w:tc>
@@ -1786,18 +1738,18 @@
         </w:tc>
         <w:tc>
           <w:tcPr>
-            <w:tcW w:type="dxa" w:w="2434"/>
-          </w:tcPr>
-          <w:p>
-            <w:r/>
-            <w:r>
-              <w:t>Process Flow Management API</w:t>
-            </w:r>
-          </w:p>
-        </w:tc>
-        <w:tc>
-          <w:tcPr>
-            <w:tcW w:type="dxa" w:w="1872"/>
+            <w:tcW w:type="dxa" w:w="2153"/>
+          </w:tcPr>
+          <w:p>
+            <w:r/>
+            <w:r>
+              <w:t>UNRESOLVED-TMF701</w:t>
+            </w:r>
+          </w:p>
+        </w:tc>
+        <w:tc>
+          <w:tcPr>
+            <w:tcW w:type="dxa" w:w="1591"/>
           </w:tcPr>
           <w:p>
             <w:r/>
@@ -1808,7 +1760,7 @@
         </w:tc>
         <w:tc>
           <w:tcPr>
-            <w:tcW w:type="dxa" w:w="1310"/>
+            <w:tcW w:type="dxa" w:w="1217"/>
           </w:tcPr>
           <w:p>
             <w:r/>
@@ -1819,16 +1771,78 @@
         </w:tc>
         <w:tc>
           <w:tcPr>
-            <w:tcW w:type="dxa" w:w="1310"/>
+            <w:tcW w:type="dxa" w:w="1217"/>
           </w:tcPr>
           <w:p>
             <w:r/>
             <w:r>
               <w:t>processFlow</w:t>
             </w:r>
-            <w:r>
-              <w:br/>
-            </w:r>
+          </w:p>
+        </w:tc>
+        <w:tc>
+          <w:tcPr>
+            <w:tcW w:type="dxa" w:w="2153"/>
+          </w:tcPr>
+          <w:p>
+            <w:r/>
+            <w:r>
+              <w:t>POST, GET, GET /id, DELETE</w:t>
+            </w:r>
+          </w:p>
+        </w:tc>
+      </w:tr>
+      <w:tr>
+        <w:tc>
+          <w:tcPr>
+            <w:tcW w:type="dxa" w:w="1030"/>
+          </w:tcPr>
+          <w:p>
+            <w:r/>
+            <w:r>
+              <w:t>TMF701</w:t>
+            </w:r>
+          </w:p>
+        </w:tc>
+        <w:tc>
+          <w:tcPr>
+            <w:tcW w:type="dxa" w:w="2153"/>
+          </w:tcPr>
+          <w:p>
+            <w:r/>
+            <w:r>
+              <w:t>UNRESOLVED-TMF701</w:t>
+            </w:r>
+          </w:p>
+        </w:tc>
+        <w:tc>
+          <w:tcPr>
+            <w:tcW w:type="dxa" w:w="1591"/>
+          </w:tcPr>
+          <w:p>
+            <w:r/>
+            <w:r>
+              <w:t>Optional</w:t>
+            </w:r>
+          </w:p>
+        </w:tc>
+        <w:tc>
+          <w:tcPr>
+            <w:tcW w:type="dxa" w:w="1217"/>
+          </w:tcPr>
+          <w:p>
+            <w:r/>
+            <w:r>
+              <w:t>4</w:t>
+            </w:r>
+          </w:p>
+        </w:tc>
+        <w:tc>
+          <w:tcPr>
+            <w:tcW w:type="dxa" w:w="1217"/>
+          </w:tcPr>
+          <w:p>
+            <w:r/>
             <w:r>
               <w:t>taskFlow</w:t>
             </w:r>
@@ -1836,36 +1850,12 @@
         </w:tc>
         <w:tc>
           <w:tcPr>
-            <w:tcW w:type="dxa" w:w="1404"/>
-          </w:tcPr>
-          <w:p>
-            <w:r/>
-            <w:r>
-              <w:t>POST</w:t>
-            </w:r>
-            <w:r>
-              <w:br/>
-            </w:r>
-            <w:r>
-              <w:t>GET</w:t>
-            </w:r>
-            <w:r>
-              <w:br/>
-            </w:r>
-            <w:r>
-              <w:t>GET /id</w:t>
-            </w:r>
-            <w:r>
-              <w:br/>
-            </w:r>
-            <w:r>
-              <w:t>DELETE</w:t>
-            </w:r>
-            <w:r>
-              <w:br/>
-            </w:r>
-            <w:r>
-              <w:t>PATCH</w:t>
+            <w:tcW w:type="dxa" w:w="2153"/>
+          </w:tcPr>
+          <w:p>
+            <w:r/>
+            <w:r>
+              <w:t>PATCH, GET, GET /id</w:t>
             </w:r>
           </w:p>
         </w:tc>
@@ -1967,7 +1957,7 @@
         </w:tc>
         <w:tc>
           <w:tcPr>
-            <w:tcW w:type="dxa" w:w="2434"/>
+            <w:tcW w:type="dxa" w:w="2059"/>
           </w:tcPr>
           <w:p>
             <w:r/>
@@ -1981,7 +1971,7 @@
         </w:tc>
         <w:tc>
           <w:tcPr>
-            <w:tcW w:type="dxa" w:w="1310"/>
+            <w:tcW w:type="dxa" w:w="1217"/>
           </w:tcPr>
           <w:p>
             <w:r/>
@@ -1995,7 +1985,7 @@
         </w:tc>
         <w:tc>
           <w:tcPr>
-            <w:tcW w:type="dxa" w:w="1685"/>
+            <w:tcW w:type="dxa" w:w="1498"/>
           </w:tcPr>
           <w:p>
             <w:r/>
@@ -2009,7 +1999,7 @@
         </w:tc>
         <w:tc>
           <w:tcPr>
-            <w:tcW w:type="dxa" w:w="1685"/>
+            <w:tcW w:type="dxa" w:w="1498"/>
           </w:tcPr>
           <w:p>
             <w:r/>
@@ -2023,7 +2013,7 @@
         </w:tc>
         <w:tc>
           <w:tcPr>
-            <w:tcW w:type="dxa" w:w="1217"/>
+            <w:tcW w:type="dxa" w:w="2059"/>
           </w:tcPr>
           <w:p>
             <w:r/>
@@ -2050,7 +2040,7 @@
         </w:tc>
         <w:tc>
           <w:tcPr>
-            <w:tcW w:type="dxa" w:w="2434"/>
+            <w:tcW w:type="dxa" w:w="2059"/>
           </w:tcPr>
           <w:p>
             <w:r/>
@@ -2061,7 +2051,7 @@
         </w:tc>
         <w:tc>
           <w:tcPr>
-            <w:tcW w:type="dxa" w:w="1310"/>
+            <w:tcW w:type="dxa" w:w="1217"/>
           </w:tcPr>
           <w:p>
             <w:r/>
@@ -2072,7 +2062,7 @@
         </w:tc>
         <w:tc>
           <w:tcPr>
-            <w:tcW w:type="dxa" w:w="1685"/>
+            <w:tcW w:type="dxa" w:w="1498"/>
           </w:tcPr>
           <w:p>
             <w:r/>
@@ -2083,41 +2073,23 @@
         </w:tc>
         <w:tc>
           <w:tcPr>
-            <w:tcW w:type="dxa" w:w="1685"/>
+            <w:tcW w:type="dxa" w:w="1498"/>
           </w:tcPr>
           <w:p>
             <w:r/>
             <w:r>
               <w:t>productOffering</w:t>
             </w:r>
-            <w:r>
-              <w:br/>
-            </w:r>
-            <w:r>
-              <w:t>productOfferingPrice</w:t>
-            </w:r>
-            <w:r>
-              <w:br/>
-            </w:r>
-            <w:r>
-              <w:t>productSpecification</w:t>
-            </w:r>
-          </w:p>
-        </w:tc>
-        <w:tc>
-          <w:tcPr>
-            <w:tcW w:type="dxa" w:w="1217"/>
-          </w:tcPr>
-          <w:p>
-            <w:r/>
-            <w:r>
-              <w:t>GET</w:t>
-            </w:r>
-            <w:r>
-              <w:br/>
-            </w:r>
-            <w:r>
-              <w:t>GET /id</w:t>
+          </w:p>
+        </w:tc>
+        <w:tc>
+          <w:tcPr>
+            <w:tcW w:type="dxa" w:w="2059"/>
+          </w:tcPr>
+          <w:p>
+            <w:r/>
+            <w:r>
+              <w:t>GET, GET /id</w:t>
             </w:r>
           </w:p>
         </w:tc>
@@ -2136,7 +2108,7 @@
         </w:tc>
         <w:tc>
           <w:tcPr>
-            <w:tcW w:type="dxa" w:w="2434"/>
+            <w:tcW w:type="dxa" w:w="2059"/>
           </w:tcPr>
           <w:p>
             <w:r/>
@@ -2147,18 +2119,18 @@
         </w:tc>
         <w:tc>
           <w:tcPr>
-            <w:tcW w:type="dxa" w:w="1310"/>
-          </w:tcPr>
-          <w:p>
-            <w:r/>
-            <w:r>
-              <w:t>4</w:t>
-            </w:r>
-          </w:p>
-        </w:tc>
-        <w:tc>
-          <w:tcPr>
-            <w:tcW w:type="dxa" w:w="1685"/>
+            <w:tcW w:type="dxa" w:w="1217"/>
+          </w:tcPr>
+          <w:p>
+            <w:r/>
+            <w:r>
+              <w:t>5</w:t>
+            </w:r>
+          </w:p>
+        </w:tc>
+        <w:tc>
+          <w:tcPr>
+            <w:tcW w:type="dxa" w:w="1498"/>
           </w:tcPr>
           <w:p>
             <w:r/>
@@ -2169,22 +2141,10 @@
         </w:tc>
         <w:tc>
           <w:tcPr>
-            <w:tcW w:type="dxa" w:w="1685"/>
-          </w:tcPr>
-          <w:p>
-            <w:r/>
-            <w:r>
-              <w:t>productSpecification</w:t>
-            </w:r>
-            <w:r>
-              <w:br/>
-            </w:r>
-            <w:r>
-              <w:t>productOffering</w:t>
-            </w:r>
-            <w:r>
-              <w:br/>
-            </w:r>
+            <w:tcW w:type="dxa" w:w="1498"/>
+          </w:tcPr>
+          <w:p>
+            <w:r/>
             <w:r>
               <w:t>productOfferingPrice</w:t>
             </w:r>
@@ -2192,18 +2152,12 @@
         </w:tc>
         <w:tc>
           <w:tcPr>
-            <w:tcW w:type="dxa" w:w="1217"/>
-          </w:tcPr>
-          <w:p>
-            <w:r/>
-            <w:r>
-              <w:t>GET</w:t>
-            </w:r>
-            <w:r>
-              <w:br/>
-            </w:r>
-            <w:r>
-              <w:t>GET /id</w:t>
+            <w:tcW w:type="dxa" w:w="2059"/>
+          </w:tcPr>
+          <w:p>
+            <w:r/>
+            <w:r>
+              <w:t>GET, GET /id</w:t>
             </w:r>
           </w:p>
         </w:tc>
@@ -2216,24 +2170,24 @@
           <w:p>
             <w:r/>
             <w:r>
-              <w:t>TMF669</w:t>
-            </w:r>
-          </w:p>
-        </w:tc>
-        <w:tc>
-          <w:tcPr>
-            <w:tcW w:type="dxa" w:w="2434"/>
-          </w:tcPr>
-          <w:p>
-            <w:r/>
-            <w:r>
-              <w:t>Party Role Management API</w:t>
-            </w:r>
-          </w:p>
-        </w:tc>
-        <w:tc>
-          <w:tcPr>
-            <w:tcW w:type="dxa" w:w="1310"/>
+              <w:t>TMF620</w:t>
+            </w:r>
+          </w:p>
+        </w:tc>
+        <w:tc>
+          <w:tcPr>
+            <w:tcW w:type="dxa" w:w="2059"/>
+          </w:tcPr>
+          <w:p>
+            <w:r/>
+            <w:r>
+              <w:t>Product Catalog Management API</w:t>
+            </w:r>
+          </w:p>
+        </w:tc>
+        <w:tc>
+          <w:tcPr>
+            <w:tcW w:type="dxa" w:w="1217"/>
           </w:tcPr>
           <w:p>
             <w:r/>
@@ -2244,40 +2198,34 @@
         </w:tc>
         <w:tc>
           <w:tcPr>
-            <w:tcW w:type="dxa" w:w="1685"/>
-          </w:tcPr>
-          <w:p>
-            <w:r/>
-            <w:r>
-              <w:t>Optional</w:t>
-            </w:r>
-          </w:p>
-        </w:tc>
-        <w:tc>
-          <w:tcPr>
-            <w:tcW w:type="dxa" w:w="1685"/>
-          </w:tcPr>
-          <w:p>
-            <w:r/>
-            <w:r>
-              <w:t>partyRoleManagement</w:t>
-            </w:r>
-          </w:p>
-        </w:tc>
-        <w:tc>
-          <w:tcPr>
-            <w:tcW w:type="dxa" w:w="1217"/>
-          </w:tcPr>
-          <w:p>
-            <w:r/>
-            <w:r>
-              <w:t>GET</w:t>
-            </w:r>
-            <w:r>
-              <w:br/>
-            </w:r>
-            <w:r>
-              <w:t>GET /id</w:t>
+            <w:tcW w:type="dxa" w:w="1498"/>
+          </w:tcPr>
+          <w:p>
+            <w:r/>
+            <w:r>
+              <w:t>Mandatory</w:t>
+            </w:r>
+          </w:p>
+        </w:tc>
+        <w:tc>
+          <w:tcPr>
+            <w:tcW w:type="dxa" w:w="1498"/>
+          </w:tcPr>
+          <w:p>
+            <w:r/>
+            <w:r>
+              <w:t>productSpecification</w:t>
+            </w:r>
+          </w:p>
+        </w:tc>
+        <w:tc>
+          <w:tcPr>
+            <w:tcW w:type="dxa" w:w="2059"/>
+          </w:tcPr>
+          <w:p>
+            <w:r/>
+            <w:r>
+              <w:t>GET, GET /id</w:t>
             </w:r>
           </w:p>
         </w:tc>
@@ -2290,24 +2238,24 @@
           <w:p>
             <w:r/>
             <w:r>
-              <w:t>TMF669</w:t>
-            </w:r>
-          </w:p>
-        </w:tc>
-        <w:tc>
-          <w:tcPr>
-            <w:tcW w:type="dxa" w:w="2434"/>
-          </w:tcPr>
-          <w:p>
-            <w:r/>
-            <w:r>
-              <w:t>Party Role Management API</w:t>
-            </w:r>
-          </w:p>
-        </w:tc>
-        <w:tc>
-          <w:tcPr>
-            <w:tcW w:type="dxa" w:w="1310"/>
+              <w:t>TMF620</w:t>
+            </w:r>
+          </w:p>
+        </w:tc>
+        <w:tc>
+          <w:tcPr>
+            <w:tcW w:type="dxa" w:w="2059"/>
+          </w:tcPr>
+          <w:p>
+            <w:r/>
+            <w:r>
+              <w:t>Product Catalog Management API</w:t>
+            </w:r>
+          </w:p>
+        </w:tc>
+        <w:tc>
+          <w:tcPr>
+            <w:tcW w:type="dxa" w:w="1217"/>
           </w:tcPr>
           <w:p>
             <w:r/>
@@ -2318,40 +2266,34 @@
         </w:tc>
         <w:tc>
           <w:tcPr>
-            <w:tcW w:type="dxa" w:w="1685"/>
-          </w:tcPr>
-          <w:p>
-            <w:r/>
-            <w:r>
-              <w:t>Optional</w:t>
-            </w:r>
-          </w:p>
-        </w:tc>
-        <w:tc>
-          <w:tcPr>
-            <w:tcW w:type="dxa" w:w="1685"/>
-          </w:tcPr>
-          <w:p>
-            <w:r/>
-            <w:r>
-              <w:t>PartyRoleManagement</w:t>
-            </w:r>
-          </w:p>
-        </w:tc>
-        <w:tc>
-          <w:tcPr>
-            <w:tcW w:type="dxa" w:w="1217"/>
-          </w:tcPr>
-          <w:p>
-            <w:r/>
-            <w:r>
-              <w:t>GET</w:t>
-            </w:r>
-            <w:r>
-              <w:br/>
-            </w:r>
-            <w:r>
-              <w:t>GET /id</w:t>
+            <w:tcW w:type="dxa" w:w="1498"/>
+          </w:tcPr>
+          <w:p>
+            <w:r/>
+            <w:r>
+              <w:t>Mandatory</w:t>
+            </w:r>
+          </w:p>
+        </w:tc>
+        <w:tc>
+          <w:tcPr>
+            <w:tcW w:type="dxa" w:w="1498"/>
+          </w:tcPr>
+          <w:p>
+            <w:r/>
+            <w:r>
+              <w:t>productSpecification</w:t>
+            </w:r>
+          </w:p>
+        </w:tc>
+        <w:tc>
+          <w:tcPr>
+            <w:tcW w:type="dxa" w:w="2059"/>
+          </w:tcPr>
+          <w:p>
+            <w:r/>
+            <w:r>
+              <w:t>GET, GET /id</w:t>
             </w:r>
           </w:p>
         </w:tc>
@@ -2364,24 +2306,24 @@
           <w:p>
             <w:r/>
             <w:r>
-              <w:t>TMF639</w:t>
-            </w:r>
-          </w:p>
-        </w:tc>
-        <w:tc>
-          <w:tcPr>
-            <w:tcW w:type="dxa" w:w="2434"/>
-          </w:tcPr>
-          <w:p>
-            <w:r/>
-            <w:r>
-              <w:t>Resource Inventory Management API</w:t>
-            </w:r>
-          </w:p>
-        </w:tc>
-        <w:tc>
-          <w:tcPr>
-            <w:tcW w:type="dxa" w:w="1310"/>
+              <w:t>TMF620</w:t>
+            </w:r>
+          </w:p>
+        </w:tc>
+        <w:tc>
+          <w:tcPr>
+            <w:tcW w:type="dxa" w:w="2059"/>
+          </w:tcPr>
+          <w:p>
+            <w:r/>
+            <w:r>
+              <w:t>Product Catalog Management API</w:t>
+            </w:r>
+          </w:p>
+        </w:tc>
+        <w:tc>
+          <w:tcPr>
+            <w:tcW w:type="dxa" w:w="1217"/>
           </w:tcPr>
           <w:p>
             <w:r/>
@@ -2392,40 +2334,34 @@
         </w:tc>
         <w:tc>
           <w:tcPr>
-            <w:tcW w:type="dxa" w:w="1685"/>
-          </w:tcPr>
-          <w:p>
-            <w:r/>
-            <w:r>
-              <w:t>Optional</w:t>
-            </w:r>
-          </w:p>
-        </w:tc>
-        <w:tc>
-          <w:tcPr>
-            <w:tcW w:type="dxa" w:w="1685"/>
-          </w:tcPr>
-          <w:p>
-            <w:r/>
-            <w:r>
-              <w:t>resource</w:t>
-            </w:r>
-          </w:p>
-        </w:tc>
-        <w:tc>
-          <w:tcPr>
-            <w:tcW w:type="dxa" w:w="1217"/>
-          </w:tcPr>
-          <w:p>
-            <w:r/>
-            <w:r>
-              <w:t>GET</w:t>
-            </w:r>
-            <w:r>
-              <w:br/>
-            </w:r>
-            <w:r>
-              <w:t>GET /id</w:t>
+            <w:tcW w:type="dxa" w:w="1498"/>
+          </w:tcPr>
+          <w:p>
+            <w:r/>
+            <w:r>
+              <w:t>Mandatory</w:t>
+            </w:r>
+          </w:p>
+        </w:tc>
+        <w:tc>
+          <w:tcPr>
+            <w:tcW w:type="dxa" w:w="1498"/>
+          </w:tcPr>
+          <w:p>
+            <w:r/>
+            <w:r>
+              <w:t>productOffering</w:t>
+            </w:r>
+          </w:p>
+        </w:tc>
+        <w:tc>
+          <w:tcPr>
+            <w:tcW w:type="dxa" w:w="2059"/>
+          </w:tcPr>
+          <w:p>
+            <w:r/>
+            <w:r>
+              <w:t>GET, GET /id</w:t>
             </w:r>
           </w:p>
         </w:tc>
@@ -2438,24 +2374,24 @@
           <w:p>
             <w:r/>
             <w:r>
-              <w:t>TMF651</w:t>
-            </w:r>
-          </w:p>
-        </w:tc>
-        <w:tc>
-          <w:tcPr>
-            <w:tcW w:type="dxa" w:w="2434"/>
-          </w:tcPr>
-          <w:p>
-            <w:r/>
-            <w:r>
-              <w:t>Agreement Management API</w:t>
-            </w:r>
-          </w:p>
-        </w:tc>
-        <w:tc>
-          <w:tcPr>
-            <w:tcW w:type="dxa" w:w="1310"/>
+              <w:t>TMF620</w:t>
+            </w:r>
+          </w:p>
+        </w:tc>
+        <w:tc>
+          <w:tcPr>
+            <w:tcW w:type="dxa" w:w="2059"/>
+          </w:tcPr>
+          <w:p>
+            <w:r/>
+            <w:r>
+              <w:t>Product Catalog Management API</w:t>
+            </w:r>
+          </w:p>
+        </w:tc>
+        <w:tc>
+          <w:tcPr>
+            <w:tcW w:type="dxa" w:w="1217"/>
           </w:tcPr>
           <w:p>
             <w:r/>
@@ -2466,40 +2402,34 @@
         </w:tc>
         <w:tc>
           <w:tcPr>
-            <w:tcW w:type="dxa" w:w="1685"/>
-          </w:tcPr>
-          <w:p>
-            <w:r/>
-            <w:r>
-              <w:t>Optional</w:t>
-            </w:r>
-          </w:p>
-        </w:tc>
-        <w:tc>
-          <w:tcPr>
-            <w:tcW w:type="dxa" w:w="1685"/>
-          </w:tcPr>
-          <w:p>
-            <w:r/>
-            <w:r>
-              <w:t>agreement</w:t>
-            </w:r>
-          </w:p>
-        </w:tc>
-        <w:tc>
-          <w:tcPr>
-            <w:tcW w:type="dxa" w:w="1217"/>
-          </w:tcPr>
-          <w:p>
-            <w:r/>
-            <w:r>
-              <w:t>GET</w:t>
-            </w:r>
-            <w:r>
-              <w:br/>
-            </w:r>
-            <w:r>
-              <w:t>GET /id</w:t>
+            <w:tcW w:type="dxa" w:w="1498"/>
+          </w:tcPr>
+          <w:p>
+            <w:r/>
+            <w:r>
+              <w:t>Mandatory</w:t>
+            </w:r>
+          </w:p>
+        </w:tc>
+        <w:tc>
+          <w:tcPr>
+            <w:tcW w:type="dxa" w:w="1498"/>
+          </w:tcPr>
+          <w:p>
+            <w:r/>
+            <w:r>
+              <w:t>productOfferingPrice</w:t>
+            </w:r>
+          </w:p>
+        </w:tc>
+        <w:tc>
+          <w:tcPr>
+            <w:tcW w:type="dxa" w:w="2059"/>
+          </w:tcPr>
+          <w:p>
+            <w:r/>
+            <w:r>
+              <w:t>GET, GET /id</w:t>
             </w:r>
           </w:p>
         </w:tc>
@@ -2512,35 +2442,35 @@
           <w:p>
             <w:r/>
             <w:r>
-              <w:t>TMF673</w:t>
-            </w:r>
-          </w:p>
-        </w:tc>
-        <w:tc>
-          <w:tcPr>
-            <w:tcW w:type="dxa" w:w="2434"/>
-          </w:tcPr>
-          <w:p>
-            <w:r/>
-            <w:r>
-              <w:t>Geographic Address Management API</w:t>
-            </w:r>
-          </w:p>
-        </w:tc>
-        <w:tc>
-          <w:tcPr>
-            <w:tcW w:type="dxa" w:w="1310"/>
-          </w:tcPr>
-          <w:p>
-            <w:r/>
-            <w:r>
-              <w:t>4</w:t>
-            </w:r>
-          </w:p>
-        </w:tc>
-        <w:tc>
-          <w:tcPr>
-            <w:tcW w:type="dxa" w:w="1685"/>
+              <w:t>TMF669</w:t>
+            </w:r>
+          </w:p>
+        </w:tc>
+        <w:tc>
+          <w:tcPr>
+            <w:tcW w:type="dxa" w:w="2059"/>
+          </w:tcPr>
+          <w:p>
+            <w:r/>
+            <w:r>
+              <w:t>Party Role Management API</w:t>
+            </w:r>
+          </w:p>
+        </w:tc>
+        <w:tc>
+          <w:tcPr>
+            <w:tcW w:type="dxa" w:w="1217"/>
+          </w:tcPr>
+          <w:p>
+            <w:r/>
+            <w:r>
+              <w:t>5</w:t>
+            </w:r>
+          </w:p>
+        </w:tc>
+        <w:tc>
+          <w:tcPr>
+            <w:tcW w:type="dxa" w:w="1498"/>
           </w:tcPr>
           <w:p>
             <w:r/>
@@ -2551,35 +2481,23 @@
         </w:tc>
         <w:tc>
           <w:tcPr>
-            <w:tcW w:type="dxa" w:w="1685"/>
-          </w:tcPr>
-          <w:p>
-            <w:r/>
-            <w:r>
-              <w:t>geographicAddress</w:t>
-            </w:r>
-            <w:r>
-              <w:br/>
-            </w:r>
-            <w:r>
-              <w:t>geographicSubAddress</w:t>
-            </w:r>
-          </w:p>
-        </w:tc>
-        <w:tc>
-          <w:tcPr>
-            <w:tcW w:type="dxa" w:w="1217"/>
-          </w:tcPr>
-          <w:p>
-            <w:r/>
-            <w:r>
-              <w:t>GET</w:t>
-            </w:r>
-            <w:r>
-              <w:br/>
-            </w:r>
-            <w:r>
-              <w:t>GET /id</w:t>
+            <w:tcW w:type="dxa" w:w="1498"/>
+          </w:tcPr>
+          <w:p>
+            <w:r/>
+            <w:r>
+              <w:t>partyRoleManagement</w:t>
+            </w:r>
+          </w:p>
+        </w:tc>
+        <w:tc>
+          <w:tcPr>
+            <w:tcW w:type="dxa" w:w="2059"/>
+          </w:tcPr>
+          <w:p>
+            <w:r/>
+            <w:r>
+              <w:t>GET, GET /id</w:t>
             </w:r>
           </w:p>
         </w:tc>
@@ -2592,24 +2510,24 @@
           <w:p>
             <w:r/>
             <w:r>
-              <w:t>TMF674</w:t>
-            </w:r>
-          </w:p>
-        </w:tc>
-        <w:tc>
-          <w:tcPr>
-            <w:tcW w:type="dxa" w:w="2434"/>
-          </w:tcPr>
-          <w:p>
-            <w:r/>
-            <w:r>
-              <w:t>Geographic Site Management API</w:t>
-            </w:r>
-          </w:p>
-        </w:tc>
-        <w:tc>
-          <w:tcPr>
-            <w:tcW w:type="dxa" w:w="1310"/>
+              <w:t>TMF669</w:t>
+            </w:r>
+          </w:p>
+        </w:tc>
+        <w:tc>
+          <w:tcPr>
+            <w:tcW w:type="dxa" w:w="2059"/>
+          </w:tcPr>
+          <w:p>
+            <w:r/>
+            <w:r>
+              <w:t>Party Role Management API</w:t>
+            </w:r>
+          </w:p>
+        </w:tc>
+        <w:tc>
+          <w:tcPr>
+            <w:tcW w:type="dxa" w:w="1217"/>
           </w:tcPr>
           <w:p>
             <w:r/>
@@ -2620,7 +2538,7 @@
         </w:tc>
         <w:tc>
           <w:tcPr>
-            <w:tcW w:type="dxa" w:w="1685"/>
+            <w:tcW w:type="dxa" w:w="1498"/>
           </w:tcPr>
           <w:p>
             <w:r/>
@@ -2631,29 +2549,23 @@
         </w:tc>
         <w:tc>
           <w:tcPr>
-            <w:tcW w:type="dxa" w:w="1685"/>
-          </w:tcPr>
-          <w:p>
-            <w:r/>
-            <w:r>
-              <w:t>geographicSite</w:t>
-            </w:r>
-          </w:p>
-        </w:tc>
-        <w:tc>
-          <w:tcPr>
-            <w:tcW w:type="dxa" w:w="1217"/>
-          </w:tcPr>
-          <w:p>
-            <w:r/>
-            <w:r>
-              <w:t>GET</w:t>
-            </w:r>
-            <w:r>
-              <w:br/>
-            </w:r>
-            <w:r>
-              <w:t>GET /id</w:t>
+            <w:tcW w:type="dxa" w:w="1498"/>
+          </w:tcPr>
+          <w:p>
+            <w:r/>
+            <w:r>
+              <w:t>PartyRoleManagement</w:t>
+            </w:r>
+          </w:p>
+        </w:tc>
+        <w:tc>
+          <w:tcPr>
+            <w:tcW w:type="dxa" w:w="2059"/>
+          </w:tcPr>
+          <w:p>
+            <w:r/>
+            <w:r>
+              <w:t>GET, GET /id</w:t>
             </w:r>
           </w:p>
         </w:tc>
@@ -2666,24 +2578,24 @@
           <w:p>
             <w:r/>
             <w:r>
-              <w:t>TMF675</w:t>
-            </w:r>
-          </w:p>
-        </w:tc>
-        <w:tc>
-          <w:tcPr>
-            <w:tcW w:type="dxa" w:w="2434"/>
-          </w:tcPr>
-          <w:p>
-            <w:r/>
-            <w:r>
-              <w:t>Geographic Location Management API</w:t>
-            </w:r>
-          </w:p>
-        </w:tc>
-        <w:tc>
-          <w:tcPr>
-            <w:tcW w:type="dxa" w:w="1310"/>
+              <w:t>TMF639</w:t>
+            </w:r>
+          </w:p>
+        </w:tc>
+        <w:tc>
+          <w:tcPr>
+            <w:tcW w:type="dxa" w:w="2059"/>
+          </w:tcPr>
+          <w:p>
+            <w:r/>
+            <w:r>
+              <w:t>Resource Inventory Management API</w:t>
+            </w:r>
+          </w:p>
+        </w:tc>
+        <w:tc>
+          <w:tcPr>
+            <w:tcW w:type="dxa" w:w="1217"/>
           </w:tcPr>
           <w:p>
             <w:r/>
@@ -2694,7 +2606,7 @@
         </w:tc>
         <w:tc>
           <w:tcPr>
-            <w:tcW w:type="dxa" w:w="1685"/>
+            <w:tcW w:type="dxa" w:w="1498"/>
           </w:tcPr>
           <w:p>
             <w:r/>
@@ -2705,29 +2617,23 @@
         </w:tc>
         <w:tc>
           <w:tcPr>
-            <w:tcW w:type="dxa" w:w="1685"/>
-          </w:tcPr>
-          <w:p>
-            <w:r/>
-            <w:r>
-              <w:t>geographicLocation</w:t>
-            </w:r>
-          </w:p>
-        </w:tc>
-        <w:tc>
-          <w:tcPr>
-            <w:tcW w:type="dxa" w:w="1217"/>
-          </w:tcPr>
-          <w:p>
-            <w:r/>
-            <w:r>
-              <w:t>GET</w:t>
-            </w:r>
-            <w:r>
-              <w:br/>
-            </w:r>
-            <w:r>
-              <w:t>GET /id</w:t>
+            <w:tcW w:type="dxa" w:w="1498"/>
+          </w:tcPr>
+          <w:p>
+            <w:r/>
+            <w:r>
+              <w:t>resource</w:t>
+            </w:r>
+          </w:p>
+        </w:tc>
+        <w:tc>
+          <w:tcPr>
+            <w:tcW w:type="dxa" w:w="2059"/>
+          </w:tcPr>
+          <w:p>
+            <w:r/>
+            <w:r>
+              <w:t>GET, GET /id</w:t>
             </w:r>
           </w:p>
         </w:tc>
@@ -2740,35 +2646,35 @@
           <w:p>
             <w:r/>
             <w:r>
-              <w:t>TMF666</w:t>
-            </w:r>
-          </w:p>
-        </w:tc>
-        <w:tc>
-          <w:tcPr>
-            <w:tcW w:type="dxa" w:w="2434"/>
-          </w:tcPr>
-          <w:p>
-            <w:r/>
-            <w:r>
-              <w:t>Account Management API</w:t>
-            </w:r>
-          </w:p>
-        </w:tc>
-        <w:tc>
-          <w:tcPr>
-            <w:tcW w:type="dxa" w:w="1310"/>
-          </w:tcPr>
-          <w:p>
-            <w:r/>
-            <w:r>
-              <w:t>5</w:t>
-            </w:r>
-          </w:p>
-        </w:tc>
-        <w:tc>
-          <w:tcPr>
-            <w:tcW w:type="dxa" w:w="1685"/>
+              <w:t>TMF651</w:t>
+            </w:r>
+          </w:p>
+        </w:tc>
+        <w:tc>
+          <w:tcPr>
+            <w:tcW w:type="dxa" w:w="2059"/>
+          </w:tcPr>
+          <w:p>
+            <w:r/>
+            <w:r>
+              <w:t>Agreement Management API</w:t>
+            </w:r>
+          </w:p>
+        </w:tc>
+        <w:tc>
+          <w:tcPr>
+            <w:tcW w:type="dxa" w:w="1217"/>
+          </w:tcPr>
+          <w:p>
+            <w:r/>
+            <w:r>
+              <w:t>4</w:t>
+            </w:r>
+          </w:p>
+        </w:tc>
+        <w:tc>
+          <w:tcPr>
+            <w:tcW w:type="dxa" w:w="1498"/>
           </w:tcPr>
           <w:p>
             <w:r/>
@@ -2779,29 +2685,23 @@
         </w:tc>
         <w:tc>
           <w:tcPr>
-            <w:tcW w:type="dxa" w:w="1685"/>
-          </w:tcPr>
-          <w:p>
-            <w:r/>
-            <w:r>
-              <w:t>billingAccount</w:t>
-            </w:r>
-          </w:p>
-        </w:tc>
-        <w:tc>
-          <w:tcPr>
-            <w:tcW w:type="dxa" w:w="1217"/>
-          </w:tcPr>
-          <w:p>
-            <w:r/>
-            <w:r>
-              <w:t>GET</w:t>
-            </w:r>
-            <w:r>
-              <w:br/>
-            </w:r>
-            <w:r>
-              <w:t>GET /id</w:t>
+            <w:tcW w:type="dxa" w:w="1498"/>
+          </w:tcPr>
+          <w:p>
+            <w:r/>
+            <w:r>
+              <w:t>agreement</w:t>
+            </w:r>
+          </w:p>
+        </w:tc>
+        <w:tc>
+          <w:tcPr>
+            <w:tcW w:type="dxa" w:w="2059"/>
+          </w:tcPr>
+          <w:p>
+            <w:r/>
+            <w:r>
+              <w:t>GET, GET /id</w:t>
             </w:r>
           </w:p>
         </w:tc>
@@ -2814,24 +2714,24 @@
           <w:p>
             <w:r/>
             <w:r>
-              <w:t>TMF666</w:t>
-            </w:r>
-          </w:p>
-        </w:tc>
-        <w:tc>
-          <w:tcPr>
-            <w:tcW w:type="dxa" w:w="2434"/>
-          </w:tcPr>
-          <w:p>
-            <w:r/>
-            <w:r>
-              <w:t>Account Management API</w:t>
-            </w:r>
-          </w:p>
-        </w:tc>
-        <w:tc>
-          <w:tcPr>
-            <w:tcW w:type="dxa" w:w="1310"/>
+              <w:t>TMF673</w:t>
+            </w:r>
+          </w:p>
+        </w:tc>
+        <w:tc>
+          <w:tcPr>
+            <w:tcW w:type="dxa" w:w="2059"/>
+          </w:tcPr>
+          <w:p>
+            <w:r/>
+            <w:r>
+              <w:t>Geographic Address Management API</w:t>
+            </w:r>
+          </w:p>
+        </w:tc>
+        <w:tc>
+          <w:tcPr>
+            <w:tcW w:type="dxa" w:w="1217"/>
           </w:tcPr>
           <w:p>
             <w:r/>
@@ -2842,7 +2742,7 @@
         </w:tc>
         <w:tc>
           <w:tcPr>
-            <w:tcW w:type="dxa" w:w="1685"/>
+            <w:tcW w:type="dxa" w:w="1498"/>
           </w:tcPr>
           <w:p>
             <w:r/>
@@ -2853,29 +2753,23 @@
         </w:tc>
         <w:tc>
           <w:tcPr>
-            <w:tcW w:type="dxa" w:w="1685"/>
-          </w:tcPr>
-          <w:p>
-            <w:r/>
-            <w:r>
-              <w:t>billingAccount</w:t>
-            </w:r>
-          </w:p>
-        </w:tc>
-        <w:tc>
-          <w:tcPr>
-            <w:tcW w:type="dxa" w:w="1217"/>
-          </w:tcPr>
-          <w:p>
-            <w:r/>
-            <w:r>
-              <w:t>GET</w:t>
-            </w:r>
-            <w:r>
-              <w:br/>
-            </w:r>
-            <w:r>
-              <w:t>GET /id</w:t>
+            <w:tcW w:type="dxa" w:w="1498"/>
+          </w:tcPr>
+          <w:p>
+            <w:r/>
+            <w:r>
+              <w:t>geographicAddress</w:t>
+            </w:r>
+          </w:p>
+        </w:tc>
+        <w:tc>
+          <w:tcPr>
+            <w:tcW w:type="dxa" w:w="2059"/>
+          </w:tcPr>
+          <w:p>
+            <w:r/>
+            <w:r>
+              <w:t>GET, GET /id</w:t>
             </w:r>
           </w:p>
         </w:tc>
@@ -2888,35 +2782,35 @@
           <w:p>
             <w:r/>
             <w:r>
-              <w:t>TMF632</w:t>
-            </w:r>
-          </w:p>
-        </w:tc>
-        <w:tc>
-          <w:tcPr>
-            <w:tcW w:type="dxa" w:w="2434"/>
-          </w:tcPr>
-          <w:p>
-            <w:r/>
-            <w:r>
-              <w:t>Party Management API</w:t>
-            </w:r>
-          </w:p>
-        </w:tc>
-        <w:tc>
-          <w:tcPr>
-            <w:tcW w:type="dxa" w:w="1310"/>
-          </w:tcPr>
-          <w:p>
-            <w:r/>
-            <w:r>
-              <w:t>5</w:t>
-            </w:r>
-          </w:p>
-        </w:tc>
-        <w:tc>
-          <w:tcPr>
-            <w:tcW w:type="dxa" w:w="1685"/>
+              <w:t>TMF673</w:t>
+            </w:r>
+          </w:p>
+        </w:tc>
+        <w:tc>
+          <w:tcPr>
+            <w:tcW w:type="dxa" w:w="2059"/>
+          </w:tcPr>
+          <w:p>
+            <w:r/>
+            <w:r>
+              <w:t>Geographic Address Management API</w:t>
+            </w:r>
+          </w:p>
+        </w:tc>
+        <w:tc>
+          <w:tcPr>
+            <w:tcW w:type="dxa" w:w="1217"/>
+          </w:tcPr>
+          <w:p>
+            <w:r/>
+            <w:r>
+              <w:t>4</w:t>
+            </w:r>
+          </w:p>
+        </w:tc>
+        <w:tc>
+          <w:tcPr>
+            <w:tcW w:type="dxa" w:w="1498"/>
           </w:tcPr>
           <w:p>
             <w:r/>
@@ -2927,35 +2821,23 @@
         </w:tc>
         <w:tc>
           <w:tcPr>
-            <w:tcW w:type="dxa" w:w="1685"/>
-          </w:tcPr>
-          <w:p>
-            <w:r/>
-            <w:r>
-              <w:t>individual</w:t>
-            </w:r>
-            <w:r>
-              <w:br/>
-            </w:r>
-            <w:r>
-              <w:t>organization</w:t>
-            </w:r>
-          </w:p>
-        </w:tc>
-        <w:tc>
-          <w:tcPr>
-            <w:tcW w:type="dxa" w:w="1217"/>
-          </w:tcPr>
-          <w:p>
-            <w:r/>
-            <w:r>
-              <w:t>GET</w:t>
-            </w:r>
-            <w:r>
-              <w:br/>
-            </w:r>
-            <w:r>
-              <w:t>GET /id</w:t>
+            <w:tcW w:type="dxa" w:w="1498"/>
+          </w:tcPr>
+          <w:p>
+            <w:r/>
+            <w:r>
+              <w:t>geographicSubAddress</w:t>
+            </w:r>
+          </w:p>
+        </w:tc>
+        <w:tc>
+          <w:tcPr>
+            <w:tcW w:type="dxa" w:w="2059"/>
+          </w:tcPr>
+          <w:p>
+            <w:r/>
+            <w:r>
+              <w:t>GET, GET /id</w:t>
             </w:r>
           </w:p>
         </w:tc>
@@ -2968,24 +2850,24 @@
           <w:p>
             <w:r/>
             <w:r>
-              <w:t>TMF632</w:t>
-            </w:r>
-          </w:p>
-        </w:tc>
-        <w:tc>
-          <w:tcPr>
-            <w:tcW w:type="dxa" w:w="2434"/>
-          </w:tcPr>
-          <w:p>
-            <w:r/>
-            <w:r>
-              <w:t>Party Management API</w:t>
-            </w:r>
-          </w:p>
-        </w:tc>
-        <w:tc>
-          <w:tcPr>
-            <w:tcW w:type="dxa" w:w="1310"/>
+              <w:t>TMF674</w:t>
+            </w:r>
+          </w:p>
+        </w:tc>
+        <w:tc>
+          <w:tcPr>
+            <w:tcW w:type="dxa" w:w="2059"/>
+          </w:tcPr>
+          <w:p>
+            <w:r/>
+            <w:r>
+              <w:t>Geographic Site Management API</w:t>
+            </w:r>
+          </w:p>
+        </w:tc>
+        <w:tc>
+          <w:tcPr>
+            <w:tcW w:type="dxa" w:w="1217"/>
           </w:tcPr>
           <w:p>
             <w:r/>
@@ -2996,7 +2878,7 @@
         </w:tc>
         <w:tc>
           <w:tcPr>
-            <w:tcW w:type="dxa" w:w="1685"/>
+            <w:tcW w:type="dxa" w:w="1498"/>
           </w:tcPr>
           <w:p>
             <w:r/>
@@ -3007,35 +2889,23 @@
         </w:tc>
         <w:tc>
           <w:tcPr>
-            <w:tcW w:type="dxa" w:w="1685"/>
-          </w:tcPr>
-          <w:p>
-            <w:r/>
-            <w:r>
-              <w:t>individual</w:t>
-            </w:r>
-            <w:r>
-              <w:br/>
-            </w:r>
-            <w:r>
-              <w:t>organization</w:t>
-            </w:r>
-          </w:p>
-        </w:tc>
-        <w:tc>
-          <w:tcPr>
-            <w:tcW w:type="dxa" w:w="1217"/>
-          </w:tcPr>
-          <w:p>
-            <w:r/>
-            <w:r>
-              <w:t>GET</w:t>
-            </w:r>
-            <w:r>
-              <w:br/>
-            </w:r>
-            <w:r>
-              <w:t>GET /id</w:t>
+            <w:tcW w:type="dxa" w:w="1498"/>
+          </w:tcPr>
+          <w:p>
+            <w:r/>
+            <w:r>
+              <w:t>geographicSite</w:t>
+            </w:r>
+          </w:p>
+        </w:tc>
+        <w:tc>
+          <w:tcPr>
+            <w:tcW w:type="dxa" w:w="2059"/>
+          </w:tcPr>
+          <w:p>
+            <w:r/>
+            <w:r>
+              <w:t>GET, GET /id</w:t>
             </w:r>
           </w:p>
         </w:tc>
@@ -3048,35 +2918,35 @@
           <w:p>
             <w:r/>
             <w:r>
-              <w:t>TMF637</w:t>
-            </w:r>
-          </w:p>
-        </w:tc>
-        <w:tc>
-          <w:tcPr>
-            <w:tcW w:type="dxa" w:w="2434"/>
-          </w:tcPr>
-          <w:p>
-            <w:r/>
-            <w:r>
-              <w:t>Product Inventory Management API</w:t>
-            </w:r>
-          </w:p>
-        </w:tc>
-        <w:tc>
-          <w:tcPr>
-            <w:tcW w:type="dxa" w:w="1310"/>
-          </w:tcPr>
-          <w:p>
-            <w:r/>
-            <w:r>
-              <w:t>5</w:t>
-            </w:r>
-          </w:p>
-        </w:tc>
-        <w:tc>
-          <w:tcPr>
-            <w:tcW w:type="dxa" w:w="1685"/>
+              <w:t>TMF675</w:t>
+            </w:r>
+          </w:p>
+        </w:tc>
+        <w:tc>
+          <w:tcPr>
+            <w:tcW w:type="dxa" w:w="2059"/>
+          </w:tcPr>
+          <w:p>
+            <w:r/>
+            <w:r>
+              <w:t>UNRESOLVED-TMF675</w:t>
+            </w:r>
+          </w:p>
+        </w:tc>
+        <w:tc>
+          <w:tcPr>
+            <w:tcW w:type="dxa" w:w="1217"/>
+          </w:tcPr>
+          <w:p>
+            <w:r/>
+            <w:r>
+              <w:t>4</w:t>
+            </w:r>
+          </w:p>
+        </w:tc>
+        <w:tc>
+          <w:tcPr>
+            <w:tcW w:type="dxa" w:w="1498"/>
           </w:tcPr>
           <w:p>
             <w:r/>
@@ -3087,47 +2957,23 @@
         </w:tc>
         <w:tc>
           <w:tcPr>
-            <w:tcW w:type="dxa" w:w="1685"/>
-          </w:tcPr>
-          <w:p>
-            <w:r/>
-            <w:r>
-              <w:t>product</w:t>
-            </w:r>
-          </w:p>
-        </w:tc>
-        <w:tc>
-          <w:tcPr>
-            <w:tcW w:type="dxa" w:w="1217"/>
-          </w:tcPr>
-          <w:p>
-            <w:r/>
-            <w:r>
-              <w:t>GET</w:t>
-            </w:r>
-            <w:r>
-              <w:br/>
-            </w:r>
-            <w:r>
-              <w:t>GET /id</w:t>
-            </w:r>
-            <w:r>
-              <w:br/>
-            </w:r>
-            <w:r>
-              <w:t>POST</w:t>
-            </w:r>
-            <w:r>
-              <w:br/>
-            </w:r>
-            <w:r>
-              <w:t>PATCH</w:t>
-            </w:r>
-            <w:r>
-              <w:br/>
-            </w:r>
-            <w:r>
-              <w:t>DELETE</w:t>
+            <w:tcW w:type="dxa" w:w="1498"/>
+          </w:tcPr>
+          <w:p>
+            <w:r/>
+            <w:r>
+              <w:t>geographicLocation</w:t>
+            </w:r>
+          </w:p>
+        </w:tc>
+        <w:tc>
+          <w:tcPr>
+            <w:tcW w:type="dxa" w:w="2059"/>
+          </w:tcPr>
+          <w:p>
+            <w:r/>
+            <w:r>
+              <w:t>GET, GET /id</w:t>
             </w:r>
           </w:p>
         </w:tc>
@@ -3140,35 +2986,35 @@
           <w:p>
             <w:r/>
             <w:r>
-              <w:t>TMF637</w:t>
-            </w:r>
-          </w:p>
-        </w:tc>
-        <w:tc>
-          <w:tcPr>
-            <w:tcW w:type="dxa" w:w="2434"/>
-          </w:tcPr>
-          <w:p>
-            <w:r/>
-            <w:r>
-              <w:t>Product Inventory Management API</w:t>
-            </w:r>
-          </w:p>
-        </w:tc>
-        <w:tc>
-          <w:tcPr>
-            <w:tcW w:type="dxa" w:w="1310"/>
-          </w:tcPr>
-          <w:p>
-            <w:r/>
-            <w:r>
-              <w:t>4</w:t>
-            </w:r>
-          </w:p>
-        </w:tc>
-        <w:tc>
-          <w:tcPr>
-            <w:tcW w:type="dxa" w:w="1685"/>
+              <w:t>TMF666</w:t>
+            </w:r>
+          </w:p>
+        </w:tc>
+        <w:tc>
+          <w:tcPr>
+            <w:tcW w:type="dxa" w:w="2059"/>
+          </w:tcPr>
+          <w:p>
+            <w:r/>
+            <w:r>
+              <w:t>Account Management API</w:t>
+            </w:r>
+          </w:p>
+        </w:tc>
+        <w:tc>
+          <w:tcPr>
+            <w:tcW w:type="dxa" w:w="1217"/>
+          </w:tcPr>
+          <w:p>
+            <w:r/>
+            <w:r>
+              <w:t>5</w:t>
+            </w:r>
+          </w:p>
+        </w:tc>
+        <w:tc>
+          <w:tcPr>
+            <w:tcW w:type="dxa" w:w="1498"/>
           </w:tcPr>
           <w:p>
             <w:r/>
@@ -3179,47 +3025,23 @@
         </w:tc>
         <w:tc>
           <w:tcPr>
-            <w:tcW w:type="dxa" w:w="1685"/>
-          </w:tcPr>
-          <w:p>
-            <w:r/>
-            <w:r>
-              <w:t>product</w:t>
-            </w:r>
-          </w:p>
-        </w:tc>
-        <w:tc>
-          <w:tcPr>
-            <w:tcW w:type="dxa" w:w="1217"/>
-          </w:tcPr>
-          <w:p>
-            <w:r/>
-            <w:r>
-              <w:t>GET</w:t>
-            </w:r>
-            <w:r>
-              <w:br/>
-            </w:r>
-            <w:r>
-              <w:t>GET /id</w:t>
-            </w:r>
-            <w:r>
-              <w:br/>
-            </w:r>
-            <w:r>
-              <w:t>POST</w:t>
-            </w:r>
-            <w:r>
-              <w:br/>
-            </w:r>
-            <w:r>
-              <w:t>PATCH</w:t>
-            </w:r>
-            <w:r>
-              <w:br/>
-            </w:r>
-            <w:r>
-              <w:t>DELETE</w:t>
+            <w:tcW w:type="dxa" w:w="1498"/>
+          </w:tcPr>
+          <w:p>
+            <w:r/>
+            <w:r>
+              <w:t>billingAccount</w:t>
+            </w:r>
+          </w:p>
+        </w:tc>
+        <w:tc>
+          <w:tcPr>
+            <w:tcW w:type="dxa" w:w="2059"/>
+          </w:tcPr>
+          <w:p>
+            <w:r/>
+            <w:r>
+              <w:t>GET, GET /id</w:t>
             </w:r>
           </w:p>
         </w:tc>
@@ -3232,35 +3054,35 @@
           <w:p>
             <w:r/>
             <w:r>
-              <w:t>TMF638</w:t>
-            </w:r>
-          </w:p>
-        </w:tc>
-        <w:tc>
-          <w:tcPr>
-            <w:tcW w:type="dxa" w:w="2434"/>
-          </w:tcPr>
-          <w:p>
-            <w:r/>
-            <w:r>
-              <w:t>Service Inventory Management API</w:t>
-            </w:r>
-          </w:p>
-        </w:tc>
-        <w:tc>
-          <w:tcPr>
-            <w:tcW w:type="dxa" w:w="1310"/>
-          </w:tcPr>
-          <w:p>
-            <w:r/>
-            <w:r>
-              <w:t>5</w:t>
-            </w:r>
-          </w:p>
-        </w:tc>
-        <w:tc>
-          <w:tcPr>
-            <w:tcW w:type="dxa" w:w="1685"/>
+              <w:t>TMF666</w:t>
+            </w:r>
+          </w:p>
+        </w:tc>
+        <w:tc>
+          <w:tcPr>
+            <w:tcW w:type="dxa" w:w="2059"/>
+          </w:tcPr>
+          <w:p>
+            <w:r/>
+            <w:r>
+              <w:t>Account Management API</w:t>
+            </w:r>
+          </w:p>
+        </w:tc>
+        <w:tc>
+          <w:tcPr>
+            <w:tcW w:type="dxa" w:w="1217"/>
+          </w:tcPr>
+          <w:p>
+            <w:r/>
+            <w:r>
+              <w:t>4</w:t>
+            </w:r>
+          </w:p>
+        </w:tc>
+        <w:tc>
+          <w:tcPr>
+            <w:tcW w:type="dxa" w:w="1498"/>
           </w:tcPr>
           <w:p>
             <w:r/>
@@ -3271,29 +3093,23 @@
         </w:tc>
         <w:tc>
           <w:tcPr>
-            <w:tcW w:type="dxa" w:w="1685"/>
-          </w:tcPr>
-          <w:p>
-            <w:r/>
-            <w:r>
-              <w:t>service</w:t>
-            </w:r>
-          </w:p>
-        </w:tc>
-        <w:tc>
-          <w:tcPr>
-            <w:tcW w:type="dxa" w:w="1217"/>
-          </w:tcPr>
-          <w:p>
-            <w:r/>
-            <w:r>
-              <w:t>GET</w:t>
-            </w:r>
-            <w:r>
-              <w:br/>
-            </w:r>
-            <w:r>
-              <w:t>GET /id</w:t>
+            <w:tcW w:type="dxa" w:w="1498"/>
+          </w:tcPr>
+          <w:p>
+            <w:r/>
+            <w:r>
+              <w:t>billingAccount</w:t>
+            </w:r>
+          </w:p>
+        </w:tc>
+        <w:tc>
+          <w:tcPr>
+            <w:tcW w:type="dxa" w:w="2059"/>
+          </w:tcPr>
+          <w:p>
+            <w:r/>
+            <w:r>
+              <w:t>GET, GET /id</w:t>
             </w:r>
           </w:p>
         </w:tc>
@@ -3306,35 +3122,35 @@
           <w:p>
             <w:r/>
             <w:r>
-              <w:t>TMF638</w:t>
-            </w:r>
-          </w:p>
-        </w:tc>
-        <w:tc>
-          <w:tcPr>
-            <w:tcW w:type="dxa" w:w="2434"/>
-          </w:tcPr>
-          <w:p>
-            <w:r/>
-            <w:r>
-              <w:t>Service Inventory Management API</w:t>
-            </w:r>
-          </w:p>
-        </w:tc>
-        <w:tc>
-          <w:tcPr>
-            <w:tcW w:type="dxa" w:w="1310"/>
-          </w:tcPr>
-          <w:p>
-            <w:r/>
-            <w:r>
-              <w:t>4</w:t>
-            </w:r>
-          </w:p>
-        </w:tc>
-        <w:tc>
-          <w:tcPr>
-            <w:tcW w:type="dxa" w:w="1685"/>
+              <w:t>TMF632</w:t>
+            </w:r>
+          </w:p>
+        </w:tc>
+        <w:tc>
+          <w:tcPr>
+            <w:tcW w:type="dxa" w:w="2059"/>
+          </w:tcPr>
+          <w:p>
+            <w:r/>
+            <w:r>
+              <w:t>Party Management API</w:t>
+            </w:r>
+          </w:p>
+        </w:tc>
+        <w:tc>
+          <w:tcPr>
+            <w:tcW w:type="dxa" w:w="1217"/>
+          </w:tcPr>
+          <w:p>
+            <w:r/>
+            <w:r>
+              <w:t>5</w:t>
+            </w:r>
+          </w:p>
+        </w:tc>
+        <w:tc>
+          <w:tcPr>
+            <w:tcW w:type="dxa" w:w="1498"/>
           </w:tcPr>
           <w:p>
             <w:r/>
@@ -3345,29 +3161,23 @@
         </w:tc>
         <w:tc>
           <w:tcPr>
-            <w:tcW w:type="dxa" w:w="1685"/>
-          </w:tcPr>
-          <w:p>
-            <w:r/>
-            <w:r>
-              <w:t>service</w:t>
-            </w:r>
-          </w:p>
-        </w:tc>
-        <w:tc>
-          <w:tcPr>
-            <w:tcW w:type="dxa" w:w="1217"/>
-          </w:tcPr>
-          <w:p>
-            <w:r/>
-            <w:r>
-              <w:t>GET</w:t>
-            </w:r>
-            <w:r>
-              <w:br/>
-            </w:r>
-            <w:r>
-              <w:t>GET /id</w:t>
+            <w:tcW w:type="dxa" w:w="1498"/>
+          </w:tcPr>
+          <w:p>
+            <w:r/>
+            <w:r>
+              <w:t>individual</w:t>
+            </w:r>
+          </w:p>
+        </w:tc>
+        <w:tc>
+          <w:tcPr>
+            <w:tcW w:type="dxa" w:w="2059"/>
+          </w:tcPr>
+          <w:p>
+            <w:r/>
+            <w:r>
+              <w:t>GET, GET /id</w:t>
             </w:r>
           </w:p>
         </w:tc>
@@ -3380,24 +3190,24 @@
           <w:p>
             <w:r/>
             <w:r>
-              <w:t>TMF622</w:t>
-            </w:r>
-          </w:p>
-        </w:tc>
-        <w:tc>
-          <w:tcPr>
-            <w:tcW w:type="dxa" w:w="2434"/>
-          </w:tcPr>
-          <w:p>
-            <w:r/>
-            <w:r>
-              <w:t>Product Ordering Management API</w:t>
-            </w:r>
-          </w:p>
-        </w:tc>
-        <w:tc>
-          <w:tcPr>
-            <w:tcW w:type="dxa" w:w="1310"/>
+              <w:t>TMF632</w:t>
+            </w:r>
+          </w:p>
+        </w:tc>
+        <w:tc>
+          <w:tcPr>
+            <w:tcW w:type="dxa" w:w="2059"/>
+          </w:tcPr>
+          <w:p>
+            <w:r/>
+            <w:r>
+              <w:t>Party Management API</w:t>
+            </w:r>
+          </w:p>
+        </w:tc>
+        <w:tc>
+          <w:tcPr>
+            <w:tcW w:type="dxa" w:w="1217"/>
           </w:tcPr>
           <w:p>
             <w:r/>
@@ -3408,7 +3218,7 @@
         </w:tc>
         <w:tc>
           <w:tcPr>
-            <w:tcW w:type="dxa" w:w="1685"/>
+            <w:tcW w:type="dxa" w:w="1498"/>
           </w:tcPr>
           <w:p>
             <w:r/>
@@ -3419,29 +3229,23 @@
         </w:tc>
         <w:tc>
           <w:tcPr>
-            <w:tcW w:type="dxa" w:w="1685"/>
-          </w:tcPr>
-          <w:p>
-            <w:r/>
-            <w:r>
-              <w:t>productOrder</w:t>
-            </w:r>
-          </w:p>
-        </w:tc>
-        <w:tc>
-          <w:tcPr>
-            <w:tcW w:type="dxa" w:w="1217"/>
-          </w:tcPr>
-          <w:p>
-            <w:r/>
-            <w:r>
-              <w:t>GET</w:t>
-            </w:r>
-            <w:r>
-              <w:br/>
-            </w:r>
-            <w:r>
-              <w:t>GET /id</w:t>
+            <w:tcW w:type="dxa" w:w="1498"/>
+          </w:tcPr>
+          <w:p>
+            <w:r/>
+            <w:r>
+              <w:t>organization</w:t>
+            </w:r>
+          </w:p>
+        </w:tc>
+        <w:tc>
+          <w:tcPr>
+            <w:tcW w:type="dxa" w:w="2059"/>
+          </w:tcPr>
+          <w:p>
+            <w:r/>
+            <w:r>
+              <w:t>GET, GET /id</w:t>
             </w:r>
           </w:p>
         </w:tc>
@@ -3454,13 +3258,421 @@
           <w:p>
             <w:r/>
             <w:r>
+              <w:t>TMF632</w:t>
+            </w:r>
+          </w:p>
+        </w:tc>
+        <w:tc>
+          <w:tcPr>
+            <w:tcW w:type="dxa" w:w="2059"/>
+          </w:tcPr>
+          <w:p>
+            <w:r/>
+            <w:r>
+              <w:t>Party Management API</w:t>
+            </w:r>
+          </w:p>
+        </w:tc>
+        <w:tc>
+          <w:tcPr>
+            <w:tcW w:type="dxa" w:w="1217"/>
+          </w:tcPr>
+          <w:p>
+            <w:r/>
+            <w:r>
+              <w:t>4</w:t>
+            </w:r>
+          </w:p>
+        </w:tc>
+        <w:tc>
+          <w:tcPr>
+            <w:tcW w:type="dxa" w:w="1498"/>
+          </w:tcPr>
+          <w:p>
+            <w:r/>
+            <w:r>
+              <w:t>Optional</w:t>
+            </w:r>
+          </w:p>
+        </w:tc>
+        <w:tc>
+          <w:tcPr>
+            <w:tcW w:type="dxa" w:w="1498"/>
+          </w:tcPr>
+          <w:p>
+            <w:r/>
+            <w:r>
+              <w:t>individual</w:t>
+            </w:r>
+          </w:p>
+        </w:tc>
+        <w:tc>
+          <w:tcPr>
+            <w:tcW w:type="dxa" w:w="2059"/>
+          </w:tcPr>
+          <w:p>
+            <w:r/>
+            <w:r>
+              <w:t>GET, GET /id</w:t>
+            </w:r>
+          </w:p>
+        </w:tc>
+      </w:tr>
+      <w:tr>
+        <w:tc>
+          <w:tcPr>
+            <w:tcW w:type="dxa" w:w="1030"/>
+          </w:tcPr>
+          <w:p>
+            <w:r/>
+            <w:r>
+              <w:t>TMF632</w:t>
+            </w:r>
+          </w:p>
+        </w:tc>
+        <w:tc>
+          <w:tcPr>
+            <w:tcW w:type="dxa" w:w="2059"/>
+          </w:tcPr>
+          <w:p>
+            <w:r/>
+            <w:r>
+              <w:t>Party Management API</w:t>
+            </w:r>
+          </w:p>
+        </w:tc>
+        <w:tc>
+          <w:tcPr>
+            <w:tcW w:type="dxa" w:w="1217"/>
+          </w:tcPr>
+          <w:p>
+            <w:r/>
+            <w:r>
+              <w:t>4</w:t>
+            </w:r>
+          </w:p>
+        </w:tc>
+        <w:tc>
+          <w:tcPr>
+            <w:tcW w:type="dxa" w:w="1498"/>
+          </w:tcPr>
+          <w:p>
+            <w:r/>
+            <w:r>
+              <w:t>Optional</w:t>
+            </w:r>
+          </w:p>
+        </w:tc>
+        <w:tc>
+          <w:tcPr>
+            <w:tcW w:type="dxa" w:w="1498"/>
+          </w:tcPr>
+          <w:p>
+            <w:r/>
+            <w:r>
+              <w:t>organization</w:t>
+            </w:r>
+          </w:p>
+        </w:tc>
+        <w:tc>
+          <w:tcPr>
+            <w:tcW w:type="dxa" w:w="2059"/>
+          </w:tcPr>
+          <w:p>
+            <w:r/>
+            <w:r>
+              <w:t>GET, GET /id</w:t>
+            </w:r>
+          </w:p>
+        </w:tc>
+      </w:tr>
+      <w:tr>
+        <w:tc>
+          <w:tcPr>
+            <w:tcW w:type="dxa" w:w="1030"/>
+          </w:tcPr>
+          <w:p>
+            <w:r/>
+            <w:r>
+              <w:t>TMF637</w:t>
+            </w:r>
+          </w:p>
+        </w:tc>
+        <w:tc>
+          <w:tcPr>
+            <w:tcW w:type="dxa" w:w="2059"/>
+          </w:tcPr>
+          <w:p>
+            <w:r/>
+            <w:r>
+              <w:t>Product Inventory Management API</w:t>
+            </w:r>
+          </w:p>
+        </w:tc>
+        <w:tc>
+          <w:tcPr>
+            <w:tcW w:type="dxa" w:w="1217"/>
+          </w:tcPr>
+          <w:p>
+            <w:r/>
+            <w:r>
+              <w:t>5</w:t>
+            </w:r>
+          </w:p>
+        </w:tc>
+        <w:tc>
+          <w:tcPr>
+            <w:tcW w:type="dxa" w:w="1498"/>
+          </w:tcPr>
+          <w:p>
+            <w:r/>
+            <w:r>
+              <w:t>Optional</w:t>
+            </w:r>
+          </w:p>
+        </w:tc>
+        <w:tc>
+          <w:tcPr>
+            <w:tcW w:type="dxa" w:w="1498"/>
+          </w:tcPr>
+          <w:p>
+            <w:r/>
+            <w:r>
+              <w:t>product</w:t>
+            </w:r>
+          </w:p>
+        </w:tc>
+        <w:tc>
+          <w:tcPr>
+            <w:tcW w:type="dxa" w:w="2059"/>
+          </w:tcPr>
+          <w:p>
+            <w:r/>
+            <w:r>
+              <w:t>GET, GET /id, POST, PATCH, DELETE</w:t>
+            </w:r>
+          </w:p>
+        </w:tc>
+      </w:tr>
+      <w:tr>
+        <w:tc>
+          <w:tcPr>
+            <w:tcW w:type="dxa" w:w="1030"/>
+          </w:tcPr>
+          <w:p>
+            <w:r/>
+            <w:r>
+              <w:t>TMF637</w:t>
+            </w:r>
+          </w:p>
+        </w:tc>
+        <w:tc>
+          <w:tcPr>
+            <w:tcW w:type="dxa" w:w="2059"/>
+          </w:tcPr>
+          <w:p>
+            <w:r/>
+            <w:r>
+              <w:t>Product Inventory Management API</w:t>
+            </w:r>
+          </w:p>
+        </w:tc>
+        <w:tc>
+          <w:tcPr>
+            <w:tcW w:type="dxa" w:w="1217"/>
+          </w:tcPr>
+          <w:p>
+            <w:r/>
+            <w:r>
+              <w:t>4</w:t>
+            </w:r>
+          </w:p>
+        </w:tc>
+        <w:tc>
+          <w:tcPr>
+            <w:tcW w:type="dxa" w:w="1498"/>
+          </w:tcPr>
+          <w:p>
+            <w:r/>
+            <w:r>
+              <w:t>Optional</w:t>
+            </w:r>
+          </w:p>
+        </w:tc>
+        <w:tc>
+          <w:tcPr>
+            <w:tcW w:type="dxa" w:w="1498"/>
+          </w:tcPr>
+          <w:p>
+            <w:r/>
+            <w:r>
+              <w:t>product</w:t>
+            </w:r>
+          </w:p>
+        </w:tc>
+        <w:tc>
+          <w:tcPr>
+            <w:tcW w:type="dxa" w:w="2059"/>
+          </w:tcPr>
+          <w:p>
+            <w:r/>
+            <w:r>
+              <w:t>GET, GET /id, POST, PATCH, DELETE</w:t>
+            </w:r>
+          </w:p>
+        </w:tc>
+      </w:tr>
+      <w:tr>
+        <w:tc>
+          <w:tcPr>
+            <w:tcW w:type="dxa" w:w="1030"/>
+          </w:tcPr>
+          <w:p>
+            <w:r/>
+            <w:r>
+              <w:t>TMF638</w:t>
+            </w:r>
+          </w:p>
+        </w:tc>
+        <w:tc>
+          <w:tcPr>
+            <w:tcW w:type="dxa" w:w="2059"/>
+          </w:tcPr>
+          <w:p>
+            <w:r/>
+            <w:r>
+              <w:t>Service Inventory Management API</w:t>
+            </w:r>
+          </w:p>
+        </w:tc>
+        <w:tc>
+          <w:tcPr>
+            <w:tcW w:type="dxa" w:w="1217"/>
+          </w:tcPr>
+          <w:p>
+            <w:r/>
+            <w:r>
+              <w:t>5</w:t>
+            </w:r>
+          </w:p>
+        </w:tc>
+        <w:tc>
+          <w:tcPr>
+            <w:tcW w:type="dxa" w:w="1498"/>
+          </w:tcPr>
+          <w:p>
+            <w:r/>
+            <w:r>
+              <w:t>Optional</w:t>
+            </w:r>
+          </w:p>
+        </w:tc>
+        <w:tc>
+          <w:tcPr>
+            <w:tcW w:type="dxa" w:w="1498"/>
+          </w:tcPr>
+          <w:p>
+            <w:r/>
+            <w:r>
+              <w:t>service</w:t>
+            </w:r>
+          </w:p>
+        </w:tc>
+        <w:tc>
+          <w:tcPr>
+            <w:tcW w:type="dxa" w:w="2059"/>
+          </w:tcPr>
+          <w:p>
+            <w:r/>
+            <w:r>
+              <w:t>GET, GET /id</w:t>
+            </w:r>
+          </w:p>
+        </w:tc>
+      </w:tr>
+      <w:tr>
+        <w:tc>
+          <w:tcPr>
+            <w:tcW w:type="dxa" w:w="1030"/>
+          </w:tcPr>
+          <w:p>
+            <w:r/>
+            <w:r>
+              <w:t>TMF638</w:t>
+            </w:r>
+          </w:p>
+        </w:tc>
+        <w:tc>
+          <w:tcPr>
+            <w:tcW w:type="dxa" w:w="2059"/>
+          </w:tcPr>
+          <w:p>
+            <w:r/>
+            <w:r>
+              <w:t>Service Inventory Management API</w:t>
+            </w:r>
+          </w:p>
+        </w:tc>
+        <w:tc>
+          <w:tcPr>
+            <w:tcW w:type="dxa" w:w="1217"/>
+          </w:tcPr>
+          <w:p>
+            <w:r/>
+            <w:r>
+              <w:t>4</w:t>
+            </w:r>
+          </w:p>
+        </w:tc>
+        <w:tc>
+          <w:tcPr>
+            <w:tcW w:type="dxa" w:w="1498"/>
+          </w:tcPr>
+          <w:p>
+            <w:r/>
+            <w:r>
+              <w:t>Optional</w:t>
+            </w:r>
+          </w:p>
+        </w:tc>
+        <w:tc>
+          <w:tcPr>
+            <w:tcW w:type="dxa" w:w="1498"/>
+          </w:tcPr>
+          <w:p>
+            <w:r/>
+            <w:r>
+              <w:t>service</w:t>
+            </w:r>
+          </w:p>
+        </w:tc>
+        <w:tc>
+          <w:tcPr>
+            <w:tcW w:type="dxa" w:w="2059"/>
+          </w:tcPr>
+          <w:p>
+            <w:r/>
+            <w:r>
+              <w:t>GET, GET /id</w:t>
+            </w:r>
+          </w:p>
+        </w:tc>
+      </w:tr>
+      <w:tr>
+        <w:tc>
+          <w:tcPr>
+            <w:tcW w:type="dxa" w:w="1030"/>
+          </w:tcPr>
+          <w:p>
+            <w:r/>
+            <w:r>
               <w:t>TMF622</w:t>
             </w:r>
           </w:p>
         </w:tc>
         <w:tc>
           <w:tcPr>
-            <w:tcW w:type="dxa" w:w="2434"/>
+            <w:tcW w:type="dxa" w:w="2059"/>
           </w:tcPr>
           <w:p>
             <w:r/>
@@ -3471,7 +3683,75 @@
         </w:tc>
         <w:tc>
           <w:tcPr>
-            <w:tcW w:type="dxa" w:w="1310"/>
+            <w:tcW w:type="dxa" w:w="1217"/>
+          </w:tcPr>
+          <w:p>
+            <w:r/>
+            <w:r>
+              <w:t>5</w:t>
+            </w:r>
+          </w:p>
+        </w:tc>
+        <w:tc>
+          <w:tcPr>
+            <w:tcW w:type="dxa" w:w="1498"/>
+          </w:tcPr>
+          <w:p>
+            <w:r/>
+            <w:r>
+              <w:t>Optional</w:t>
+            </w:r>
+          </w:p>
+        </w:tc>
+        <w:tc>
+          <w:tcPr>
+            <w:tcW w:type="dxa" w:w="1498"/>
+          </w:tcPr>
+          <w:p>
+            <w:r/>
+            <w:r>
+              <w:t>productOrder</w:t>
+            </w:r>
+          </w:p>
+        </w:tc>
+        <w:tc>
+          <w:tcPr>
+            <w:tcW w:type="dxa" w:w="2059"/>
+          </w:tcPr>
+          <w:p>
+            <w:r/>
+            <w:r>
+              <w:t>GET, GET /id</w:t>
+            </w:r>
+          </w:p>
+        </w:tc>
+      </w:tr>
+      <w:tr>
+        <w:tc>
+          <w:tcPr>
+            <w:tcW w:type="dxa" w:w="1030"/>
+          </w:tcPr>
+          <w:p>
+            <w:r/>
+            <w:r>
+              <w:t>TMF622</w:t>
+            </w:r>
+          </w:p>
+        </w:tc>
+        <w:tc>
+          <w:tcPr>
+            <w:tcW w:type="dxa" w:w="2059"/>
+          </w:tcPr>
+          <w:p>
+            <w:r/>
+            <w:r>
+              <w:t>Product Ordering Management API</w:t>
+            </w:r>
+          </w:p>
+        </w:tc>
+        <w:tc>
+          <w:tcPr>
+            <w:tcW w:type="dxa" w:w="1217"/>
           </w:tcPr>
           <w:p>
             <w:r/>
@@ -3482,7 +3762,7 @@
         </w:tc>
         <w:tc>
           <w:tcPr>
-            <w:tcW w:type="dxa" w:w="1685"/>
+            <w:tcW w:type="dxa" w:w="1498"/>
           </w:tcPr>
           <w:p>
             <w:r/>
@@ -3493,7 +3773,7 @@
         </w:tc>
         <w:tc>
           <w:tcPr>
-            <w:tcW w:type="dxa" w:w="1685"/>
+            <w:tcW w:type="dxa" w:w="1498"/>
           </w:tcPr>
           <w:p>
             <w:r/>
@@ -3504,18 +3784,12 @@
         </w:tc>
         <w:tc>
           <w:tcPr>
-            <w:tcW w:type="dxa" w:w="1217"/>
-          </w:tcPr>
-          <w:p>
-            <w:r/>
-            <w:r>
-              <w:t>GET</w:t>
-            </w:r>
-            <w:r>
-              <w:br/>
-            </w:r>
-            <w:r>
-              <w:t>GET /id</w:t>
+            <w:tcW w:type="dxa" w:w="2059"/>
+          </w:tcPr>
+          <w:p>
+            <w:r/>
+            <w:r>
+              <w:t>GET, GET /id</w:t>
             </w:r>
           </w:p>
         </w:tc>
@@ -3526,7 +3800,7 @@
       <w:r>
         <w:drawing>
           <wp:inline xmlns:a="http://schemas.openxmlformats.org/drawingml/2006/main" xmlns:pic="http://schemas.openxmlformats.org/drawingml/2006/picture">
-            <wp:extent cx="5394960" cy="7510796"/>
+            <wp:extent cx="5394960" cy="7528441"/>
             <wp:docPr id="4" name="Picture 4"/>
             <wp:cNvGraphicFramePr>
               <a:graphicFrameLocks noChangeAspect="1"/>
@@ -3547,7 +3821,7 @@
                   <pic:spPr>
                     <a:xfrm>
                       <a:off x="0" y="0"/>
-                      <a:ext cx="5394960" cy="7510796"/>
+                      <a:ext cx="5394960" cy="7528441"/>
                     </a:xfrm>
                     <a:prstGeom prst="rect"/>
                   </pic:spPr>
@@ -3732,7 +4006,7 @@
           <w:p>
             <w:r/>
             <w:r>
-              <w:t>Process Flow Management API</w:t>
+              <w:t>UNRESOLVED-TMF701</w:t>
             </w:r>
           </w:p>
         </w:tc>
@@ -4228,7 +4502,7 @@
           <w:p>
             <w:r/>
             <w:r>
-              <w:t>Geographic Location Management API</w:t>
+              <w:t>UNRESOLVED-TMF675</w:t>
             </w:r>
           </w:p>
         </w:tc>

</xml_diff>